<commit_message>
docs: align slide guide with official Samsung SIC 5-unit template and 100-point rubric
</commit_message>
<xml_diff>
--- a/docs/Dan_y_va_Huong_dan_Slide_Thuyet_trinh_SIC.docx
+++ b/docs/Dan_y_va_Huong_dan_Slide_Thuyet_trinh_SIC.docx
@@ -21,7 +21,7 @@
     </w:p>
     <w:p>
       <w:pPr>
-        <w:spacing w:before="320" w:after="160"/>
+        <w:spacing w:before="280" w:after="120"/>
         <w:jc w:val="center"/>
       </w:pPr>
       <w:r>
@@ -31,12 +31,12 @@
           <w:color w:val="2563EB"/>
           <w:sz w:val="30"/>
         </w:rPr>
-        <w:t>DÀN Ý VÀ HƯỚNG DẪN THIẾT KẾ SLIDE THUYẾT TRÌNH BẢO VỆ ĐỒ ÁN TỐT NGHIỆP CAPSTONE PROJECT (AI TRACK)</w:t>
+        <w:t>DÀN Ý SLIDE BẢO VỆ CAPSTONE PROJECT THEO CHUẨN TEMPLATE SAMSUNG SIC</w:t>
       </w:r>
     </w:p>
     <w:p>
       <w:pPr>
-        <w:spacing w:after="400"/>
+        <w:spacing w:after="320"/>
         <w:jc w:val="center"/>
       </w:pPr>
       <w:r>
@@ -90,7 +90,7 @@
                 <w:color w:val="1E3A8A"/>
                 <w:sz w:val="21"/>
               </w:rPr>
-              <w:t>📌 Mục đích tài liệu hướng dẫn thuyết trình</w:t>
+              <w:t>📌 Đối chuẩn trực tiếp Thang điểm 100 của Hội đồng SIC</w:t>
               <w:br/>
             </w:r>
             <w:r>
@@ -100,7 +100,7 @@
                 <w:color w:val="334155"/>
                 <w:sz w:val="20"/>
               </w:rPr>
-              <w:t>Tài liệu này đóng vai trò cẩm nang hướng dẫn chi tiết cho từng slide trong tổng số 18 slide thuyết trình: định rõ mục tiêu cần đạt, nội dung viết gì, hình ảnh/biểu đồ cần vẽ hoặc chèn từ thư mục figures/, cùng lời thoại gợi ý (Speaker Notes) và chiến lược trả lời phản biện xuất sắc trước Hội đồng Giảng viên SIC - HUST.</w:t>
+              <w:t>Dàn ý slide này được tái cấu trúc hoàn toàn dựa trên Template chính thức của Samsung Innovation Campus (gồm 5 Unit: Introduction, Project Execution, Results, Projected Impact, Team Review &amp; Comments) và đối chuẩn trực tiếp với Thang điểm đánh giá 100 điểm của Hội đồng Giảng viên SIC: Tính hoàn chỉnh sản phẩm (30%), Tính sáng tạo &amp; ứng dụng (25%), Làm việc nhóm &amp; WBS (15%), Trình bày &amp; Slide (20%), Phản biện &amp; Q&amp;A (10%).</w:t>
             </w:r>
           </w:p>
         </w:tc>
@@ -123,21 +123,705 @@
           <w:color w:val="1E3A8A"/>
           <w:sz w:val="28"/>
         </w:rPr>
-        <w:t>I. CHIẾN LƯỢC TỔNG QUAN VÀ PHÂN CÔNG THUYẾT TRÌNH</w:t>
-      </w:r>
+        <w:t>I. BẢNG CHIẾN LƯỢC ĐỐI CHUẨN THANG ĐIỂM 100 CỦA SAMSUNG SIC</w:t>
+      </w:r>
+    </w:p>
+    <w:tbl>
+      <w:tblPr>
+        <w:tblW w:type="auto" w:w="0"/>
+        <w:jc w:val="center"/>
+        <w:tblLook w:firstColumn="1" w:firstRow="1" w:lastColumn="0" w:lastRow="0" w:noHBand="0" w:noVBand="1" w:val="04A0"/>
+        <w:tblBorders>
+          <w:top w:val="single" w:sz="4" w:space="0" w:color="CBD5E1"/>
+          <w:bottom w:val="single" w:sz="4" w:space="0" w:color="CBD5E1"/>
+          <w:left w:val="none"/>
+          <w:right w:val="none"/>
+          <w:insideH w:val="single" w:sz="4" w:space="0" w:color="CBD5E1"/>
+          <w:insideV w:val="none"/>
+        </w:tblBorders>
+      </w:tblPr>
+      <w:tblGrid>
+        <w:gridCol w:w="2340"/>
+        <w:gridCol w:w="2340"/>
+        <w:gridCol w:w="2340"/>
+        <w:gridCol w:w="2340"/>
+      </w:tblGrid>
+      <w:tr>
+        <w:tc>
+          <w:tcPr>
+            <w:tcW w:type="dxa" w:w="2340"/>
+            <w:shd w:fill="1E3A8A"/>
+            <w:tcMar>
+              <w:top w:w="100" w:type="dxa"/>
+              <w:bottom w:w="100" w:type="dxa"/>
+              <w:left w:w="100" w:type="dxa"/>
+              <w:right w:w="100" w:type="dxa"/>
+            </w:tcMar>
+          </w:tcPr>
+          <w:p>
+            <w:pPr>
+              <w:jc w:val="center"/>
+            </w:pPr>
+            <w:r>
+              <w:rPr>
+                <w:rFonts w:ascii="Times New Roman" w:hAnsi="Times New Roman"/>
+                <w:b/>
+                <w:color w:val="FFFFFF"/>
+                <w:sz w:val="19"/>
+              </w:rPr>
+              <w:t>Tiêu chí đánh giá của SIC</w:t>
+            </w:r>
+          </w:p>
+        </w:tc>
+        <w:tc>
+          <w:tcPr>
+            <w:tcW w:type="dxa" w:w="2340"/>
+            <w:shd w:fill="1E3A8A"/>
+            <w:tcMar>
+              <w:top w:w="100" w:type="dxa"/>
+              <w:bottom w:w="100" w:type="dxa"/>
+              <w:left w:w="100" w:type="dxa"/>
+              <w:right w:w="100" w:type="dxa"/>
+            </w:tcMar>
+          </w:tcPr>
+          <w:p>
+            <w:pPr>
+              <w:jc w:val="center"/>
+            </w:pPr>
+            <w:r>
+              <w:rPr>
+                <w:rFonts w:ascii="Times New Roman" w:hAnsi="Times New Roman"/>
+                <w:b/>
+                <w:color w:val="FFFFFF"/>
+                <w:sz w:val="19"/>
+              </w:rPr>
+              <w:t>Tỷ trọng</w:t>
+            </w:r>
+          </w:p>
+        </w:tc>
+        <w:tc>
+          <w:tcPr>
+            <w:tcW w:type="dxa" w:w="2340"/>
+            <w:shd w:fill="1E3A8A"/>
+            <w:tcMar>
+              <w:top w:w="100" w:type="dxa"/>
+              <w:bottom w:w="100" w:type="dxa"/>
+              <w:left w:w="100" w:type="dxa"/>
+              <w:right w:w="100" w:type="dxa"/>
+            </w:tcMar>
+          </w:tcPr>
+          <w:p>
+            <w:pPr>
+              <w:jc w:val="center"/>
+            </w:pPr>
+            <w:r>
+              <w:rPr>
+                <w:rFonts w:ascii="Times New Roman" w:hAnsi="Times New Roman"/>
+                <w:b/>
+                <w:color w:val="FFFFFF"/>
+                <w:sz w:val="19"/>
+              </w:rPr>
+              <w:t>Trọng tâm cần thể hiện trên Slide</w:t>
+            </w:r>
+          </w:p>
+        </w:tc>
+        <w:tc>
+          <w:tcPr>
+            <w:tcW w:type="dxa" w:w="2340"/>
+            <w:shd w:fill="1E3A8A"/>
+            <w:tcMar>
+              <w:top w:w="100" w:type="dxa"/>
+              <w:bottom w:w="100" w:type="dxa"/>
+              <w:left w:w="100" w:type="dxa"/>
+              <w:right w:w="100" w:type="dxa"/>
+            </w:tcMar>
+          </w:tcPr>
+          <w:p>
+            <w:pPr>
+              <w:jc w:val="center"/>
+            </w:pPr>
+            <w:r>
+              <w:rPr>
+                <w:rFonts w:ascii="Times New Roman" w:hAnsi="Times New Roman"/>
+                <w:b/>
+                <w:color w:val="FFFFFF"/>
+                <w:sz w:val="19"/>
+              </w:rPr>
+              <w:t>Slide tương ứng</w:t>
+            </w:r>
+          </w:p>
+        </w:tc>
+      </w:tr>
+      <w:tr>
+        <w:tc>
+          <w:tcPr>
+            <w:tcW w:type="dxa" w:w="2340"/>
+            <w:tcMar>
+              <w:top w:w="80" w:type="dxa"/>
+              <w:bottom w:w="80" w:type="dxa"/>
+              <w:left w:w="100" w:type="dxa"/>
+              <w:right w:w="100" w:type="dxa"/>
+            </w:tcMar>
+          </w:tcPr>
+          <w:p>
+            <w:pPr>
+              <w:jc w:val="left"/>
+            </w:pPr>
+            <w:r>
+              <w:rPr>
+                <w:rFonts w:ascii="Times New Roman" w:hAnsi="Times New Roman"/>
+                <w:color w:val="1E293B"/>
+                <w:sz w:val="18"/>
+              </w:rPr>
+              <w:t>1. Tính hoàn chỉnh của sản phẩm</w:t>
+            </w:r>
+          </w:p>
+        </w:tc>
+        <w:tc>
+          <w:tcPr>
+            <w:tcW w:type="dxa" w:w="2340"/>
+            <w:tcMar>
+              <w:top w:w="80" w:type="dxa"/>
+              <w:bottom w:w="80" w:type="dxa"/>
+              <w:left w:w="100" w:type="dxa"/>
+              <w:right w:w="100" w:type="dxa"/>
+            </w:tcMar>
+          </w:tcPr>
+          <w:p>
+            <w:pPr>
+              <w:jc w:val="center"/>
+            </w:pPr>
+            <w:r>
+              <w:rPr>
+                <w:rFonts w:ascii="Times New Roman" w:hAnsi="Times New Roman"/>
+                <w:color w:val="1E293B"/>
+                <w:sz w:val="18"/>
+              </w:rPr>
+              <w:t>30%</w:t>
+            </w:r>
+          </w:p>
+        </w:tc>
+        <w:tc>
+          <w:tcPr>
+            <w:tcW w:type="dxa" w:w="2340"/>
+            <w:tcMar>
+              <w:top w:w="80" w:type="dxa"/>
+              <w:bottom w:w="80" w:type="dxa"/>
+              <w:left w:w="100" w:type="dxa"/>
+              <w:right w:w="100" w:type="dxa"/>
+            </w:tcMar>
+          </w:tcPr>
+          <w:p>
+            <w:pPr>
+              <w:jc w:val="left"/>
+            </w:pPr>
+            <w:r>
+              <w:rPr>
+                <w:rFonts w:ascii="Times New Roman" w:hAnsi="Times New Roman"/>
+                <w:color w:val="1E293B"/>
+                <w:sz w:val="18"/>
+              </w:rPr>
+              <w:t>Sản phẩm chạy thực tế, không dừng ở mô hình lý thuyết: WebSocket 360Hz, React 19 Plotly, SQLite/RBAC, 42/42 tests pass, Live Demo 5 pha.</w:t>
+            </w:r>
+          </w:p>
+        </w:tc>
+        <w:tc>
+          <w:tcPr>
+            <w:tcW w:type="dxa" w:w="2340"/>
+            <w:tcMar>
+              <w:top w:w="80" w:type="dxa"/>
+              <w:bottom w:w="80" w:type="dxa"/>
+              <w:left w:w="100" w:type="dxa"/>
+              <w:right w:w="100" w:type="dxa"/>
+            </w:tcMar>
+          </w:tcPr>
+          <w:p>
+            <w:pPr>
+              <w:jc w:val="center"/>
+            </w:pPr>
+            <w:r>
+              <w:rPr>
+                <w:rFonts w:ascii="Times New Roman" w:hAnsi="Times New Roman"/>
+                <w:color w:val="1E293B"/>
+                <w:sz w:val="18"/>
+              </w:rPr>
+              <w:t>Slide 5, 9, 10, 11, 12, 13, 14</w:t>
+            </w:r>
+          </w:p>
+        </w:tc>
+      </w:tr>
+      <w:tr>
+        <w:tc>
+          <w:tcPr>
+            <w:tcW w:type="dxa" w:w="2340"/>
+            <w:shd w:fill="F8FAFC"/>
+            <w:tcMar>
+              <w:top w:w="80" w:type="dxa"/>
+              <w:bottom w:w="80" w:type="dxa"/>
+              <w:left w:w="100" w:type="dxa"/>
+              <w:right w:w="100" w:type="dxa"/>
+            </w:tcMar>
+          </w:tcPr>
+          <w:p>
+            <w:pPr>
+              <w:jc w:val="left"/>
+            </w:pPr>
+            <w:r>
+              <w:rPr>
+                <w:rFonts w:ascii="Times New Roman" w:hAnsi="Times New Roman"/>
+                <w:color w:val="1E293B"/>
+                <w:sz w:val="18"/>
+              </w:rPr>
+              <w:t>2. Tính sáng tạo &amp; Ứng dụng thực tế</w:t>
+            </w:r>
+          </w:p>
+        </w:tc>
+        <w:tc>
+          <w:tcPr>
+            <w:tcW w:type="dxa" w:w="2340"/>
+            <w:shd w:fill="F8FAFC"/>
+            <w:tcMar>
+              <w:top w:w="80" w:type="dxa"/>
+              <w:bottom w:w="80" w:type="dxa"/>
+              <w:left w:w="100" w:type="dxa"/>
+              <w:right w:w="100" w:type="dxa"/>
+            </w:tcMar>
+          </w:tcPr>
+          <w:p>
+            <w:pPr>
+              <w:jc w:val="center"/>
+            </w:pPr>
+            <w:r>
+              <w:rPr>
+                <w:rFonts w:ascii="Times New Roman" w:hAnsi="Times New Roman"/>
+                <w:color w:val="1E293B"/>
+                <w:sz w:val="18"/>
+              </w:rPr>
+              <w:t>25%</w:t>
+            </w:r>
+          </w:p>
+        </w:tc>
+        <w:tc>
+          <w:tcPr>
+            <w:tcW w:type="dxa" w:w="2340"/>
+            <w:shd w:fill="F8FAFC"/>
+            <w:tcMar>
+              <w:top w:w="80" w:type="dxa"/>
+              <w:bottom w:w="80" w:type="dxa"/>
+              <w:left w:w="100" w:type="dxa"/>
+              <w:right w:w="100" w:type="dxa"/>
+            </w:tcMar>
+          </w:tcPr>
+          <w:p>
+            <w:pPr>
+              <w:jc w:val="left"/>
+            </w:pPr>
+            <w:r>
+              <w:rPr>
+                <w:rFonts w:ascii="Times New Roman" w:hAnsi="Times New Roman"/>
+                <w:color w:val="1E293B"/>
+                <w:sz w:val="18"/>
+              </w:rPr>
+              <w:t>Explainable AI (1D Grad-CAM) giải quyết 'hộp đen' y tế; Lượng tử hóa ONNX INT8 (697 KB) cho Edge AI Wearable; Chuẩn an toàn báo động IEC 60601-1-8.</w:t>
+            </w:r>
+          </w:p>
+        </w:tc>
+        <w:tc>
+          <w:tcPr>
+            <w:tcW w:type="dxa" w:w="2340"/>
+            <w:shd w:fill="F8FAFC"/>
+            <w:tcMar>
+              <w:top w:w="80" w:type="dxa"/>
+              <w:bottom w:w="80" w:type="dxa"/>
+              <w:left w:w="100" w:type="dxa"/>
+              <w:right w:w="100" w:type="dxa"/>
+            </w:tcMar>
+          </w:tcPr>
+          <w:p>
+            <w:pPr>
+              <w:jc w:val="center"/>
+            </w:pPr>
+            <w:r>
+              <w:rPr>
+                <w:rFonts w:ascii="Times New Roman" w:hAnsi="Times New Roman"/>
+                <w:color w:val="1E293B"/>
+                <w:sz w:val="18"/>
+              </w:rPr>
+              <w:t>Slide 2, 3, 7, 8, 12, 15</w:t>
+            </w:r>
+          </w:p>
+        </w:tc>
+      </w:tr>
+      <w:tr>
+        <w:tc>
+          <w:tcPr>
+            <w:tcW w:type="dxa" w:w="2340"/>
+            <w:tcMar>
+              <w:top w:w="80" w:type="dxa"/>
+              <w:bottom w:w="80" w:type="dxa"/>
+              <w:left w:w="100" w:type="dxa"/>
+              <w:right w:w="100" w:type="dxa"/>
+            </w:tcMar>
+          </w:tcPr>
+          <w:p>
+            <w:pPr>
+              <w:jc w:val="left"/>
+            </w:pPr>
+            <w:r>
+              <w:rPr>
+                <w:rFonts w:ascii="Times New Roman" w:hAnsi="Times New Roman"/>
+                <w:color w:val="1E293B"/>
+                <w:sz w:val="18"/>
+              </w:rPr>
+              <w:t>3. Kỹ năng làm việc nhóm &amp; Tiến độ WBS</w:t>
+            </w:r>
+          </w:p>
+        </w:tc>
+        <w:tc>
+          <w:tcPr>
+            <w:tcW w:type="dxa" w:w="2340"/>
+            <w:tcMar>
+              <w:top w:w="80" w:type="dxa"/>
+              <w:bottom w:w="80" w:type="dxa"/>
+              <w:left w:w="100" w:type="dxa"/>
+              <w:right w:w="100" w:type="dxa"/>
+            </w:tcMar>
+          </w:tcPr>
+          <w:p>
+            <w:pPr>
+              <w:jc w:val="center"/>
+            </w:pPr>
+            <w:r>
+              <w:rPr>
+                <w:rFonts w:ascii="Times New Roman" w:hAnsi="Times New Roman"/>
+                <w:color w:val="1E293B"/>
+                <w:sz w:val="18"/>
+              </w:rPr>
+              <w:t>15%</w:t>
+            </w:r>
+          </w:p>
+        </w:tc>
+        <w:tc>
+          <w:tcPr>
+            <w:tcW w:type="dxa" w:w="2340"/>
+            <w:tcMar>
+              <w:top w:w="80" w:type="dxa"/>
+              <w:bottom w:w="80" w:type="dxa"/>
+              <w:left w:w="100" w:type="dxa"/>
+              <w:right w:w="100" w:type="dxa"/>
+            </w:tcMar>
+          </w:tcPr>
+          <w:p>
+            <w:pPr>
+              <w:jc w:val="left"/>
+            </w:pPr>
+            <w:r>
+              <w:rPr>
+                <w:rFonts w:ascii="Times New Roman" w:hAnsi="Times New Roman"/>
+                <w:color w:val="1E293B"/>
+                <w:sz w:val="18"/>
+              </w:rPr>
+              <w:t>Bảng phân vai rõ ràng giữa Nam Hải và Hải Yến; Tiến độ WBS hoàn thành qua 6 Checkpoint có ghi nhận đóng góp minh bạch.</w:t>
+            </w:r>
+          </w:p>
+        </w:tc>
+        <w:tc>
+          <w:tcPr>
+            <w:tcW w:type="dxa" w:w="2340"/>
+            <w:tcMar>
+              <w:top w:w="80" w:type="dxa"/>
+              <w:bottom w:w="80" w:type="dxa"/>
+              <w:left w:w="100" w:type="dxa"/>
+              <w:right w:w="100" w:type="dxa"/>
+            </w:tcMar>
+          </w:tcPr>
+          <w:p>
+            <w:pPr>
+              <w:jc w:val="center"/>
+            </w:pPr>
+            <w:r>
+              <w:rPr>
+                <w:rFonts w:ascii="Times New Roman" w:hAnsi="Times New Roman"/>
+                <w:color w:val="1E293B"/>
+                <w:sz w:val="18"/>
+              </w:rPr>
+              <w:t>Slide 4, 17</w:t>
+            </w:r>
+          </w:p>
+        </w:tc>
+      </w:tr>
+      <w:tr>
+        <w:tc>
+          <w:tcPr>
+            <w:tcW w:type="dxa" w:w="2340"/>
+            <w:shd w:fill="F8FAFC"/>
+            <w:tcMar>
+              <w:top w:w="80" w:type="dxa"/>
+              <w:bottom w:w="80" w:type="dxa"/>
+              <w:left w:w="100" w:type="dxa"/>
+              <w:right w:w="100" w:type="dxa"/>
+            </w:tcMar>
+          </w:tcPr>
+          <w:p>
+            <w:pPr>
+              <w:jc w:val="left"/>
+            </w:pPr>
+            <w:r>
+              <w:rPr>
+                <w:rFonts w:ascii="Times New Roman" w:hAnsi="Times New Roman"/>
+                <w:color w:val="1E293B"/>
+                <w:sz w:val="18"/>
+              </w:rPr>
+              <w:t>4. Trình bày – Thuyết trình – Slide/Báo cáo</w:t>
+            </w:r>
+          </w:p>
+        </w:tc>
+        <w:tc>
+          <w:tcPr>
+            <w:tcW w:type="dxa" w:w="2340"/>
+            <w:shd w:fill="F8FAFC"/>
+            <w:tcMar>
+              <w:top w:w="80" w:type="dxa"/>
+              <w:bottom w:w="80" w:type="dxa"/>
+              <w:left w:w="100" w:type="dxa"/>
+              <w:right w:w="100" w:type="dxa"/>
+            </w:tcMar>
+          </w:tcPr>
+          <w:p>
+            <w:pPr>
+              <w:jc w:val="center"/>
+            </w:pPr>
+            <w:r>
+              <w:rPr>
+                <w:rFonts w:ascii="Times New Roman" w:hAnsi="Times New Roman"/>
+                <w:color w:val="1E293B"/>
+                <w:sz w:val="18"/>
+              </w:rPr>
+              <w:t>20%</w:t>
+            </w:r>
+          </w:p>
+        </w:tc>
+        <w:tc>
+          <w:tcPr>
+            <w:tcW w:type="dxa" w:w="2340"/>
+            <w:shd w:fill="F8FAFC"/>
+            <w:tcMar>
+              <w:top w:w="80" w:type="dxa"/>
+              <w:bottom w:w="80" w:type="dxa"/>
+              <w:left w:w="100" w:type="dxa"/>
+              <w:right w:w="100" w:type="dxa"/>
+            </w:tcMar>
+          </w:tcPr>
+          <w:p>
+            <w:pPr>
+              <w:jc w:val="left"/>
+            </w:pPr>
+            <w:r>
+              <w:rPr>
+                <w:rFonts w:ascii="Times New Roman" w:hAnsi="Times New Roman"/>
+                <w:color w:val="1E293B"/>
+                <w:sz w:val="18"/>
+              </w:rPr>
+              <w:t>Slide chuẩn khung 5 Unit của Samsung SIC, trực quan, nhúng đúng 9 biểu đồ thực nghiệm, thuyết trình mạch lạc, tự tin.</w:t>
+            </w:r>
+          </w:p>
+        </w:tc>
+        <w:tc>
+          <w:tcPr>
+            <w:tcW w:type="dxa" w:w="2340"/>
+            <w:shd w:fill="F8FAFC"/>
+            <w:tcMar>
+              <w:top w:w="80" w:type="dxa"/>
+              <w:bottom w:w="80" w:type="dxa"/>
+              <w:left w:w="100" w:type="dxa"/>
+              <w:right w:w="100" w:type="dxa"/>
+            </w:tcMar>
+          </w:tcPr>
+          <w:p>
+            <w:pPr>
+              <w:jc w:val="center"/>
+            </w:pPr>
+            <w:r>
+              <w:rPr>
+                <w:rFonts w:ascii="Times New Roman" w:hAnsi="Times New Roman"/>
+                <w:color w:val="1E293B"/>
+                <w:sz w:val="18"/>
+              </w:rPr>
+              <w:t>Toàn bộ 18 slide</w:t>
+            </w:r>
+          </w:p>
+        </w:tc>
+      </w:tr>
+      <w:tr>
+        <w:tc>
+          <w:tcPr>
+            <w:tcW w:type="dxa" w:w="2340"/>
+            <w:tcMar>
+              <w:top w:w="80" w:type="dxa"/>
+              <w:bottom w:w="80" w:type="dxa"/>
+              <w:left w:w="100" w:type="dxa"/>
+              <w:right w:w="100" w:type="dxa"/>
+            </w:tcMar>
+          </w:tcPr>
+          <w:p>
+            <w:pPr>
+              <w:jc w:val="left"/>
+            </w:pPr>
+            <w:r>
+              <w:rPr>
+                <w:rFonts w:ascii="Times New Roman" w:hAnsi="Times New Roman"/>
+                <w:color w:val="1E293B"/>
+                <w:sz w:val="18"/>
+              </w:rPr>
+              <w:t>5. Phản biện và trả lời câu hỏi</w:t>
+            </w:r>
+          </w:p>
+        </w:tc>
+        <w:tc>
+          <w:tcPr>
+            <w:tcW w:type="dxa" w:w="2340"/>
+            <w:tcMar>
+              <w:top w:w="80" w:type="dxa"/>
+              <w:bottom w:w="80" w:type="dxa"/>
+              <w:left w:w="100" w:type="dxa"/>
+              <w:right w:w="100" w:type="dxa"/>
+            </w:tcMar>
+          </w:tcPr>
+          <w:p>
+            <w:pPr>
+              <w:jc w:val="center"/>
+            </w:pPr>
+            <w:r>
+              <w:rPr>
+                <w:rFonts w:ascii="Times New Roman" w:hAnsi="Times New Roman"/>
+                <w:color w:val="1E293B"/>
+                <w:sz w:val="18"/>
+              </w:rPr>
+              <w:t>10%</w:t>
+            </w:r>
+          </w:p>
+        </w:tc>
+        <w:tc>
+          <w:tcPr>
+            <w:tcW w:type="dxa" w:w="2340"/>
+            <w:tcMar>
+              <w:top w:w="80" w:type="dxa"/>
+              <w:bottom w:w="80" w:type="dxa"/>
+              <w:left w:w="100" w:type="dxa"/>
+              <w:right w:w="100" w:type="dxa"/>
+            </w:tcMar>
+          </w:tcPr>
+          <w:p>
+            <w:pPr>
+              <w:jc w:val="left"/>
+            </w:pPr>
+            <w:r>
+              <w:rPr>
+                <w:rFonts w:ascii="Times New Roman" w:hAnsi="Times New Roman"/>
+                <w:color w:val="1E293B"/>
+                <w:sz w:val="18"/>
+              </w:rPr>
+              <w:t>Nắm vững bản chất kỹ thuật, trung thực chỉ rõ hạn chế Domain Shift lớp S/F và bảo vệ giải pháp một cách khoa học.</w:t>
+            </w:r>
+          </w:p>
+        </w:tc>
+        <w:tc>
+          <w:tcPr>
+            <w:tcW w:type="dxa" w:w="2340"/>
+            <w:tcMar>
+              <w:top w:w="80" w:type="dxa"/>
+              <w:bottom w:w="80" w:type="dxa"/>
+              <w:left w:w="100" w:type="dxa"/>
+              <w:right w:w="100" w:type="dxa"/>
+            </w:tcMar>
+          </w:tcPr>
+          <w:p>
+            <w:pPr>
+              <w:jc w:val="center"/>
+            </w:pPr>
+            <w:r>
+              <w:rPr>
+                <w:rFonts w:ascii="Times New Roman" w:hAnsi="Times New Roman"/>
+                <w:color w:val="1E293B"/>
+                <w:sz w:val="18"/>
+              </w:rPr>
+              <w:t>Slide 14, 16, 18 &amp; Bộ Q&amp;A</w:t>
+            </w:r>
+          </w:p>
+        </w:tc>
+      </w:tr>
+    </w:tbl>
+    <w:p>
+      <w:pPr>
+        <w:spacing w:before="80" w:after="120"/>
+      </w:pPr>
     </w:p>
     <w:p>
       <w:pPr>
+        <w:keepNext/>
+        <w:spacing w:before="320" w:after="120"/>
+      </w:pPr>
+      <w:r>
+        <w:rPr>
+          <w:rFonts w:ascii="Times New Roman" w:hAnsi="Times New Roman"/>
+          <w:b/>
+          <w:color w:val="1E3A8A"/>
+          <w:sz w:val="28"/>
+        </w:rPr>
+        <w:t>II. DÀN Ý CHI TIẾT 18 SLIDE THEO KHUNG TEMPLATE SAMSUNG SIC</w:t>
+      </w:r>
+    </w:p>
+    <w:p>
+      <w:pPr>
+        <w:keepNext/>
+        <w:spacing w:before="320" w:after="120"/>
+      </w:pPr>
+      <w:r>
+        <w:rPr>
+          <w:rFonts w:ascii="Times New Roman" w:hAnsi="Times New Roman"/>
+          <w:b/>
+          <w:color w:val="1E3A8A"/>
+          <w:sz w:val="28"/>
+        </w:rPr>
+        <w:t>UNIT 1. INTRODUCTION (Tổng Quan Đề Tài &amp; Kế Hoạch Nhóm)</w:t>
+      </w:r>
+    </w:p>
+    <w:p>
+      <w:pPr>
+        <w:keepNext/>
+        <w:spacing w:before="240" w:after="80"/>
+      </w:pPr>
+      <w:r>
+        <w:rPr>
+          <w:rFonts w:ascii="Times New Roman" w:hAnsi="Times New Roman"/>
+          <w:b/>
+          <w:color w:val="2563EB"/>
+          <w:sz w:val="24"/>
+        </w:rPr>
+        <w:t>SLIDE 1: TITLE SLIDE (PROJECT NAME &amp; TEAM INFO)</w:t>
+      </w:r>
+    </w:p>
+    <w:p>
+      <w:pPr>
         <w:spacing w:line="300" w:lineRule="auto" w:before="0" w:after="60"/>
         <w:jc w:val="both"/>
       </w:pPr>
       <w:r>
         <w:rPr>
           <w:rFonts w:ascii="Times New Roman" w:hAnsi="Times New Roman"/>
+          <w:b/>
+          <w:color w:val="1E293B"/>
+          <w:sz w:val="21"/>
+        </w:rPr>
+        <w:t xml:space="preserve">🏷️ Khung Template SIC: </w:t>
+      </w:r>
+      <w:r>
+        <w:rPr>
+          <w:rFonts w:ascii="Times New Roman" w:hAnsi="Times New Roman"/>
           <w:color w:val="334155"/>
           <w:sz w:val="21"/>
         </w:rPr>
-        <w:t>Thời lượng thuyết trình: Tổng cộng 25 phút (15 phút trình bày + 10 phút hỏi đáp phản biện với Hội đồng).</w:t>
+        <w:t>Template Header: Project Title &amp; Team Info</w:t>
       </w:r>
     </w:p>
     <w:p>
@@ -148,10 +832,19 @@
       <w:r>
         <w:rPr>
           <w:rFonts w:ascii="Times New Roman" w:hAnsi="Times New Roman"/>
+          <w:b/>
+          <w:color w:val="1E293B"/>
+          <w:sz w:val="21"/>
+        </w:rPr>
+        <w:t xml:space="preserve">🎯 Mục tiêu đánh giá: </w:t>
+      </w:r>
+      <w:r>
+        <w:rPr>
+          <w:rFonts w:ascii="Times New Roman" w:hAnsi="Times New Roman"/>
           <w:color w:val="334155"/>
           <w:sz w:val="21"/>
         </w:rPr>
-        <w:t>Quy tắc hình thức slide: Sử dụng tone màu chủ đạo Xanh Navy (#1E3A8A) phối Trắng/Xám nhạt (#F8FAFC) và Đỏ y tế (#DC2626) cho các điểm báo động; phông chữ không chân hiện đại (Inter, Roboto, Arial hoặc Calibri); tuyệt đối tránh dùng hiệu ứng animation chạy chữ rườm rà.</w:t>
+        <w:t>Tạo ấn tượng trang trọng, khoa học công nghệ, chuẩn nhận diện Samsung Innovation Campus &amp; HUST.</w:t>
       </w:r>
     </w:p>
     <w:p>
@@ -165,7 +858,7 @@
           <w:color w:val="334155"/>
           <w:sz w:val="21"/>
         </w:rPr>
-        <w:t>Phân công 2 sinh viên:</w:t>
+        <w:t>Nội dung hiển thị trên slide:</w:t>
       </w:r>
     </w:p>
     <w:p>
@@ -177,19 +870,10 @@
       <w:r>
         <w:rPr>
           <w:rFonts w:ascii="Times New Roman" w:hAnsi="Times New Roman"/>
-          <w:b/>
-          <w:color w:val="1E293B"/>
-          <w:sz w:val="20"/>
-        </w:rPr>
-        <w:t xml:space="preserve">Sinh viên 1 (Nam Hải - Trưởng nhóm): </w:t>
-      </w:r>
-      <w:r>
-        <w:rPr>
-          <w:rFonts w:ascii="Times New Roman" w:hAnsi="Times New Roman"/>
           <w:color w:val="334155"/>
           <w:sz w:val="20"/>
         </w:rPr>
-        <w:t>Trình bày Slide 1-3 (Mở đầu, đặt vấn đề), Slide 6-12 (AI Benchmark, Explainable AI, ONNX, Backend, Frontend, RBAC) và trực tiếp điều khiển Live Demo 5 pha.</w:t>
+        <w:t>Project Title: REAL-TIME EXPLAINABLE AI ECG ARRHYTHMIA MONITORING &amp; CLINICAL DECISION SUPPORT SYSTEM (NEURO-ECG)</w:t>
       </w:r>
     </w:p>
     <w:p>
@@ -201,19 +885,726 @@
       <w:r>
         <w:rPr>
           <w:rFonts w:ascii="Times New Roman" w:hAnsi="Times New Roman"/>
+          <w:color w:val="334155"/>
+          <w:sz w:val="20"/>
+        </w:rPr>
+        <w:t>Team Name / Members: Nguyễn Đào Nam Hải (Team Leader) · Phan Thị Hải Yến (Member)</w:t>
+      </w:r>
+    </w:p>
+    <w:p>
+      <w:pPr>
+        <w:pStyle w:val="ListBullet"/>
+        <w:spacing w:line="288" w:lineRule="auto" w:before="0" w:after="40"/>
+        <w:jc w:val="both"/>
+      </w:pPr>
+      <w:r>
+        <w:rPr>
+          <w:rFonts w:ascii="Times New Roman" w:hAnsi="Times New Roman"/>
+          <w:color w:val="334155"/>
+          <w:sz w:val="20"/>
+        </w:rPr>
+        <w:t>Course: Samsung Innovation Campus (SIC) - HUST AI Track 2026</w:t>
+      </w:r>
+    </w:p>
+    <w:p>
+      <w:pPr>
+        <w:pStyle w:val="ListBullet"/>
+        <w:spacing w:line="288" w:lineRule="auto" w:before="0" w:after="40"/>
+        <w:jc w:val="both"/>
+      </w:pPr>
+      <w:r>
+        <w:rPr>
+          <w:rFonts w:ascii="Times New Roman" w:hAnsi="Times New Roman"/>
+          <w:color w:val="334155"/>
+          <w:sz w:val="20"/>
+        </w:rPr>
+        <w:t>Repository: https://github.com/NamHaiIT2HUST/ECG-Arrhythmia-Detection</w:t>
+      </w:r>
+    </w:p>
+    <w:p>
+      <w:pPr>
+        <w:spacing w:line="300" w:lineRule="auto" w:before="0" w:after="60"/>
+        <w:jc w:val="both"/>
+      </w:pPr>
+      <w:r>
+        <w:rPr>
+          <w:rFonts w:ascii="Times New Roman" w:hAnsi="Times New Roman"/>
           <w:b/>
           <w:color w:val="1E293B"/>
-          <w:sz w:val="20"/>
-        </w:rPr>
-        <w:t xml:space="preserve">Sinh viên 2 (Hải Yến - Thành viên): </w:t>
-      </w:r>
+          <w:sz w:val="21"/>
+        </w:rPr>
+        <w:t xml:space="preserve">🎨 Hình vẽ / Biểu đồ chèn: </w:t>
+      </w:r>
+      <w:r>
+        <w:rPr>
+          <w:rFonts w:ascii="Times New Roman" w:hAnsi="Times New Roman"/>
+          <w:color w:val="334155"/>
+          <w:sz w:val="21"/>
+        </w:rPr>
+        <w:t>Logo HUST và Logo Samsung đặt 2 góc trên; hình nền phẳng tối giản (Deep Navy #1E3A8A) có đường sóng ECG chạy ngang mờ.</w:t>
+      </w:r>
+    </w:p>
+    <w:p>
+      <w:pPr>
+        <w:spacing w:line="300" w:lineRule="auto" w:before="0" w:after="60"/>
+        <w:jc w:val="both"/>
+      </w:pPr>
+      <w:r>
+        <w:rPr>
+          <w:rFonts w:ascii="Times New Roman" w:hAnsi="Times New Roman"/>
+          <w:b/>
+          <w:color w:val="1E293B"/>
+          <w:sz w:val="21"/>
+        </w:rPr>
+        <w:t xml:space="preserve">🎙️ Lời thoại gợi ý (Speaker Notes): </w:t>
+      </w:r>
+      <w:r>
+        <w:rPr>
+          <w:rFonts w:ascii="Times New Roman" w:hAnsi="Times New Roman"/>
+          <w:color w:val="334155"/>
+          <w:sz w:val="21"/>
+        </w:rPr>
+        <w:t>"Kính thưa Hội đồng Giảng viên Samsung Innovation Campus và các Thầy Cô giáo ĐH Bách Khoa Hà Nội, hôm nay nhóm chúng em xin được báo cáo đề tài Capstone Project: Hệ thống giám sát ECG thời gian thực tích hợp Explainable AI..."</w:t>
+      </w:r>
+    </w:p>
+    <w:p>
+      <w:pPr>
+        <w:spacing w:before="80" w:after="160"/>
+      </w:pPr>
+      <w:r>
+        <w:rPr>
+          <w:rFonts w:ascii="Times New Roman" w:hAnsi="Times New Roman"/>
+          <w:color w:val="E2E8F0"/>
+          <w:sz w:val="18"/>
+        </w:rPr>
+        <w:t>―――――――――――――――――――――――――――――――――――――――――――――――――――――――</w:t>
+      </w:r>
+    </w:p>
+    <w:p>
+      <w:pPr>
+        <w:keepNext/>
+        <w:spacing w:before="240" w:after="80"/>
+      </w:pPr>
+      <w:r>
+        <w:rPr>
+          <w:rFonts w:ascii="Times New Roman" w:hAnsi="Times New Roman"/>
+          <w:b/>
+          <w:color w:val="2563EB"/>
+          <w:sz w:val="24"/>
+        </w:rPr>
+        <w:t>SLIDE 2: 1.1. BACKGROUND INFORMATION (BỐI CẢNH &amp; THÁCH THỨC THỰC TIỄN)</w:t>
+      </w:r>
+    </w:p>
+    <w:p>
+      <w:pPr>
+        <w:spacing w:line="300" w:lineRule="auto" w:before="0" w:after="60"/>
+        <w:jc w:val="both"/>
+      </w:pPr>
+      <w:r>
+        <w:rPr>
+          <w:rFonts w:ascii="Times New Roman" w:hAnsi="Times New Roman"/>
+          <w:b/>
+          <w:color w:val="1E293B"/>
+          <w:sz w:val="21"/>
+        </w:rPr>
+        <w:t xml:space="preserve">🏷️ Khung Template SIC: </w:t>
+      </w:r>
+      <w:r>
+        <w:rPr>
+          <w:rFonts w:ascii="Times New Roman" w:hAnsi="Times New Roman"/>
+          <w:color w:val="334155"/>
+          <w:sz w:val="21"/>
+        </w:rPr>
+        <w:t>Template Unit 1.1: Background Information</w:t>
+      </w:r>
+    </w:p>
+    <w:p>
+      <w:pPr>
+        <w:spacing w:line="300" w:lineRule="auto" w:before="0" w:after="60"/>
+        <w:jc w:val="both"/>
+      </w:pPr>
+      <w:r>
+        <w:rPr>
+          <w:rFonts w:ascii="Times New Roman" w:hAnsi="Times New Roman"/>
+          <w:b/>
+          <w:color w:val="1E293B"/>
+          <w:sz w:val="21"/>
+        </w:rPr>
+        <w:t xml:space="preserve">🎯 Mục tiêu đánh giá: </w:t>
+      </w:r>
+      <w:r>
+        <w:rPr>
+          <w:rFonts w:ascii="Times New Roman" w:hAnsi="Times New Roman"/>
+          <w:color w:val="334155"/>
+          <w:sz w:val="21"/>
+        </w:rPr>
+        <w:t>Làm nổi bật bài toán thực tiễn và 2 rào cản cốt tử khi ứng dụng AI vào lâm sàng y tế (Nhắm vào 25% điểm Tính thực tiễn).</w:t>
+      </w:r>
+    </w:p>
+    <w:p>
+      <w:pPr>
+        <w:spacing w:line="300" w:lineRule="auto" w:before="0" w:after="60"/>
+        <w:jc w:val="both"/>
+      </w:pPr>
+      <w:r>
+        <w:rPr>
+          <w:rFonts w:ascii="Times New Roman" w:hAnsi="Times New Roman"/>
+          <w:color w:val="334155"/>
+          <w:sz w:val="21"/>
+        </w:rPr>
+        <w:t>Nội dung hiển thị trên slide:</w:t>
+      </w:r>
+    </w:p>
+    <w:p>
+      <w:pPr>
+        <w:pStyle w:val="ListBullet"/>
+        <w:spacing w:line="288" w:lineRule="auto" w:before="0" w:after="40"/>
+        <w:jc w:val="both"/>
+      </w:pPr>
       <w:r>
         <w:rPr>
           <w:rFonts w:ascii="Times New Roman" w:hAnsi="Times New Roman"/>
           <w:color w:val="334155"/>
           <w:sz w:val="20"/>
         </w:rPr>
-        <w:t>Trình bày Slide 4-5 (Dữ liệu, SMOTE, Sửa rò rỉ Validation, DSP Pan-Tompkins), Slide 13-15 (Đánh giá hoàn thành, Hạn chế kỹ thuật &amp; Cross-database) và Slide 18 (Kết luận).</w:t>
+        <w:t>Thực trạng: Bệnh lý tim mạch và rối loạn nhịp tim (Arrhythmia) là nguyên nhân gây đột tử hàng đầu thế giới; cần phát hiện sớm các nhịp nguy hiểm như Ngoại tâm thu thất (PVC) và Rung nhĩ (AFib).</w:t>
+      </w:r>
+    </w:p>
+    <w:p>
+      <w:pPr>
+        <w:pStyle w:val="ListBullet"/>
+        <w:spacing w:line="288" w:lineRule="auto" w:before="0" w:after="40"/>
+        <w:jc w:val="both"/>
+      </w:pPr>
+      <w:r>
+        <w:rPr>
+          <w:rFonts w:ascii="Times New Roman" w:hAnsi="Times New Roman"/>
+          <w:color w:val="334155"/>
+          <w:sz w:val="20"/>
+        </w:rPr>
+        <w:t>Rào cản 1 (Vấn đề 'Hộp đen' - Black-box): Các mô hình Deep Learning truyền thống chỉ đưa ra nhãn cảnh báo mà không giải thích được lý do bệnh học, khiến bác sĩ không dám tin cậy.</w:t>
+      </w:r>
+    </w:p>
+    <w:p>
+      <w:pPr>
+        <w:pStyle w:val="ListBullet"/>
+        <w:spacing w:line="288" w:lineRule="auto" w:before="0" w:after="40"/>
+        <w:jc w:val="both"/>
+      </w:pPr>
+      <w:r>
+        <w:rPr>
+          <w:rFonts w:ascii="Times New Roman" w:hAnsi="Times New Roman"/>
+          <w:color w:val="334155"/>
+          <w:sz w:val="20"/>
+        </w:rPr>
+        <w:t>Rào cản 2 (Thiếu chuỗi tích hợp y sinh hoàn chỉnh): Đa số nghiên cứu dừng lại ở mức file Notebook rời rạc; thiếu chuỗi xử lý tín hiệu số y sinh (DSP), streaming thời gian thực độ trễ thấp và thiếu cơ chế Human-in-the-loop lưu vết pháp lý.</w:t>
+      </w:r>
+    </w:p>
+    <w:p>
+      <w:pPr>
+        <w:spacing w:line="300" w:lineRule="auto" w:before="0" w:after="60"/>
+        <w:jc w:val="both"/>
+      </w:pPr>
+      <w:r>
+        <w:rPr>
+          <w:rFonts w:ascii="Times New Roman" w:hAnsi="Times New Roman"/>
+          <w:b/>
+          <w:color w:val="1E293B"/>
+          <w:sz w:val="21"/>
+        </w:rPr>
+        <w:t xml:space="preserve">🎨 Hình vẽ / Biểu đồ chèn: </w:t>
+      </w:r>
+      <w:r>
+        <w:rPr>
+          <w:rFonts w:ascii="Times New Roman" w:hAnsi="Times New Roman"/>
+          <w:color w:val="334155"/>
+          <w:sz w:val="21"/>
+        </w:rPr>
+        <w:t>Sơ đồ đối sánh trực quan 2 cột: Cột trái 'Mô hình Black-box -&gt; Bác sĩ hoài nghi -&gt; Không đưa vào ứng dụng' vs Cột phải 'NEURO-ECG: Explainable AI + Human-in-the-loop -&gt; Đồng thuận y khoa &amp; Ứng dụng thực tế'.</w:t>
+      </w:r>
+    </w:p>
+    <w:p>
+      <w:pPr>
+        <w:spacing w:line="300" w:lineRule="auto" w:before="0" w:after="60"/>
+        <w:jc w:val="both"/>
+      </w:pPr>
+      <w:r>
+        <w:rPr>
+          <w:rFonts w:ascii="Times New Roman" w:hAnsi="Times New Roman"/>
+          <w:b/>
+          <w:color w:val="1E293B"/>
+          <w:sz w:val="21"/>
+        </w:rPr>
+        <w:t xml:space="preserve">🎙️ Lời thoại gợi ý (Speaker Notes): </w:t>
+      </w:r>
+      <w:r>
+        <w:rPr>
+          <w:rFonts w:ascii="Times New Roman" w:hAnsi="Times New Roman"/>
+          <w:color w:val="334155"/>
+          <w:sz w:val="21"/>
+        </w:rPr>
+        <w:t>"Thưa các Thầy, AI đã đạt độ chính xác rất cao nhưng vẫn chưa thể vào bệnh viện vì hai rào cản lớn: tính 'hộp đen' và sự thiếu hụt một hệ thống tích hợp chuẩn y tế. Dự án của chúng em sinh ra để giải quyết triệt để hai bài toán này..."</w:t>
+      </w:r>
+    </w:p>
+    <w:p>
+      <w:pPr>
+        <w:spacing w:before="80" w:after="160"/>
+      </w:pPr>
+      <w:r>
+        <w:rPr>
+          <w:rFonts w:ascii="Times New Roman" w:hAnsi="Times New Roman"/>
+          <w:color w:val="E2E8F0"/>
+          <w:sz w:val="18"/>
+        </w:rPr>
+        <w:t>―――――――――――――――――――――――――――――――――――――――――――――――――――――――</w:t>
+      </w:r>
+    </w:p>
+    <w:p>
+      <w:pPr>
+        <w:keepNext/>
+        <w:spacing w:before="240" w:after="80"/>
+      </w:pPr>
+      <w:r>
+        <w:rPr>
+          <w:rFonts w:ascii="Times New Roman" w:hAnsi="Times New Roman"/>
+          <w:b/>
+          <w:color w:val="2563EB"/>
+          <w:sz w:val="24"/>
+        </w:rPr>
+        <w:t>SLIDE 3: 1.2. MOTIVATION AND OBJECTIVE (MỤC TIÊU &amp; GIẢI PHÁP SẢN PHẨM)</w:t>
+      </w:r>
+    </w:p>
+    <w:p>
+      <w:pPr>
+        <w:spacing w:line="300" w:lineRule="auto" w:before="0" w:after="60"/>
+        <w:jc w:val="both"/>
+      </w:pPr>
+      <w:r>
+        <w:rPr>
+          <w:rFonts w:ascii="Times New Roman" w:hAnsi="Times New Roman"/>
+          <w:b/>
+          <w:color w:val="1E293B"/>
+          <w:sz w:val="21"/>
+        </w:rPr>
+        <w:t xml:space="preserve">🏷️ Khung Template SIC: </w:t>
+      </w:r>
+      <w:r>
+        <w:rPr>
+          <w:rFonts w:ascii="Times New Roman" w:hAnsi="Times New Roman"/>
+          <w:color w:val="334155"/>
+          <w:sz w:val="21"/>
+        </w:rPr>
+        <w:t>Template Unit 1.2: Motivation and Objective</w:t>
+      </w:r>
+    </w:p>
+    <w:p>
+      <w:pPr>
+        <w:spacing w:line="300" w:lineRule="auto" w:before="0" w:after="60"/>
+        <w:jc w:val="both"/>
+      </w:pPr>
+      <w:r>
+        <w:rPr>
+          <w:rFonts w:ascii="Times New Roman" w:hAnsi="Times New Roman"/>
+          <w:b/>
+          <w:color w:val="1E293B"/>
+          <w:sz w:val="21"/>
+        </w:rPr>
+        <w:t xml:space="preserve">🎯 Mục tiêu đánh giá: </w:t>
+      </w:r>
+      <w:r>
+        <w:rPr>
+          <w:rFonts w:ascii="Times New Roman" w:hAnsi="Times New Roman"/>
+          <w:color w:val="334155"/>
+          <w:sz w:val="21"/>
+        </w:rPr>
+        <w:t>Khái quát 5 mục tiêu cốt lõi của đề tài tạo nên một giải pháp y tế khép kín (Khẳng định tính sáng tạo và khả thi).</w:t>
+      </w:r>
+    </w:p>
+    <w:p>
+      <w:pPr>
+        <w:spacing w:line="300" w:lineRule="auto" w:before="0" w:after="60"/>
+        <w:jc w:val="both"/>
+      </w:pPr>
+      <w:r>
+        <w:rPr>
+          <w:rFonts w:ascii="Times New Roman" w:hAnsi="Times New Roman"/>
+          <w:color w:val="334155"/>
+          <w:sz w:val="21"/>
+        </w:rPr>
+        <w:t>Nội dung hiển thị trên slide:</w:t>
+      </w:r>
+    </w:p>
+    <w:p>
+      <w:pPr>
+        <w:pStyle w:val="ListBullet"/>
+        <w:spacing w:line="288" w:lineRule="auto" w:before="0" w:after="40"/>
+        <w:jc w:val="both"/>
+      </w:pPr>
+      <w:r>
+        <w:rPr>
+          <w:rFonts w:ascii="Times New Roman" w:hAnsi="Times New Roman"/>
+          <w:color w:val="334155"/>
+          <w:sz w:val="20"/>
+        </w:rPr>
+        <w:t>Mục tiêu 1 (Lõi AI Đa mô hình): Benchmark 5 kiến trúc 1D (ResNet, CNN-LSTM, TCN, Transformer, Mamba); chọn ResNet-1D đạt Accuracy 98.57%, Macro-F1 91.70%, Latency 0.13ms.</w:t>
+      </w:r>
+    </w:p>
+    <w:p>
+      <w:pPr>
+        <w:pStyle w:val="ListBullet"/>
+        <w:spacing w:line="288" w:lineRule="auto" w:before="0" w:after="40"/>
+        <w:jc w:val="both"/>
+      </w:pPr>
+      <w:r>
+        <w:rPr>
+          <w:rFonts w:ascii="Times New Roman" w:hAnsi="Times New Roman"/>
+          <w:color w:val="334155"/>
+          <w:sz w:val="20"/>
+        </w:rPr>
+        <w:t>Mục tiêu 2 (Explainable AI): Ứng dụng 1D Grad-CAM trích xuất bản đồ nhiệt minh bạch hóa căn cứ chẩn đoán trên phức bộ P-QRS-T.</w:t>
+      </w:r>
+    </w:p>
+    <w:p>
+      <w:pPr>
+        <w:pStyle w:val="ListBullet"/>
+        <w:spacing w:line="288" w:lineRule="auto" w:before="0" w:after="40"/>
+        <w:jc w:val="both"/>
+      </w:pPr>
+      <w:r>
+        <w:rPr>
+          <w:rFonts w:ascii="Times New Roman" w:hAnsi="Times New Roman"/>
+          <w:color w:val="334155"/>
+          <w:sz w:val="20"/>
+        </w:rPr>
+        <w:t>Mục tiêu 3 (Y sinh &amp; DSP): Xây dựng chuỗi lọc thông dải Butterworth, Notch 50Hz, Pan-Tompkins QRS đạt F1 = 97.14%, và module sàng lọc AFib.</w:t>
+      </w:r>
+    </w:p>
+    <w:p>
+      <w:pPr>
+        <w:pStyle w:val="ListBullet"/>
+        <w:spacing w:line="288" w:lineRule="auto" w:before="0" w:after="40"/>
+        <w:jc w:val="both"/>
+      </w:pPr>
+      <w:r>
+        <w:rPr>
+          <w:rFonts w:ascii="Times New Roman" w:hAnsi="Times New Roman"/>
+          <w:color w:val="334155"/>
+          <w:sz w:val="20"/>
+        </w:rPr>
+        <w:t>Mục tiêu 4 (Tối ưu Edge AI): Lượng tử hóa ONNX INT8 nén mô hình xuống 697.3 KB (&lt; 700 KB), ONNX FP32 chạy nhanh gấp 4 lần.</w:t>
+      </w:r>
+    </w:p>
+    <w:p>
+      <w:pPr>
+        <w:pStyle w:val="ListBullet"/>
+        <w:spacing w:line="288" w:lineRule="auto" w:before="0" w:after="40"/>
+        <w:jc w:val="both"/>
+      </w:pPr>
+      <w:r>
+        <w:rPr>
+          <w:rFonts w:ascii="Times New Roman" w:hAnsi="Times New Roman"/>
+          <w:color w:val="334155"/>
+          <w:sz w:val="20"/>
+        </w:rPr>
+        <w:t>Mục tiêu 5 (Nền tảng Full-Stack &amp; Human-in-the-loop): FastAPI WebSocket 360Hz 2 kênh, React 19 Plotly 60 FPS, RBAC 3 vai trò, Audit Trail và xuất báo cáo y tế PDF.</w:t>
+      </w:r>
+    </w:p>
+    <w:p>
+      <w:pPr>
+        <w:spacing w:line="300" w:lineRule="auto" w:before="0" w:after="60"/>
+        <w:jc w:val="both"/>
+      </w:pPr>
+      <w:r>
+        <w:rPr>
+          <w:rFonts w:ascii="Times New Roman" w:hAnsi="Times New Roman"/>
+          <w:b/>
+          <w:color w:val="1E293B"/>
+          <w:sz w:val="21"/>
+        </w:rPr>
+        <w:t xml:space="preserve">🎨 Hình vẽ / Biểu đồ chèn: </w:t>
+      </w:r>
+      <w:r>
+        <w:rPr>
+          <w:rFonts w:ascii="Times New Roman" w:hAnsi="Times New Roman"/>
+          <w:color w:val="334155"/>
+          <w:sz w:val="21"/>
+        </w:rPr>
+        <w:t>Sơ đồ 5 khối hình hộp tròn (5 Pillars of NEURO-ECG): [DSP Pipeline] -&gt; [ResNet-1D / ONNX] -&gt; [1D Grad-CAM] -&gt; [FastAPI WebSocket] -&gt; [React 19 &amp; Doctor Review].</w:t>
+      </w:r>
+    </w:p>
+    <w:p>
+      <w:pPr>
+        <w:spacing w:line="300" w:lineRule="auto" w:before="0" w:after="60"/>
+        <w:jc w:val="both"/>
+      </w:pPr>
+      <w:r>
+        <w:rPr>
+          <w:rFonts w:ascii="Times New Roman" w:hAnsi="Times New Roman"/>
+          <w:b/>
+          <w:color w:val="1E293B"/>
+          <w:sz w:val="21"/>
+        </w:rPr>
+        <w:t xml:space="preserve">🎙️ Lời thoại gợi ý (Speaker Notes): </w:t>
+      </w:r>
+      <w:r>
+        <w:rPr>
+          <w:rFonts w:ascii="Times New Roman" w:hAnsi="Times New Roman"/>
+          <w:color w:val="334155"/>
+          <w:sz w:val="21"/>
+        </w:rPr>
+        <w:t>"NEURO-ECG được định hình không chỉ là một bài toán phân loại nhịp tim, mà là một hệ sinh thái y tế hoàn chỉnh từ xử lý tín hiệu thô đến thiết bị đeo và bàn làm việc của bác sĩ..."</w:t>
+      </w:r>
+    </w:p>
+    <w:p>
+      <w:pPr>
+        <w:spacing w:before="80" w:after="160"/>
+      </w:pPr>
+      <w:r>
+        <w:rPr>
+          <w:rFonts w:ascii="Times New Roman" w:hAnsi="Times New Roman"/>
+          <w:color w:val="E2E8F0"/>
+          <w:sz w:val="18"/>
+        </w:rPr>
+        <w:t>―――――――――――――――――――――――――――――――――――――――――――――――――――――――</w:t>
+      </w:r>
+    </w:p>
+    <w:p>
+      <w:pPr>
+        <w:keepNext/>
+        <w:spacing w:before="240" w:after="80"/>
+      </w:pPr>
+      <w:r>
+        <w:rPr>
+          <w:rFonts w:ascii="Times New Roman" w:hAnsi="Times New Roman"/>
+          <w:b/>
+          <w:color w:val="2563EB"/>
+          <w:sz w:val="24"/>
+        </w:rPr>
+        <w:t>SLIDE 4: 1.3 &amp; 1.4. MEMBERS, ROLE ASSIGNMENTS &amp; SCHEDULE/WBS (PHÂN CÔNG &amp; TIẾN ĐỘ)</w:t>
+      </w:r>
+    </w:p>
+    <w:p>
+      <w:pPr>
+        <w:spacing w:line="300" w:lineRule="auto" w:before="0" w:after="60"/>
+        <w:jc w:val="both"/>
+      </w:pPr>
+      <w:r>
+        <w:rPr>
+          <w:rFonts w:ascii="Times New Roman" w:hAnsi="Times New Roman"/>
+          <w:b/>
+          <w:color w:val="1E293B"/>
+          <w:sz w:val="21"/>
+        </w:rPr>
+        <w:t xml:space="preserve">🏷️ Khung Template SIC: </w:t>
+      </w:r>
+      <w:r>
+        <w:rPr>
+          <w:rFonts w:ascii="Times New Roman" w:hAnsi="Times New Roman"/>
+          <w:color w:val="334155"/>
+          <w:sz w:val="21"/>
+        </w:rPr>
+        <w:t>Template Unit 1.3 &amp; 1.4: Role Assignments &amp; WBS Milestones</w:t>
+      </w:r>
+    </w:p>
+    <w:p>
+      <w:pPr>
+        <w:spacing w:line="300" w:lineRule="auto" w:before="0" w:after="60"/>
+        <w:jc w:val="both"/>
+      </w:pPr>
+      <w:r>
+        <w:rPr>
+          <w:rFonts w:ascii="Times New Roman" w:hAnsi="Times New Roman"/>
+          <w:b/>
+          <w:color w:val="1E293B"/>
+          <w:sz w:val="21"/>
+        </w:rPr>
+        <w:t xml:space="preserve">🎯 Mục tiêu đánh giá: </w:t>
+      </w:r>
+      <w:r>
+        <w:rPr>
+          <w:rFonts w:ascii="Times New Roman" w:hAnsi="Times New Roman"/>
+          <w:color w:val="334155"/>
+          <w:sz w:val="21"/>
+        </w:rPr>
+        <w:t>Ăn trọn 15% điểm Kỹ năng làm việc nhóm &amp; tiến độ WBS theo đúng biểu mẫu Action Plan / WBS của Samsung SIC.</w:t>
+      </w:r>
+    </w:p>
+    <w:p>
+      <w:pPr>
+        <w:spacing w:line="300" w:lineRule="auto" w:before="0" w:after="60"/>
+        <w:jc w:val="both"/>
+      </w:pPr>
+      <w:r>
+        <w:rPr>
+          <w:rFonts w:ascii="Times New Roman" w:hAnsi="Times New Roman"/>
+          <w:color w:val="334155"/>
+          <w:sz w:val="21"/>
+        </w:rPr>
+        <w:t>Nội dung hiển thị trên slide:</w:t>
+      </w:r>
+    </w:p>
+    <w:p>
+      <w:pPr>
+        <w:pStyle w:val="ListBullet"/>
+        <w:spacing w:line="288" w:lineRule="auto" w:before="0" w:after="40"/>
+        <w:jc w:val="both"/>
+      </w:pPr>
+      <w:r>
+        <w:rPr>
+          <w:rFonts w:ascii="Times New Roman" w:hAnsi="Times New Roman"/>
+          <w:color w:val="334155"/>
+          <w:sz w:val="20"/>
+        </w:rPr>
+        <w:t>Phân công vai trò (Role by Member):</w:t>
+      </w:r>
+    </w:p>
+    <w:p>
+      <w:pPr>
+        <w:pStyle w:val="ListBullet"/>
+        <w:spacing w:line="288" w:lineRule="auto" w:before="0" w:after="40"/>
+        <w:jc w:val="both"/>
+      </w:pPr>
+      <w:r>
+        <w:rPr>
+          <w:rFonts w:ascii="Times New Roman" w:hAnsi="Times New Roman"/>
+          <w:color w:val="334155"/>
+          <w:sz w:val="20"/>
+        </w:rPr>
+        <w:t>- Nguyễn Đào Nam Hải (Trưởng nhóm): Kiến trúc mô hình AI (Benchmark 5 model, Grad-CAM, ONNX), Kiến trúc Backend FastAPI, WebSocket streaming 360Hz, Giao diện React 19.</w:t>
+      </w:r>
+    </w:p>
+    <w:p>
+      <w:pPr>
+        <w:pStyle w:val="ListBullet"/>
+        <w:spacing w:line="288" w:lineRule="auto" w:before="0" w:after="40"/>
+        <w:jc w:val="both"/>
+      </w:pPr>
+      <w:r>
+        <w:rPr>
+          <w:rFonts w:ascii="Times New Roman" w:hAnsi="Times New Roman"/>
+          <w:color w:val="334155"/>
+          <w:sz w:val="20"/>
+        </w:rPr>
+        <w:t>- Phan Thị Hải Yến (Thành viên): Kỹ thuật dữ liệu (Kaggle, PhysioNet WFDB, SMOTE, Validation Split), Chuỗi DSP (Pan-Tompkins QRS, Lọc dải thông), Thẩm định tiêu chuẩn y tế &amp; Báo cáo QA.</w:t>
+      </w:r>
+    </w:p>
+    <w:p>
+      <w:pPr>
+        <w:pStyle w:val="ListBullet"/>
+        <w:spacing w:line="288" w:lineRule="auto" w:before="0" w:after="40"/>
+        <w:jc w:val="both"/>
+      </w:pPr>
+      <w:r>
+        <w:rPr>
+          <w:rFonts w:ascii="Times New Roman" w:hAnsi="Times New Roman"/>
+          <w:color w:val="334155"/>
+          <w:sz w:val="20"/>
+        </w:rPr>
+        <w:t>Kế hoạch hành động &amp; Tiến độ WBS (6 Checkpoints hoàn thành 100%):</w:t>
+      </w:r>
+    </w:p>
+    <w:p>
+      <w:pPr>
+        <w:pStyle w:val="ListBullet"/>
+        <w:spacing w:line="288" w:lineRule="auto" w:before="0" w:after="40"/>
+        <w:jc w:val="both"/>
+      </w:pPr>
+      <w:r>
+        <w:rPr>
+          <w:rFonts w:ascii="Times New Roman" w:hAnsi="Times New Roman"/>
+          <w:color w:val="334155"/>
+          <w:sz w:val="20"/>
+        </w:rPr>
+        <w:t>- W1-W2 (CP1-CP2): Dữ liệu, SMOTE, 5 Models, Grad-CAM, WebSocket core.</w:t>
+      </w:r>
+    </w:p>
+    <w:p>
+      <w:pPr>
+        <w:pStyle w:val="ListBullet"/>
+        <w:spacing w:line="288" w:lineRule="auto" w:before="0" w:after="40"/>
+        <w:jc w:val="both"/>
+      </w:pPr>
+      <w:r>
+        <w:rPr>
+          <w:rFonts w:ascii="Times New Roman" w:hAnsi="Times New Roman"/>
+          <w:color w:val="334155"/>
+          <w:sz w:val="20"/>
+        </w:rPr>
+        <w:t>- W3-W4 (CP3-CP4): DSP Pan-Tompkins, Báo động IEC 60601-1-8, Xuất PDF/CSV.</w:t>
+      </w:r>
+    </w:p>
+    <w:p>
+      <w:pPr>
+        <w:pStyle w:val="ListBullet"/>
+        <w:spacing w:line="288" w:lineRule="auto" w:before="0" w:after="40"/>
+        <w:jc w:val="both"/>
+      </w:pPr>
+      <w:r>
+        <w:rPr>
+          <w:rFonts w:ascii="Times New Roman" w:hAnsi="Times New Roman"/>
+          <w:color w:val="334155"/>
+          <w:sz w:val="20"/>
+        </w:rPr>
+        <w:t>- W5-W6 (CP5-CP6): Database RBAC, Human-in-the-loop, ONNX INT8, Test suite 42/42.</w:t>
+      </w:r>
+    </w:p>
+    <w:p>
+      <w:pPr>
+        <w:spacing w:line="300" w:lineRule="auto" w:before="0" w:after="60"/>
+        <w:jc w:val="both"/>
+      </w:pPr>
+      <w:r>
+        <w:rPr>
+          <w:rFonts w:ascii="Times New Roman" w:hAnsi="Times New Roman"/>
+          <w:b/>
+          <w:color w:val="1E293B"/>
+          <w:sz w:val="21"/>
+        </w:rPr>
+        <w:t xml:space="preserve">🎨 Hình vẽ / Biểu đồ chèn: </w:t>
+      </w:r>
+      <w:r>
+        <w:rPr>
+          <w:rFonts w:ascii="Times New Roman" w:hAnsi="Times New Roman"/>
+          <w:color w:val="334155"/>
+          <w:sz w:val="21"/>
+        </w:rPr>
+        <w:t>Bảng phân vai 2 thành viên kèm ảnh chân dung nhóm nhỏ và Biểu đồ tiến độ Gantt Chart / WBS 6 tuần với các mốc Checkpoint xanh hoàn thành.</w:t>
+      </w:r>
+    </w:p>
+    <w:p>
+      <w:pPr>
+        <w:spacing w:line="300" w:lineRule="auto" w:before="0" w:after="60"/>
+        <w:jc w:val="both"/>
+      </w:pPr>
+      <w:r>
+        <w:rPr>
+          <w:rFonts w:ascii="Times New Roman" w:hAnsi="Times New Roman"/>
+          <w:b/>
+          <w:color w:val="1E293B"/>
+          <w:sz w:val="21"/>
+        </w:rPr>
+        <w:t xml:space="preserve">🎙️ Lời thoại gợi ý (Speaker Notes): </w:t>
+      </w:r>
+      <w:r>
+        <w:rPr>
+          <w:rFonts w:ascii="Times New Roman" w:hAnsi="Times New Roman"/>
+          <w:color w:val="334155"/>
+          <w:sz w:val="21"/>
+        </w:rPr>
+        <w:t>"Tuân thủ đúng quy trình quản lý dự án Capstone của Samsung SIC, nhóm em đã phân vai rõ ràng giữa mảng AI/Hệ thống và mảng Kỹ thuật Dữ liệu/DSP, bám sát từng mốc WBS trong suốt 6 tuần thực hiện..."</w:t>
+      </w:r>
+    </w:p>
+    <w:p>
+      <w:pPr>
+        <w:spacing w:before="80" w:after="160"/>
+      </w:pPr>
+      <w:r>
+        <w:rPr>
+          <w:rFonts w:ascii="Times New Roman" w:hAnsi="Times New Roman"/>
+          <w:color w:val="E2E8F0"/>
+          <w:sz w:val="18"/>
+        </w:rPr>
+        <w:t>―――――――――――――――――――――――――――――――――――――――――――――――――――――――</w:t>
       </w:r>
     </w:p>
     <w:p>
@@ -228,7 +1619,7 @@
           <w:color w:val="1E3A8A"/>
           <w:sz w:val="28"/>
         </w:rPr>
-        <w:t>II. DÀN Ý CHI TIẾT TỪNG SLIDE (SLIDE 1 ĐẾN SLIDE 18)</w:t>
+        <w:t>UNIT 2. PROJECT EXECUTION (Phương Pháp, Mô Hình AI &amp; Kiến Trúc Hệ Thống)</w:t>
       </w:r>
     </w:p>
     <w:p>
@@ -243,7 +1634,7 @@
           <w:color w:val="2563EB"/>
           <w:sz w:val="24"/>
         </w:rPr>
-        <w:t>SLIDE 1: TRANG TIÊU ĐỀ (TITLE SLIDE)</w:t>
+        <w:t>SLIDE 5: 2.1. SYSTEM ARCHITECTURE &amp; SERVICE MODEL (KIẾN TRÚC DỊCH VỤ &amp; LUỒNG DỮ LIỆU)</w:t>
       </w:r>
     </w:p>
     <w:p>
@@ -258,7 +1649,7 @@
           <w:color w:val="1E293B"/>
           <w:sz w:val="21"/>
         </w:rPr>
-        <w:t xml:space="preserve">🎯 Mục tiêu cần làm: </w:t>
+        <w:t xml:space="preserve">🏷️ Khung Template SIC: </w:t>
       </w:r>
       <w:r>
         <w:rPr>
@@ -266,7 +1657,30 @@
           <w:color w:val="334155"/>
           <w:sz w:val="21"/>
         </w:rPr>
-        <w:t>Giới thiệu đề tài trang trọng, tạo ấn tượng khoa học công nghệ y tế chuẩn mực.</w:t>
+        <w:t>Template Unit 2.1: IoT Service Model &amp; System Architecture</w:t>
+      </w:r>
+    </w:p>
+    <w:p>
+      <w:pPr>
+        <w:spacing w:line="300" w:lineRule="auto" w:before="0" w:after="60"/>
+        <w:jc w:val="both"/>
+      </w:pPr>
+      <w:r>
+        <w:rPr>
+          <w:rFonts w:ascii="Times New Roman" w:hAnsi="Times New Roman"/>
+          <w:b/>
+          <w:color w:val="1E293B"/>
+          <w:sz w:val="21"/>
+        </w:rPr>
+        <w:t xml:space="preserve">🎯 Mục tiêu đánh giá: </w:t>
+      </w:r>
+      <w:r>
+        <w:rPr>
+          <w:rFonts w:ascii="Times New Roman" w:hAnsi="Times New Roman"/>
+          <w:color w:val="334155"/>
+          <w:sz w:val="21"/>
+        </w:rPr>
+        <w:t>Trình bày kiến trúc phần mềm vi mô Client-Server xử lý luồng dữ liệu y tế thời gian thực (Ăn điểm Kỹ thuật hệ thống).</w:t>
       </w:r>
     </w:p>
     <w:p>
@@ -295,7 +1709,7 @@
           <w:color w:val="334155"/>
           <w:sz w:val="20"/>
         </w:rPr>
-        <w:t>Tên đề tài: HỆ THỐNG GIÁM SÁT ECG THỜI GIAN THỰC TÍCH HỢP XAI VÀ HỖ TRỢ CHẨN ĐOÁN RỐI LOẠN NHỊP TIM ĐA TẦNG (NEURO-ECG)</w:t>
+        <w:t>Mô hình Client-Server hướng dịch vụ vi mô (Micro-modular Architecture):</w:t>
       </w:r>
     </w:p>
     <w:p>
@@ -310,7 +1724,7 @@
           <w:color w:val="334155"/>
           <w:sz w:val="20"/>
         </w:rPr>
-        <w:t>Sinh viên: Nguyễn Đào Nam Hải (Trưởng nhóm) · Phan Thị Hải Yến</w:t>
+        <w:t>1. Tầng Ingestion: Tiếp nhận luồng tín hiệu 360Hz từ thiết bị/giả lập, đóng gói 36 gói tin/giây (10 mẫu/gói).</w:t>
       </w:r>
     </w:p>
     <w:p>
@@ -325,7 +1739,7 @@
           <w:color w:val="334155"/>
           <w:sz w:val="20"/>
         </w:rPr>
-        <w:t>Đơn vị: Samsung Innovation Campus (SIC) 2026 — Đại học Bách Khoa Hà Nội</w:t>
+        <w:t>2. Tầng Tiền xử lý DSP: Bộ lọc thông dải 0.5-45Hz, Notch 50Hz, thuật toán Pan-Tompkins tách đỉnh R.</w:t>
       </w:r>
     </w:p>
     <w:p>
@@ -340,7 +1754,37 @@
           <w:color w:val="334155"/>
           <w:sz w:val="20"/>
         </w:rPr>
-        <w:t>Kho lưu trữ GitHub: https://github.com/NamHaiIT2HUST/ECG-Arrhythmia-Detection</w:t>
+        <w:t>3. Tầng Suy luận AI (Singleton): Cắt cửa sổ 187 mẫu, đưa qua ResNet-1D / ONNX trả về nhãn, độ tin cậy và Grad-CAM.</w:t>
+      </w:r>
+    </w:p>
+    <w:p>
+      <w:pPr>
+        <w:pStyle w:val="ListBullet"/>
+        <w:spacing w:line="288" w:lineRule="auto" w:before="0" w:after="40"/>
+        <w:jc w:val="both"/>
+      </w:pPr>
+      <w:r>
+        <w:rPr>
+          <w:rFonts w:ascii="Times New Roman" w:hAnsi="Times New Roman"/>
+          <w:color w:val="334155"/>
+          <w:sz w:val="20"/>
+        </w:rPr>
+        <w:t>4. Tầng Điều phối Cảnh báo: Phân loại mức độ nguy cấp (Xanh - Vàng - Đỏ) và đẩy qua WebSocket.</w:t>
+      </w:r>
+    </w:p>
+    <w:p>
+      <w:pPr>
+        <w:pStyle w:val="ListBullet"/>
+        <w:spacing w:line="288" w:lineRule="auto" w:before="0" w:after="40"/>
+        <w:jc w:val="both"/>
+      </w:pPr>
+      <w:r>
+        <w:rPr>
+          <w:rFonts w:ascii="Times New Roman" w:hAnsi="Times New Roman"/>
+          <w:color w:val="334155"/>
+          <w:sz w:val="20"/>
+        </w:rPr>
+        <w:t>5. Tầng Ứng dụng &amp; Bác sĩ: React 19 hiển thị 60 FPS, kích hoạt chuông báo và lưu vào hàng đợi thẩm định.</w:t>
       </w:r>
     </w:p>
     <w:p>
@@ -355,7 +1799,7 @@
           <w:color w:val="1E293B"/>
           <w:sz w:val="21"/>
         </w:rPr>
-        <w:t xml:space="preserve">🎨 Hình vẽ / Sơ đồ / Chèn ảnh: </w:t>
+        <w:t xml:space="preserve">🎨 Hình vẽ / Biểu đồ chèn: </w:t>
       </w:r>
       <w:r>
         <w:rPr>
@@ -363,7 +1807,7 @@
           <w:color w:val="334155"/>
           <w:sz w:val="21"/>
         </w:rPr>
-        <w:t>Đặt Logo Bách Khoa và Logo Samsung 2 góc trên; hình nền phẳng tối giản có đường sóng điện tim mờ chạy ngang dưới chân trang.</w:t>
+        <w:t>Sơ đồ kiến trúc phân tầng (5-layer Data Pipeline Architecture) vẽ bằng các khối phẳng chuyên nghiệp từ Ingestion -&gt; DSP -&gt; Inference -&gt; Alert -&gt; Web Client.</w:t>
       </w:r>
     </w:p>
     <w:p>
@@ -386,7 +1830,7 @@
           <w:color w:val="334155"/>
           <w:sz w:val="21"/>
         </w:rPr>
-        <w:t>"Kính thưa các Thầy trong Hội đồng Giảng viên SIC và HUST, hôm nay nhóm chúng em xin phép trình bày đồ án tốt nghiệp Capstone Project: Hệ thống giám sát ECG thời gian thực tích hợp Explainable AI..."</w:t>
+        <w:t>"Hệ thống hoạt động theo đường ống xử lý liên hoàn, toàn bộ quá trình từ lúc mẫu tín hiệu phát ra đến khi kết quả suy luận hiển thị trên màn hình bác sĩ chỉ mất dưới 5 mili-giây..."</w:t>
       </w:r>
     </w:p>
     <w:p>
@@ -414,7 +1858,7 @@
           <w:color w:val="2563EB"/>
           <w:sz w:val="24"/>
         </w:rPr>
-        <w:t>SLIDE 2: BỐI CẢNH LÂM SÀNG &amp; RÀO CẢN ĐƯA AI VÀO Y TẾ</w:t>
+        <w:t>SLIDE 6: 2.2. DATA PROCESSING &amp; DSP PIPELINE (XỬ LÝ DỮ LIỆU &amp; KHẮC PHỤC DATA LEAKAGE)</w:t>
       </w:r>
     </w:p>
     <w:p>
@@ -429,7 +1873,7 @@
           <w:color w:val="1E293B"/>
           <w:sz w:val="21"/>
         </w:rPr>
-        <w:t xml:space="preserve">🎯 Mục tiêu cần làm: </w:t>
+        <w:t xml:space="preserve">🏷️ Khung Template SIC: </w:t>
       </w:r>
       <w:r>
         <w:rPr>
@@ -437,7 +1881,30 @@
           <w:color w:val="334155"/>
           <w:sz w:val="21"/>
         </w:rPr>
-        <w:t>Thuyết phục Hội đồng về tính cấp thiết thực tế và 2 rào cản lớn của AI trong y khoa.</w:t>
+        <w:t>Template Unit 2.2: Data Processing &amp; DSP Pipeline</w:t>
+      </w:r>
+    </w:p>
+    <w:p>
+      <w:pPr>
+        <w:spacing w:line="300" w:lineRule="auto" w:before="0" w:after="60"/>
+        <w:jc w:val="both"/>
+      </w:pPr>
+      <w:r>
+        <w:rPr>
+          <w:rFonts w:ascii="Times New Roman" w:hAnsi="Times New Roman"/>
+          <w:b/>
+          <w:color w:val="1E293B"/>
+          <w:sz w:val="21"/>
+        </w:rPr>
+        <w:t xml:space="preserve">🎯 Mục tiêu đánh giá: </w:t>
+      </w:r>
+      <w:r>
+        <w:rPr>
+          <w:rFonts w:ascii="Times New Roman" w:hAnsi="Times New Roman"/>
+          <w:color w:val="334155"/>
+          <w:sz w:val="21"/>
+        </w:rPr>
+        <w:t>Làm nổi bật năng lực DSP và bài học học thuật về việc sửa lỗi rò rỉ dữ liệu khi kết hợp SMOTE với Validation Split.</w:t>
       </w:r>
     </w:p>
     <w:p>
@@ -466,7 +1933,7 @@
           <w:color w:val="334155"/>
           <w:sz w:val="20"/>
         </w:rPr>
-        <w:t>Thực trạng: Rối loạn nhịp tim (Arrhythmia) như Ngoại tâm thu thất (PVC) và Rung nhĩ (AFib) là nguyên nhân hàng đầu gây đột tử tim mạch và đột quỵ.</w:t>
+        <w:t>Chuỗi tiền xử lý DSP y sinh:</w:t>
       </w:r>
     </w:p>
     <w:p>
@@ -481,7 +1948,7 @@
           <w:color w:val="334155"/>
           <w:sz w:val="20"/>
         </w:rPr>
-        <w:t>Rào cản 1 (Hộp đen): Bác sĩ không thể tin tưởng một mô hình AI chỉ báo nhãn mà không giải thích được căn cứ bệnh học.</w:t>
+        <w:t>- Bộ lọc thông dải Butterworth bậc 4 (0.5–45Hz): Triệt tiêu nhiễu thở (&lt; 0.5Hz) và nhiễu cơ EMG (&gt; 40Hz).</w:t>
       </w:r>
     </w:p>
     <w:p>
@@ -496,7 +1963,67 @@
           <w:color w:val="334155"/>
           <w:sz w:val="20"/>
         </w:rPr>
-        <w:t>Rào cản 2 (Thiếu chuỗi tích hợp y sinh): Đa số nghiên cứu dừng lại ở file Colab/Notebook rời rạc, thiếu DSP lọc nhiễu, thiếu WebSocket streaming 360Hz độ trễ thấp, và thiếu cơ chế Human-in-the-loop lưu vết kiểm toán pháp lý y tế.</w:t>
+        <w:t>- Bộ lọc chắn dải Notch 50Hz (Q=30): Triệt tiêu can nhiễu điện lưới xoay chiều.</w:t>
+      </w:r>
+    </w:p>
+    <w:p>
+      <w:pPr>
+        <w:pStyle w:val="ListBullet"/>
+        <w:spacing w:line="288" w:lineRule="auto" w:before="0" w:after="40"/>
+        <w:jc w:val="both"/>
+      </w:pPr>
+      <w:r>
+        <w:rPr>
+          <w:rFonts w:ascii="Times New Roman" w:hAnsi="Times New Roman"/>
+          <w:color w:val="334155"/>
+          <w:sz w:val="20"/>
+        </w:rPr>
+        <w:t>- Pan-Tompkins QRS Detection: Vi phân -&gt; Bình phương -&gt; Tích phân cửa sổ động -&gt; Ngưỡng thích ứng kép.</w:t>
+      </w:r>
+    </w:p>
+    <w:p>
+      <w:pPr>
+        <w:pStyle w:val="ListBullet"/>
+        <w:spacing w:line="288" w:lineRule="auto" w:before="0" w:after="40"/>
+        <w:jc w:val="both"/>
+      </w:pPr>
+      <w:r>
+        <w:rPr>
+          <w:rFonts w:ascii="Times New Roman" w:hAnsi="Times New Roman"/>
+          <w:color w:val="334155"/>
+          <w:sz w:val="20"/>
+        </w:rPr>
+        <w:t>Xử lý mất cân bằng &amp; Sửa lỗi Rò rỉ dữ liệu (Data Leakage):</w:t>
+      </w:r>
+    </w:p>
+    <w:p>
+      <w:pPr>
+        <w:pStyle w:val="ListBullet"/>
+        <w:spacing w:line="288" w:lineRule="auto" w:before="0" w:after="40"/>
+        <w:jc w:val="both"/>
+      </w:pPr>
+      <w:r>
+        <w:rPr>
+          <w:rFonts w:ascii="Times New Roman" w:hAnsi="Times New Roman"/>
+          <w:color w:val="334155"/>
+          <w:sz w:val="20"/>
+        </w:rPr>
+        <w:t>- Lớp N chiếm 82.8%, Lớp F chỉ 0.73% -&gt; Dùng SMOTE (k=5) cân bằng tập Train lên 326k mẫu.</w:t>
+      </w:r>
+    </w:p>
+    <w:p>
+      <w:pPr>
+        <w:pStyle w:val="ListBullet"/>
+        <w:spacing w:line="288" w:lineRule="auto" w:before="0" w:after="40"/>
+        <w:jc w:val="both"/>
+      </w:pPr>
+      <w:r>
+        <w:rPr>
+          <w:rFonts w:ascii="Times New Roman" w:hAnsi="Times New Roman"/>
+          <w:color w:val="334155"/>
+          <w:sz w:val="20"/>
+        </w:rPr>
+        <w:t>- Phát hiện &amp; Sửa lỗi: Tách Stratified Validation (10%) TRƯỚC KHI SMOTE -&gt; Val (98.62%) ≈ Test (98.51%), lệch chỉ 0.11%, chứng minh mô hình không overfit.</w:t>
       </w:r>
     </w:p>
     <w:p>
@@ -511,7 +2038,7 @@
           <w:color w:val="1E293B"/>
           <w:sz w:val="21"/>
         </w:rPr>
-        <w:t xml:space="preserve">🎨 Hình vẽ / Sơ đồ / Chèn ảnh: </w:t>
+        <w:t xml:space="preserve">🎨 Hình vẽ / Biểu đồ chèn: </w:t>
       </w:r>
       <w:r>
         <w:rPr>
@@ -519,7 +2046,7 @@
           <w:color w:val="334155"/>
           <w:sz w:val="21"/>
         </w:rPr>
-        <w:t>Sơ đồ đối sánh 2 cột: Bên trái là 'AI Hộp đen thông thường -&gt; Bác sĩ hoài nghi -&gt; Không dùng được' đối xứng với bên phải 'Explainable AI + Human-in-the-loop -&gt; Bác sĩ đồng thuận &amp; Ra quyết định'.</w:t>
+        <w:t>Chèn ảnh figures/01_ecg_class_waveforms.png (Hình thái 5 lớp sóng) và sơ đồ quy trình DSP 4 bước.</w:t>
       </w:r>
     </w:p>
     <w:p>
@@ -542,7 +2069,7 @@
           <w:color w:val="334155"/>
           <w:sz w:val="21"/>
         </w:rPr>
-        <w:t>"Nhiều mô hình đạt trên 98% nhưng bác sĩ lâm sàng không dám dùng vì không ai chịu trách nhiệm khi AI sai. Mục tiêu của chúng em là phá vỡ chiếc hộp đen này bằng Explainable AI..."</w:t>
+        <w:t>"Bước DSP là bắt buộc để chuẩn hóa tín hiệu thực tế. Đặc biệt, việc phát hiện và sửa triệt để lỗi rò rỉ dữ liệu trước SMOTE là minh chứng cho tinh thần nghiên cứu nghiêm túc của nhóm..."</w:t>
       </w:r>
     </w:p>
     <w:p>
@@ -570,7 +2097,7 @@
           <w:color w:val="2563EB"/>
           <w:sz w:val="24"/>
         </w:rPr>
-        <w:t>SLIDE 3: MỤC TIÊU ĐỀ TÀI &amp; KIẾN TRÚC SẢN PHẨM NEURO-ECG</w:t>
+        <w:t>SLIDE 7: 2.3. AI CORE: BENCHMARK 5 ARCHITECTURES &amp; RESNET-1D (SO SÁNH 5 KIẾN TRÚC AI)</w:t>
       </w:r>
     </w:p>
     <w:p>
@@ -585,7 +2112,7 @@
           <w:color w:val="1E293B"/>
           <w:sz w:val="21"/>
         </w:rPr>
-        <w:t xml:space="preserve">🎯 Mục tiêu cần làm: </w:t>
+        <w:t xml:space="preserve">🏷️ Khung Template SIC: </w:t>
       </w:r>
       <w:r>
         <w:rPr>
@@ -593,7 +2120,30 @@
           <w:color w:val="334155"/>
           <w:sz w:val="21"/>
         </w:rPr>
-        <w:t>Tóm lược toàn bộ giải pháp sản phẩm trong một góc nhìn hệ thống tổng thể.</w:t>
+        <w:t>Template Unit 2.3: Service / AI Implementation</w:t>
+      </w:r>
+    </w:p>
+    <w:p>
+      <w:pPr>
+        <w:spacing w:line="300" w:lineRule="auto" w:before="0" w:after="60"/>
+        <w:jc w:val="both"/>
+      </w:pPr>
+      <w:r>
+        <w:rPr>
+          <w:rFonts w:ascii="Times New Roman" w:hAnsi="Times New Roman"/>
+          <w:b/>
+          <w:color w:val="1E293B"/>
+          <w:sz w:val="21"/>
+        </w:rPr>
+        <w:t xml:space="preserve">🎯 Mục tiêu đánh giá: </w:t>
+      </w:r>
+      <w:r>
+        <w:rPr>
+          <w:rFonts w:ascii="Times New Roman" w:hAnsi="Times New Roman"/>
+          <w:color w:val="334155"/>
+          <w:sz w:val="21"/>
+        </w:rPr>
+        <w:t>Trình bày nghiên cứu thực nghiệm đối sánh 5 mô hình và chứng minh cơ sở khoa học chọn ResNet-1D.</w:t>
       </w:r>
     </w:p>
     <w:p>
@@ -622,7 +2172,7 @@
           <w:color w:val="334155"/>
           <w:sz w:val="20"/>
         </w:rPr>
-        <w:t>5 trụ cột cốt lõi của NEURO-ECG:</w:t>
+        <w:t>Nghiên cứu và tự cài đặt độc lập 5 kiến trúc Deep Learning 1D: ResNet1D, CNN1D-LSTM, TCN, Transformer1D, Mamba1D.</w:t>
       </w:r>
     </w:p>
     <w:p>
@@ -637,7 +2187,7 @@
           <w:color w:val="334155"/>
           <w:sz w:val="20"/>
         </w:rPr>
-        <w:t>1. AI Core: Benchmark 5 kiến trúc, chọn ResNet-1D (Accuracy 98.57%, Macro-F1 91.70%, Latency 0.13ms).</w:t>
+        <w:t>Kết quả đối sánh toàn diện:</w:t>
       </w:r>
     </w:p>
     <w:p>
@@ -652,7 +2202,7 @@
           <w:color w:val="334155"/>
           <w:sz w:val="20"/>
         </w:rPr>
-        <w:t>2. Explainable AI: 1D Grad-CAM trích xuất bản đồ nhiệt phân bổ trọng số chú ý tại sóng P, QRS, T.</w:t>
+        <w:t>- ResNet-1D: Accuracy 98.43% - 98.57%, Macro-F1 91.70%, Latency 0.133 ms, Params 692k. (TOÀN DIỆN NHẤT ⭐)</w:t>
       </w:r>
     </w:p>
     <w:p>
@@ -667,7 +2217,7 @@
           <w:color w:val="334155"/>
           <w:sz w:val="20"/>
         </w:rPr>
-        <w:t>3. Y sinh &amp; DSP: Bộ lọc Butterworth + Notch 50Hz, Pan-Tompkins QRS F1=97.14%, Sàng lọc AFib.</w:t>
+        <w:t>- CNN1D-LSTM: Accuracy 97.27%, Macro-F1 85.79%, Latency 0.122 ms, Params 242k.</w:t>
       </w:r>
     </w:p>
     <w:p>
@@ -682,7 +2232,7 @@
           <w:color w:val="334155"/>
           <w:sz w:val="20"/>
         </w:rPr>
-        <w:t>4. Edge AI: Lượng tử hóa ONNX INT8 nén còn 697.3 KB (&lt; 700 KB), ONNX FP32 chạy nhanh gấp 4 lần.</w:t>
+        <w:t>- TCN: Accuracy 96.17%, Macro-F1 82.81%, Latency 0.601 ms, Params 171k.</w:t>
       </w:r>
     </w:p>
     <w:p>
@@ -697,7 +2247,37 @@
           <w:color w:val="334155"/>
           <w:sz w:val="20"/>
         </w:rPr>
-        <w:t>5. Full-Stack Y tế: Streaming 360Hz 2 kênh, SQLite/RBAC 3 vai trò, Human-in-the-loop Audit Trail, xuất PDF/CSV.</w:t>
+        <w:t>- Transformer-1D: Accuracy 95.36%, Macro-F1 83.11%, Latency 0.592 ms, Params 69k.</w:t>
+      </w:r>
+    </w:p>
+    <w:p>
+      <w:pPr>
+        <w:pStyle w:val="ListBullet"/>
+        <w:spacing w:line="288" w:lineRule="auto" w:before="0" w:after="40"/>
+        <w:jc w:val="both"/>
+      </w:pPr>
+      <w:r>
+        <w:rPr>
+          <w:rFonts w:ascii="Times New Roman" w:hAnsi="Times New Roman"/>
+          <w:color w:val="334155"/>
+          <w:sz w:val="20"/>
+        </w:rPr>
+        <w:t>- Mamba-1D: Accuracy 94.45%, Macro-F1 79.28%, Latency 0.490 ms, Params 59k.</w:t>
+      </w:r>
+    </w:p>
+    <w:p>
+      <w:pPr>
+        <w:pStyle w:val="ListBullet"/>
+        <w:spacing w:line="288" w:lineRule="auto" w:before="0" w:after="40"/>
+        <w:jc w:val="both"/>
+      </w:pPr>
+      <w:r>
+        <w:rPr>
+          <w:rFonts w:ascii="Times New Roman" w:hAnsi="Times New Roman"/>
+          <w:color w:val="334155"/>
+          <w:sz w:val="20"/>
+        </w:rPr>
+        <w:t>Kiến trúc ResNet-1D triển khai: Stem Conv1D -&gt; 3 khối Residual Blocks (kênh 32-&gt;64-&gt;128-&gt;256) với liên kết tắt -&gt; GAP -&gt; Linear 5.</w:t>
       </w:r>
     </w:p>
     <w:p>
@@ -712,7 +2292,7 @@
           <w:color w:val="1E293B"/>
           <w:sz w:val="21"/>
         </w:rPr>
-        <w:t xml:space="preserve">🎨 Hình vẽ / Sơ đồ / Chèn ảnh: </w:t>
+        <w:t xml:space="preserve">🎨 Hình vẽ / Biểu đồ chèn: </w:t>
       </w:r>
       <w:r>
         <w:rPr>
@@ -720,7 +2300,7 @@
           <w:color w:val="334155"/>
           <w:sz w:val="21"/>
         </w:rPr>
-        <w:t>Vẽ 5 khối bo tròn kết nối nhau theo chuỗi mắt xích khép kín: [DSP 360Hz] -&gt; [ResNet-1D / ONNX] -&gt; [1D Grad-CAM] -&gt; [FastAPI WebSocket] -&gt; [React 19 &amp; Doctor Review].</w:t>
+        <w:t>Chèn ảnh figures/03_model_benchmark_comparison.png (Biểu đồ so sánh 5 model) kèm bảng thông số tóm tắt.</w:t>
       </w:r>
     </w:p>
     <w:p>
@@ -743,7 +2323,7 @@
           <w:color w:val="334155"/>
           <w:sz w:val="21"/>
         </w:rPr>
-        <w:t>"NEURO-ECG không chỉ là một thuật toán học máy, mà là một hệ thống y tế toàn diện khép kín từ cảm biến, xử lý tín hiệu số, trí tuệ nhân tạo đến giao diện phòng hồi sức cấp cứu..."</w:t>
+        <w:t>"Chúng em không chỉ chọn đại một mô hình mà đã benchmark công bằng cả 5 kiến trúc hiện đại nhất. ResNet-1D đạt F1 cao nhất 91.7% đồng thời có độ trễ suy luận chỉ 0.13ms, lý tưởng cho thời gian thực..."</w:t>
       </w:r>
     </w:p>
     <w:p>
@@ -771,7 +2351,7 @@
           <w:color w:val="2563EB"/>
           <w:sz w:val="24"/>
         </w:rPr>
-        <w:t>SLIDE 4: DỮ LIỆU NGHIÊN CỨU &amp; KHẮC PHỤC LỖI RÒ RỈ DỮ LIỆU (DATA LEAKAGE)</w:t>
+        <w:t>SLIDE 8: 2.4. EXPLAINABLE AI (1D GRAD-CAM) &amp; AFIB SCREENING (GIẢI THÍCH MÔ HÌNH &amp; SÀNG LỌC AFIB)</w:t>
       </w:r>
     </w:p>
     <w:p>
@@ -786,7 +2366,7 @@
           <w:color w:val="1E293B"/>
           <w:sz w:val="21"/>
         </w:rPr>
-        <w:t xml:space="preserve">🎯 Mục tiêu cần làm: </w:t>
+        <w:t xml:space="preserve">🏷️ Khung Template SIC: </w:t>
       </w:r>
       <w:r>
         <w:rPr>
@@ -794,7 +2374,30 @@
           <w:color w:val="334155"/>
           <w:sz w:val="21"/>
         </w:rPr>
-        <w:t>Làm rõ nguồn dữ liệu và bài học học thuật sâu sắc về Data Leakage (điểm cộng học thuật rất lớn).</w:t>
+        <w:t>Template Unit 2.3: AI Implementation (XAI Innovation)</w:t>
+      </w:r>
+    </w:p>
+    <w:p>
+      <w:pPr>
+        <w:spacing w:line="300" w:lineRule="auto" w:before="0" w:after="60"/>
+        <w:jc w:val="both"/>
+      </w:pPr>
+      <w:r>
+        <w:rPr>
+          <w:rFonts w:ascii="Times New Roman" w:hAnsi="Times New Roman"/>
+          <w:b/>
+          <w:color w:val="1E293B"/>
+          <w:sz w:val="21"/>
+        </w:rPr>
+        <w:t xml:space="preserve">🎯 Mục tiêu đánh giá: </w:t>
+      </w:r>
+      <w:r>
+        <w:rPr>
+          <w:rFonts w:ascii="Times New Roman" w:hAnsi="Times New Roman"/>
+          <w:color w:val="334155"/>
+          <w:sz w:val="21"/>
+        </w:rPr>
+        <w:t>Làm nổi bật tính năng Explainable AI — điểm sáng tạo then chốt giải quyết rào cản 'hộp đen' y khoa (Ăn 25% điểm Sáng tạo).</w:t>
       </w:r>
     </w:p>
     <w:p>
@@ -823,7 +2426,7 @@
           <w:color w:val="334155"/>
           <w:sz w:val="20"/>
         </w:rPr>
-        <w:t>2 nguồn dữ liệu: Kaggle MIT-BIH (109k nhịp, 125Hz) để huấn luyện &amp; benchmark; Raw PhysioNet MIT-BIH (48 bản ghi, 360Hz 2 kênh) để chạy streaming và kiểm định end-to-end.</w:t>
+        <w:t>Thuật toán 1D Grad-CAM: Trích xuất trọng số chú ý alpha_k^c từ đạo hàm của điểm số phân loại đối với bản đồ đặc trưng tầng Conv cuối cùng -&gt; Chiếu bản đồ nhiệt Jet/Viridis trực tiếp lên sóng ECG.</w:t>
       </w:r>
     </w:p>
     <w:p>
@@ -838,7 +2441,7 @@
           <w:color w:val="334155"/>
           <w:sz w:val="20"/>
         </w:rPr>
-        <w:t>Mất cân bằng dữ liệu cực đoan: Lớp N chiếm 82.8%, Lớp F chỉ 0.73% -&gt; Dùng SMOTE (k=5) cân bằng tập Train lên 326k mẫu.</w:t>
+        <w:t>Tương quan hoàn hảo với tri thức bệnh học lâm sàng:</w:t>
       </w:r>
     </w:p>
     <w:p>
@@ -853,7 +2456,52 @@
           <w:color w:val="334155"/>
           <w:sz w:val="20"/>
         </w:rPr>
-        <w:t>Bài học kỹ thuật về Data Leakage: Tách Validation sau SMOTE khiến Val Accuracy đạt 99.78% (ảo). Nhóm đã sửa triệt để: tách Stratified Validation (10%) TRƯỚC KHI chạy SMOTE -&gt; Val (98.62%) ≈ Test (98.51%), lệch 0.11%, chứng minh mô hình không overfit.</w:t>
+        <w:t>- Ngoại tâm thu thất (PVC - Lớp V): Vùng chú ý tập trung &gt; 85% năng lượng vào phức bộ QRS giãn rộng (&gt; 120ms) và sóng T đảo chiều.</w:t>
+      </w:r>
+    </w:p>
+    <w:p>
+      <w:pPr>
+        <w:pStyle w:val="ListBullet"/>
+        <w:spacing w:line="288" w:lineRule="auto" w:before="0" w:after="40"/>
+        <w:jc w:val="both"/>
+      </w:pPr>
+      <w:r>
+        <w:rPr>
+          <w:rFonts w:ascii="Times New Roman" w:hAnsi="Times New Roman"/>
+          <w:color w:val="334155"/>
+          <w:sz w:val="20"/>
+        </w:rPr>
+        <w:t>- Ngoại tâm thu nhĩ (PAC - Lớp S): Trọng số kích hoạt mạnh tại sóng P đến sớm bất thường.</w:t>
+      </w:r>
+    </w:p>
+    <w:p>
+      <w:pPr>
+        <w:pStyle w:val="ListBullet"/>
+        <w:spacing w:line="288" w:lineRule="auto" w:before="0" w:after="40"/>
+        <w:jc w:val="both"/>
+      </w:pPr>
+      <w:r>
+        <w:rPr>
+          <w:rFonts w:ascii="Times New Roman" w:hAnsi="Times New Roman"/>
+          <w:color w:val="334155"/>
+          <w:sz w:val="20"/>
+        </w:rPr>
+        <w:t>- Nhịp hợp nhất (Fusion - Lớp F): Bản đồ nhiệt phân bổ lưỡng cực tại cả sườn QRS và đoạn ST.</w:t>
+      </w:r>
+    </w:p>
+    <w:p>
+      <w:pPr>
+        <w:pStyle w:val="ListBullet"/>
+        <w:spacing w:line="288" w:lineRule="auto" w:before="0" w:after="40"/>
+        <w:jc w:val="both"/>
+      </w:pPr>
+      <w:r>
+        <w:rPr>
+          <w:rFonts w:ascii="Times New Roman" w:hAnsi="Times New Roman"/>
+          <w:color w:val="334155"/>
+          <w:sz w:val="20"/>
+        </w:rPr>
+        <w:t>Module sàng lọc Rung nhĩ (AFib Screener): Phân tích rối loạn nhịp điệu kéo dài qua Shannon Entropy của dRR, hệ số biến thiên CV_RR và pNN50; kích hoạt khi vượt ngưỡng 0.62.</w:t>
       </w:r>
     </w:p>
     <w:p>
@@ -868,7 +2516,7 @@
           <w:color w:val="1E293B"/>
           <w:sz w:val="21"/>
         </w:rPr>
-        <w:t xml:space="preserve">🎨 Hình vẽ / Sơ đồ / Chèn ảnh: </w:t>
+        <w:t xml:space="preserve">🎨 Hình vẽ / Biểu đồ chèn: </w:t>
       </w:r>
       <w:r>
         <w:rPr>
@@ -876,7 +2524,7 @@
           <w:color w:val="334155"/>
           <w:sz w:val="21"/>
         </w:rPr>
-        <w:t>Chèn ảnh figures/01_ecg_class_waveforms.png (Hình thái 5 lớp sóng AAMI) hoặc figures/02_class_distribution_imbalance.png (Biểu đồ mất cân bằng dữ liệu gốc vs sau SMOTE).</w:t>
+        <w:t>Chèn ảnh figures/06_gradcam_heatmaps_5_classes.png (Bản đồ nhiệt 5 lớp sóng) và figures/07_gradcam_vs_saliency_comparison.png.</w:t>
       </w:r>
     </w:p>
     <w:p>
@@ -899,7 +2547,7 @@
           <w:color w:val="334155"/>
           <w:sz w:val="21"/>
         </w:rPr>
-        <w:t>"Phát hiện quan trọng của nhóm trong quá trình nghiên cứu là khắc phục lỗi rò rỉ dữ liệu khi kết hợp SMOTE với Validation split. Khi sửa đúng, Val và Test lệch nhau chỉ 0.11%, khẳng định tính tổng quát hóa thực chất..."</w:t>
+        <w:t>"Với 1D Grad-CAM, khi mô hình báo có nhịp ngoại tâm thu thất, bác sĩ nhìn thấy ngay vùng nhiệt đỏ rực tại phức bộ QRS giãn rộng. Điều này giúp bác sĩ hoàn toàn tin tưởng vào quyết định của AI..."</w:t>
       </w:r>
     </w:p>
     <w:p>
@@ -927,7 +2575,7 @@
           <w:color w:val="2563EB"/>
           <w:sz w:val="24"/>
         </w:rPr>
-        <w:t>SLIDE 5: CHUỖI TIỀN XỬ LÝ TÍN HIỆU SỐ Y SINH (DSP) &amp; THUẬT TOÁN PAN-TOMPKINS</w:t>
+        <w:t>SLIDE 9: 2.5. EDGE AI OPTIMIZATION (LƯỢNG TỬ HÓA ONNX INT8 &amp; TRIỂN KHAI NHÚNG)</w:t>
       </w:r>
     </w:p>
     <w:p>
@@ -942,7 +2590,7 @@
           <w:color w:val="1E293B"/>
           <w:sz w:val="21"/>
         </w:rPr>
-        <w:t xml:space="preserve">🎯 Mục tiêu cần làm: </w:t>
+        <w:t xml:space="preserve">🏷️ Khung Template SIC: </w:t>
       </w:r>
       <w:r>
         <w:rPr>
@@ -950,7 +2598,30 @@
           <w:color w:val="334155"/>
           <w:sz w:val="21"/>
         </w:rPr>
-        <w:t>Chứng minh năng lực xử lý tín hiệu y sinh thực thụ trước khi đưa vào mô hình AI.</w:t>
+        <w:t>Template Unit 2.4: System Design &amp; Edge Deployment</w:t>
+      </w:r>
+    </w:p>
+    <w:p>
+      <w:pPr>
+        <w:spacing w:line="300" w:lineRule="auto" w:before="0" w:after="60"/>
+        <w:jc w:val="both"/>
+      </w:pPr>
+      <w:r>
+        <w:rPr>
+          <w:rFonts w:ascii="Times New Roman" w:hAnsi="Times New Roman"/>
+          <w:b/>
+          <w:color w:val="1E293B"/>
+          <w:sz w:val="21"/>
+        </w:rPr>
+        <w:t xml:space="preserve">🎯 Mục tiêu đánh giá: </w:t>
+      </w:r>
+      <w:r>
+        <w:rPr>
+          <w:rFonts w:ascii="Times New Roman" w:hAnsi="Times New Roman"/>
+          <w:color w:val="334155"/>
+          <w:sz w:val="21"/>
+        </w:rPr>
+        <w:t>Chứng minh năng lực tối ưu hóa mô hình AI sẵn sàng triển khai trên thiết bị đeo IoT / Wearable Holter di động.</w:t>
       </w:r>
     </w:p>
     <w:p>
@@ -979,7 +2650,7 @@
           <w:color w:val="334155"/>
           <w:sz w:val="20"/>
         </w:rPr>
-        <w:t>Lọc thông dải Butterworth bậc 4 (0.5–45Hz): Triệt tiêu nhiễu thở (&lt; 0.5Hz) và nhiễu cơ EMG (&gt; 40Hz).</w:t>
+        <w:t>Lượng tử hóa mô hình sang định dạng ONNX INT8:</w:t>
       </w:r>
     </w:p>
     <w:p>
@@ -994,7 +2665,7 @@
           <w:color w:val="334155"/>
           <w:sz w:val="20"/>
         </w:rPr>
-        <w:t>Lọc chắn dải Notch 50Hz (Q=30): Triệt tiêu can nhiễu điện lưới xoay chiều sinh hoạt.</w:t>
+        <w:t>- Nén dung lượng: Giảm từ 2,735.5 KB (PyTorch) xuống 697.3 KB (ONNX INT8) -&gt; Giảm 74.5% dung lượng, hoàn thành mục tiêu thiết kế &lt; 700 KB.</w:t>
       </w:r>
     </w:p>
     <w:p>
@@ -1009,7 +2680,7 @@
           <w:color w:val="334155"/>
           <w:sz w:val="20"/>
         </w:rPr>
-        <w:t>Thuật toán Pan-Tompkins QRS Detection: Vi phân bậc 1 -&gt; Bình phương -&gt; Tích phân cửa sổ động 150ms -&gt; Ngưỡng biên độ kép thích nghi động.</w:t>
+        <w:t>- Bảo toàn độ chính xác: Độ chính xác end-to-end chỉ rớt 0.67 điểm % (94.33% -&gt; 93.66%, hoàn toàn nằm trong ngưỡng an toàn 2.0%).</w:t>
       </w:r>
     </w:p>
     <w:p>
@@ -1024,7 +2695,22 @@
           <w:color w:val="334155"/>
           <w:sz w:val="20"/>
         </w:rPr>
-        <w:t>Kết quả kiểm chứng: F1 trung bình đạt 97.14% trên 8 bản ghi tiêu biểu (20,546 nhịp tim thô). Record 100: 99.98%, Record 200: 99.56%, Record 207: 89.70%.</w:t>
+        <w:t>- Tăng tốc suy luận: Phiên bản ONNX FP32 đạt độ trễ 0.2918 ms/nhịp (tăng tốc gần 4 lần so với PyTorch gốc 1.14ms).</w:t>
+      </w:r>
+    </w:p>
+    <w:p>
+      <w:pPr>
+        <w:pStyle w:val="ListBullet"/>
+        <w:spacing w:line="288" w:lineRule="auto" w:before="0" w:after="40"/>
+        <w:jc w:val="both"/>
+      </w:pPr>
+      <w:r>
+        <w:rPr>
+          <w:rFonts w:ascii="Times New Roman" w:hAnsi="Times New Roman"/>
+          <w:color w:val="334155"/>
+          <w:sz w:val="20"/>
+        </w:rPr>
+        <w:t>Khả năng ứng dụng Edge: Dung lượng dưới 700 KB cho phép nạp trực tiếp vào bộ nhớ flash của các vi điều khiển Edge AI (như Raspberry Pi 4, Jetson Nano, hoặc vi xử lý ARM hỗ trợ NEON dot-product).</w:t>
       </w:r>
     </w:p>
     <w:p>
@@ -1039,7 +2725,7 @@
           <w:color w:val="1E293B"/>
           <w:sz w:val="21"/>
         </w:rPr>
-        <w:t xml:space="preserve">🎨 Hình vẽ / Sơ đồ / Chèn ảnh: </w:t>
+        <w:t xml:space="preserve">🎨 Hình vẽ / Biểu đồ chèn: </w:t>
       </w:r>
       <w:r>
         <w:rPr>
@@ -1047,7 +2733,7 @@
           <w:color w:val="334155"/>
           <w:sz w:val="21"/>
         </w:rPr>
-        <w:t>Sơ đồ Pipeline 4 bước: [Tín hiệu thô 360Hz] -&gt; [Bandpass 0.5-45Hz] -&gt; [Notch 50Hz] -&gt; [Pan-Tompkins QRS] -&gt; [Cửa sổ 187 mẫu 125Hz] kèm bảng nhỏ kết quả F1 Pan-Tompkins.</w:t>
+        <w:t>Chèn ảnh figures/10_onnx_quantization_comparison.png (So sánh dung lượng, độ trễ và độ chính xác ONNX).</w:t>
       </w:r>
     </w:p>
     <w:p>
@@ -1070,7 +2756,7 @@
           <w:color w:val="334155"/>
           <w:sz w:val="21"/>
         </w:rPr>
-        <w:t>"Nếu không có bước DSP này, tín hiệu thô đưa thẳng vào AI sẽ bị tụt tỷ lệ nhận diện xuống chỉ còn 0.2%. Thuật toán Pan-Tompkins nhóm tự xây dựng đạt độ chính xác F1 97.14%..."</w:t>
+        <w:t>"Mục tiêu Edge AI của chúng em là đưa mô hình vào các thiết bị di động nhỏ gọn. Kết quả nén xuống 697 KB qua ONNX INT8 giúp thiết bị Holter có thể tự phân loại nhịp tim mà không cần kết nối mạng..."</w:t>
       </w:r>
     </w:p>
     <w:p>
@@ -1084,6 +2770,21 @@
           <w:sz w:val="18"/>
         </w:rPr>
         <w:t>―――――――――――――――――――――――――――――――――――――――――――――――――――――――</w:t>
+      </w:r>
+    </w:p>
+    <w:p>
+      <w:pPr>
+        <w:keepNext/>
+        <w:spacing w:before="320" w:after="120"/>
+      </w:pPr>
+      <w:r>
+        <w:rPr>
+          <w:rFonts w:ascii="Times New Roman" w:hAnsi="Times New Roman"/>
+          <w:b/>
+          <w:color w:val="1E3A8A"/>
+          <w:sz w:val="28"/>
+        </w:rPr>
+        <w:t>UNIT 3. RESULTS &amp; DEMONSTRATION (Kết Quả Thực Nghiệm, Tính Hoàn Chỉnh &amp; Live Demo)</w:t>
       </w:r>
     </w:p>
     <w:p>
@@ -1098,7 +2799,7 @@
           <w:color w:val="2563EB"/>
           <w:sz w:val="24"/>
         </w:rPr>
-        <w:t>SLIDE 6: BENCHMARK 5 KIẾN TRÚC DEEP LEARNING 1D &amp; MÔ HÌNH RESNET-1D</w:t>
+        <w:t>SLIDE 10: 3.1. EXPERIMENTAL RESULTS &amp; PAN-TOMPKINS VALIDATION (KẾT QUẢ THỰC NGHIỆM ĐỊNH LƯỢNG)</w:t>
       </w:r>
     </w:p>
     <w:p>
@@ -1113,7 +2814,7 @@
           <w:color w:val="1E293B"/>
           <w:sz w:val="21"/>
         </w:rPr>
-        <w:t xml:space="preserve">🎯 Mục tiêu cần làm: </w:t>
+        <w:t xml:space="preserve">🏷️ Khung Template SIC: </w:t>
       </w:r>
       <w:r>
         <w:rPr>
@@ -1121,7 +2822,30 @@
           <w:color w:val="334155"/>
           <w:sz w:val="21"/>
         </w:rPr>
-        <w:t>Trình bày nghiên cứu thực nghiệm đối sánh 5 kiến trúc và cơ sở khoa học chọn ResNet-1D.</w:t>
+        <w:t>Template Unit 3.1: Data Processing Results</w:t>
+      </w:r>
+    </w:p>
+    <w:p>
+      <w:pPr>
+        <w:spacing w:line="300" w:lineRule="auto" w:before="0" w:after="60"/>
+        <w:jc w:val="both"/>
+      </w:pPr>
+      <w:r>
+        <w:rPr>
+          <w:rFonts w:ascii="Times New Roman" w:hAnsi="Times New Roman"/>
+          <w:b/>
+          <w:color w:val="1E293B"/>
+          <w:sz w:val="21"/>
+        </w:rPr>
+        <w:t xml:space="preserve">🎯 Mục tiêu đánh giá: </w:t>
+      </w:r>
+      <w:r>
+        <w:rPr>
+          <w:rFonts w:ascii="Times New Roman" w:hAnsi="Times New Roman"/>
+          <w:color w:val="334155"/>
+          <w:sz w:val="21"/>
+        </w:rPr>
+        <w:t>Cung cấp bằng chứng thực nghiệm định lượng vững chắc trên dữ liệu chuẩn quốc tế (Chứng minh chất lượng kỹ thuật).</w:t>
       </w:r>
     </w:p>
     <w:p>
@@ -1150,7 +2874,7 @@
           <w:color w:val="334155"/>
           <w:sz w:val="20"/>
         </w:rPr>
-        <w:t>Benchmark 5 mô hình trên cùng tập dữ liệu: ResNet-1D, CNN1D-LSTM, TCN, Transformer-1D, Mamba-1D.</w:t>
+        <w:t>Kiểm chứng phân loại nhịp trên 21,892 nhịp test Kaggle MIT-BIH: Accuracy đạt 98.57%, Macro-F1 đạt 91.70%.</w:t>
       </w:r>
     </w:p>
     <w:p>
@@ -1165,7 +2889,7 @@
           <w:color w:val="334155"/>
           <w:sz w:val="20"/>
         </w:rPr>
-        <w:t>ResNet-1D chiến thắng toàn diện: Accuracy cao nhất (98.43% - 98.57%), Macro-F1 cao nhất (91.70%), Độ trễ suy luận thấp nhất (0.133 ms/nhịp, thông lượng 7,546 nhịp/giây).</w:t>
+        <w:t>- Lớp N: Precision 99.21%, Recall 99.19%, F1 99.20%.</w:t>
       </w:r>
     </w:p>
     <w:p>
@@ -1180,7 +2904,7 @@
           <w:color w:val="334155"/>
           <w:sz w:val="20"/>
         </w:rPr>
-        <w:t>Kiến trúc ResNet-1D: Stem Conv1D -&gt; 3 khối Residual Blocks (kênh 32-&gt;64-&gt;128-&gt;256) với kết nối tắt tránh tiêu biến đạo hàm -&gt; Global Average Pooling -&gt; Linear Classifier 5 lớp AAMI.</w:t>
+        <w:t>- Lớp V (PVC - Nguy hiểm nhất): Precision 95.02%, Recall 96.20%, F1 95.61%.</w:t>
       </w:r>
     </w:p>
     <w:p>
@@ -1195,7 +2919,67 @@
           <w:color w:val="334155"/>
           <w:sz w:val="20"/>
         </w:rPr>
-        <w:t>Chỉ số từng lớp: Lớp N (F1: 99.20%), Lớp V/PVC (Recall: 96.20%, F1: 95.61%), Lớp S (F1: 83.86%).</w:t>
+        <w:t>- Lớp S (PAC): Precision 86.59%, Recall 81.29%, F1 83.86%.</w:t>
+      </w:r>
+    </w:p>
+    <w:p>
+      <w:pPr>
+        <w:pStyle w:val="ListBullet"/>
+        <w:spacing w:line="288" w:lineRule="auto" w:before="0" w:after="40"/>
+        <w:jc w:val="both"/>
+      </w:pPr>
+      <w:r>
+        <w:rPr>
+          <w:rFonts w:ascii="Times New Roman" w:hAnsi="Times New Roman"/>
+          <w:color w:val="334155"/>
+          <w:sz w:val="20"/>
+        </w:rPr>
+        <w:t>Kiểm chứng phát hiện đỉnh R (Pan-Tompkins) trên 8 bản ghi thô PhysioNet (20,546 nhịp): F1 trung bình đạt 97.14%.</w:t>
+      </w:r>
+    </w:p>
+    <w:p>
+      <w:pPr>
+        <w:pStyle w:val="ListBullet"/>
+        <w:spacing w:line="288" w:lineRule="auto" w:before="0" w:after="40"/>
+        <w:jc w:val="both"/>
+      </w:pPr>
+      <w:r>
+        <w:rPr>
+          <w:rFonts w:ascii="Times New Roman" w:hAnsi="Times New Roman"/>
+          <w:color w:val="334155"/>
+          <w:sz w:val="20"/>
+        </w:rPr>
+        <w:t>- Bản ghi ít nhiễu (100, 234, 213): F1 đạt 99.98%.</w:t>
+      </w:r>
+    </w:p>
+    <w:p>
+      <w:pPr>
+        <w:pStyle w:val="ListBullet"/>
+        <w:spacing w:line="288" w:lineRule="auto" w:before="0" w:after="40"/>
+        <w:jc w:val="both"/>
+      </w:pPr>
+      <w:r>
+        <w:rPr>
+          <w:rFonts w:ascii="Times New Roman" w:hAnsi="Times New Roman"/>
+          <w:color w:val="334155"/>
+          <w:sz w:val="20"/>
+        </w:rPr>
+        <w:t>- Bản ghi nhiễu cơ/biến dạng nặng (200, 208, 203): F1 đạt 96.67% – 99.56%.</w:t>
+      </w:r>
+    </w:p>
+    <w:p>
+      <w:pPr>
+        <w:pStyle w:val="ListBullet"/>
+        <w:spacing w:line="288" w:lineRule="auto" w:before="0" w:after="40"/>
+        <w:jc w:val="both"/>
+      </w:pPr>
+      <w:r>
+        <w:rPr>
+          <w:rFonts w:ascii="Times New Roman" w:hAnsi="Times New Roman"/>
+          <w:color w:val="334155"/>
+          <w:sz w:val="20"/>
+        </w:rPr>
+        <w:t>Kiểm chứng End-to-End từ tín hiệu thô 360Hz: Accuracy đạt 94.11% – 96.62% so với nhãn chuyên gia bác sĩ.</w:t>
       </w:r>
     </w:p>
     <w:p>
@@ -1210,7 +2994,7 @@
           <w:color w:val="1E293B"/>
           <w:sz w:val="21"/>
         </w:rPr>
-        <w:t xml:space="preserve">🎨 Hình vẽ / Sơ đồ / Chèn ảnh: </w:t>
+        <w:t xml:space="preserve">🎨 Hình vẽ / Biểu đồ chèn: </w:t>
       </w:r>
       <w:r>
         <w:rPr>
@@ -1218,7 +3002,7 @@
           <w:color w:val="334155"/>
           <w:sz w:val="21"/>
         </w:rPr>
-        <w:t>Chèn ảnh figures/03_model_benchmark_comparison.png (So sánh 5 model) hoặc figures/04_resnet1d_confusion_matrix.png (Ma trận nhầm lẫn ResNet-1D).</w:t>
+        <w:t>Chèn ảnh figures/04_resnet1d_confusion_matrix.png (Ma trận nhầm lẫn) kèm bảng tóm tắt kết quả F1 Pan-Tompkins 8 bản ghi.</w:t>
       </w:r>
     </w:p>
     <w:p>
@@ -1241,7 +3025,7 @@
           <w:color w:val="334155"/>
           <w:sz w:val="21"/>
         </w:rPr>
-        <w:t>"Thay vì dùng một kiến trúc có sẵn, nhóm đã tự cài đặt và benchmark cả 5 kiến trúc hiện đại nhất hiện nay. ResNet-1D là lựa chọn hoàn hảo nhất cho hệ thống thời gian thực nhờ độ trễ chỉ 0.13ms..."</w:t>
+        <w:t>"Mô hình đạt độ nhạy trên 96% ở lớp ngoại tâm thu thất — nhóm nhịp nguy hiểm nhất. Thuật toán Pan-Tompkins tự cài đặt cũng đạt F1 97.14% trên hơn 20 nghìn nhịp tim thực..."</w:t>
       </w:r>
     </w:p>
     <w:p>
@@ -1269,7 +3053,7 @@
           <w:color w:val="2563EB"/>
           <w:sz w:val="24"/>
         </w:rPr>
-        <w:t>SLIDE 7: EXPLAINABLE AI: THUẬT TOÁN 1D GRAD-CAM</w:t>
+        <w:t>SLIDE 11: 3.2. FULL-STACK SYSTEM IMPLEMENTATION (HẠ TẦNG BACKEND &amp; GIAO DIỆN REAL-TIME)</w:t>
       </w:r>
     </w:p>
     <w:p>
@@ -1284,7 +3068,7 @@
           <w:color w:val="1E293B"/>
           <w:sz w:val="21"/>
         </w:rPr>
-        <w:t xml:space="preserve">🎯 Mục tiêu cần làm: </w:t>
+        <w:t xml:space="preserve">🏷️ Khung Template SIC: </w:t>
       </w:r>
       <w:r>
         <w:rPr>
@@ -1292,7 +3076,30 @@
           <w:color w:val="334155"/>
           <w:sz w:val="21"/>
         </w:rPr>
-        <w:t>Làm nổi bật giá trị cốt lõi của tính năng giải thích được, tạo niềm tin cho giới y khoa.</w:t>
+        <w:t>Template Unit 3.2 &amp; 3.3: Network, Communication &amp; Service Implementation</w:t>
+      </w:r>
+    </w:p>
+    <w:p>
+      <w:pPr>
+        <w:spacing w:line="300" w:lineRule="auto" w:before="0" w:after="60"/>
+        <w:jc w:val="both"/>
+      </w:pPr>
+      <w:r>
+        <w:rPr>
+          <w:rFonts w:ascii="Times New Roman" w:hAnsi="Times New Roman"/>
+          <w:b/>
+          <w:color w:val="1E293B"/>
+          <w:sz w:val="21"/>
+        </w:rPr>
+        <w:t xml:space="preserve">🎯 Mục tiêu đánh giá: </w:t>
+      </w:r>
+      <w:r>
+        <w:rPr>
+          <w:rFonts w:ascii="Times New Roman" w:hAnsi="Times New Roman"/>
+          <w:color w:val="334155"/>
+          <w:sz w:val="21"/>
+        </w:rPr>
+        <w:t>Chứng minh tính hoàn chỉnh vượt trội của sản phẩm phần mềm y tế (Khẳng định 30% điểm Tính hoàn chỉnh).</w:t>
       </w:r>
     </w:p>
     <w:p>
@@ -1321,7 +3128,7 @@
           <w:color w:val="334155"/>
           <w:sz w:val="20"/>
         </w:rPr>
-        <w:t>Công thức 1D Grad-CAM: Trích xuất trọng số chú ý alpha_k^c từ đạo hàm của điểm số phân loại đối với bản đồ đặc trưng tại tầng tích chập cuối cùng (Layer 3 Residual Block).</w:t>
+        <w:t>Backend FastAPI &amp; Streaming WebSocket 360Hz 2 kênh:</w:t>
       </w:r>
     </w:p>
     <w:p>
@@ -1336,7 +3143,7 @@
           <w:color w:val="334155"/>
           <w:sz w:val="20"/>
         </w:rPr>
-        <w:t>Trực quan hóa bản đồ nhiệt tương quan hoàn hảo với bệnh học tim mạch:</w:t>
+        <w:t>- Truyền đồng thời kênh chẩn đoán chính (MLII) và kênh tham chiếu phụ (V1/V2), 36 gói tin/giây, độ trễ &lt; 5ms.</w:t>
       </w:r>
     </w:p>
     <w:p>
@@ -1351,7 +3158,7 @@
           <w:color w:val="334155"/>
           <w:sz w:val="20"/>
         </w:rPr>
-        <w:t>- Ngoại tâm thu thất (PVC - Lớp V): Vùng chú ý tập trung &gt; 85% năng lượng vào phức bộ QRS giãn rộng (&gt; 120ms) và sóng T đảo chiều.</w:t>
+        <w:t>- Mẫu thiết kế Inference Singleton nạp mô hình 1 lần duy nhất, loại bỏ nghẽn tài nguyên RAM.</w:t>
       </w:r>
     </w:p>
     <w:p>
@@ -1366,7 +3173,7 @@
           <w:color w:val="334155"/>
           <w:sz w:val="20"/>
         </w:rPr>
-        <w:t>- Ngoại tâm thu nhĩ (PAC - Lớp S): Trọng số kích hoạt mạnh tại sóng P đến sớm bất thường.</w:t>
+        <w:t>- Bộ theo dõi huyết động học: Đo liên tục nhịp tim (BPM) và biến thiên nhịp tim HRV (RMSSD, SDNN) trên cửa sổ 30 giây.</w:t>
       </w:r>
     </w:p>
     <w:p>
@@ -1381,7 +3188,52 @@
           <w:color w:val="334155"/>
           <w:sz w:val="20"/>
         </w:rPr>
-        <w:t>- Nhịp hợp nhất (Fusion - Lớp F): Bản đồ nhiệt phân bổ lưỡng cực tại cả sườn QRS và đoạn ST.</w:t>
+        <w:t>Cơ sở dữ liệu SQLite/SQLAlchemy &amp; Phân quyền RBAC 3 vai trò:</w:t>
+      </w:r>
+    </w:p>
+    <w:p>
+      <w:pPr>
+        <w:pStyle w:val="ListBullet"/>
+        <w:spacing w:line="288" w:lineRule="auto" w:before="0" w:after="40"/>
+        <w:jc w:val="both"/>
+      </w:pPr>
+      <w:r>
+        <w:rPr>
+          <w:rFonts w:ascii="Times New Roman" w:hAnsi="Times New Roman"/>
+          <w:color w:val="334155"/>
+          <w:sz w:val="20"/>
+        </w:rPr>
+        <w:t>- 5 thực thể chuẩn: users, patients, ecg_records, anomaly_events, audit_trails.</w:t>
+      </w:r>
+    </w:p>
+    <w:p>
+      <w:pPr>
+        <w:pStyle w:val="ListBullet"/>
+        <w:spacing w:line="288" w:lineRule="auto" w:before="0" w:after="40"/>
+        <w:jc w:val="both"/>
+      </w:pPr>
+      <w:r>
+        <w:rPr>
+          <w:rFonts w:ascii="Times New Roman" w:hAnsi="Times New Roman"/>
+          <w:color w:val="334155"/>
+          <w:sz w:val="20"/>
+        </w:rPr>
+        <w:t>- Xác thực an toàn qua JSON Web Token (JWT) lưu trong HttpOnly Secure Cookie (chống XSS).</w:t>
+      </w:r>
+    </w:p>
+    <w:p>
+      <w:pPr>
+        <w:pStyle w:val="ListBullet"/>
+        <w:spacing w:line="288" w:lineRule="auto" w:before="0" w:after="40"/>
+        <w:jc w:val="both"/>
+      </w:pPr>
+      <w:r>
+        <w:rPr>
+          <w:rFonts w:ascii="Times New Roman" w:hAnsi="Times New Roman"/>
+          <w:color w:val="334155"/>
+          <w:sz w:val="20"/>
+        </w:rPr>
+        <w:t>- Phân quyền chặt chẽ: Admin (quản trị, cấu hình), Doctor (chẩn đoán, duyệt/sửa nhãn, xuất PDF), Nurse (giám sát, không sửa nhãn).</w:t>
       </w:r>
     </w:p>
     <w:p>
@@ -1396,7 +3248,7 @@
           <w:color w:val="1E293B"/>
           <w:sz w:val="21"/>
         </w:rPr>
-        <w:t xml:space="preserve">🎨 Hình vẽ / Sơ đồ / Chèn ảnh: </w:t>
+        <w:t xml:space="preserve">🎨 Hình vẽ / Biểu đồ chèn: </w:t>
       </w:r>
       <w:r>
         <w:rPr>
@@ -1404,7 +3256,7 @@
           <w:color w:val="334155"/>
           <w:sz w:val="21"/>
         </w:rPr>
-        <w:t>Chèn ảnh figures/06_gradcam_heatmaps_5_classes.png (Bản đồ nhiệt 5 dạng sóng) và figures/07_gradcam_vs_saliency_comparison.png (So sánh Grad-CAM nét hơn Vanilla Saliency).</w:t>
+        <w:t>Sơ đồ tương tác giữa Backend FastAPI, WebSocket 2 kênh, SQLite ORM và React 19 Frontend.</w:t>
       </w:r>
     </w:p>
     <w:p>
@@ -1427,7 +3279,7 @@
           <w:color w:val="334155"/>
           <w:sz w:val="21"/>
         </w:rPr>
-        <w:t>"Bác sĩ tim mạch luôn nhìn vào độ giãn rộng của phức bộ QRS để chẩn đoán ngoại tâm thu thất. Thật tuyệt vời là bản đồ nhiệt 1D Grad-CAM của nhóm cũng sáng rực đúng ở phức bộ QRS, chứng minh AI đã học đúng căn cứ y khoa..."</w:t>
+        <w:t>"Khác với các đồ án chỉ dừng lại ở mô hình AI, chúng em đã xây dựng một hệ thống phần mềm hoàn chỉnh có phân quyền 3 vai trò, bảo mật cookie HttpOnly và streaming 2 kênh song song..."</w:t>
       </w:r>
     </w:p>
     <w:p>
@@ -1455,7 +3307,7 @@
           <w:color w:val="2563EB"/>
           <w:sz w:val="24"/>
         </w:rPr>
-        <w:t>SLIDE 8: TỐI ƯU HÓA NHÚNG EDGE AI (ONNX INT8) &amp; MODULE SÀNG LỌC RUNG NHĨ (AFIB)</w:t>
+        <w:t>SLIDE 12: 3.3. HUMAN-IN-THE-LOOP, AUDIT TRAIL &amp; CHUẨN Y TẾ IEC 60601-1-8 (TÍNH NĂNG Y TẾ NÂNG CAO)</w:t>
       </w:r>
     </w:p>
     <w:p>
@@ -1470,7 +3322,7 @@
           <w:color w:val="1E293B"/>
           <w:sz w:val="21"/>
         </w:rPr>
-        <w:t xml:space="preserve">🎯 Mục tiêu cần làm: </w:t>
+        <w:t xml:space="preserve">🏷️ Khung Template SIC: </w:t>
       </w:r>
       <w:r>
         <w:rPr>
@@ -1478,7 +3330,30 @@
           <w:color w:val="334155"/>
           <w:sz w:val="21"/>
         </w:rPr>
-        <w:t>Chứng minh tính khả thi đưa AI lên thiết bị nhúng di động và module phát hiện Rung nhĩ.</w:t>
+        <w:t>Template Unit 3.4: Data Visualization &amp; Clinical Features</w:t>
+      </w:r>
+    </w:p>
+    <w:p>
+      <w:pPr>
+        <w:spacing w:line="300" w:lineRule="auto" w:before="0" w:after="60"/>
+        <w:jc w:val="both"/>
+      </w:pPr>
+      <w:r>
+        <w:rPr>
+          <w:rFonts w:ascii="Times New Roman" w:hAnsi="Times New Roman"/>
+          <w:b/>
+          <w:color w:val="1E293B"/>
+          <w:sz w:val="21"/>
+        </w:rPr>
+        <w:t xml:space="preserve">🎯 Mục tiêu đánh giá: </w:t>
+      </w:r>
+      <w:r>
+        <w:rPr>
+          <w:rFonts w:ascii="Times New Roman" w:hAnsi="Times New Roman"/>
+          <w:color w:val="334155"/>
+          <w:sz w:val="21"/>
+        </w:rPr>
+        <w:t>Nêu bật tính tuân thủ pháp lý y tế và tiêu chuẩn an toàn thiết bị y tế quốc tế (Điểm sáng tạo y khoa rất lớn).</w:t>
       </w:r>
     </w:p>
     <w:p>
@@ -1507,7 +3382,7 @@
           <w:color w:val="334155"/>
           <w:sz w:val="20"/>
         </w:rPr>
-        <w:t>Lượng tử hóa ONNX INT8:</w:t>
+        <w:t>Cơ chế Human-in-the-loop: 'AI hỗ trợ — Bác sĩ quyết định':</w:t>
       </w:r>
     </w:p>
     <w:p>
@@ -1522,7 +3397,7 @@
           <w:color w:val="334155"/>
           <w:sz w:val="20"/>
         </w:rPr>
-        <w:t>- Dung lượng nén: Giảm từ 2,735 KB xuống 697.3 KB (giảm 74.5%, đạt chuẩn đề cương &lt; 700 KB).</w:t>
+        <w:t>- Bác sĩ có thể Xác nhận nhãn AI hoặc Ghi đè (Override) nhãn mới kèm lý do lâm sàng tại endpoint /api/anomalies/{id}/verify.</w:t>
       </w:r>
     </w:p>
     <w:p>
@@ -1537,7 +3412,7 @@
           <w:color w:val="334155"/>
           <w:sz w:val="20"/>
         </w:rPr>
-        <w:t>- Độ chính xác: Chỉ giảm 0.67 điểm % (94.33% -&gt; 93.66%, nằm trong ngưỡng an toàn 2%).</w:t>
+        <w:t>- Bảng audit_trails tự động ghi nhận dấu thời gian, ID bác sĩ, nhãn cũ/mới, lý do y khoa -&gt; Đảm bảo tính minh bạch pháp lý tuyệt đối.</w:t>
       </w:r>
     </w:p>
     <w:p>
@@ -1552,7 +3427,7 @@
           <w:color w:val="334155"/>
           <w:sz w:val="20"/>
         </w:rPr>
-        <w:t>- Tốc độ: ONNX FP32 đạt 0.29 ms/nhịp (tăng tốc gần 4 lần so với PyTorch gốc).</w:t>
+        <w:t>Hệ thống cảnh báo 3 cấp độ chuẩn an toàn quốc tế IEC 60601-1-8:</w:t>
       </w:r>
     </w:p>
     <w:p>
@@ -1567,7 +3442,37 @@
           <w:color w:val="334155"/>
           <w:sz w:val="20"/>
         </w:rPr>
-        <w:t>Module sàng lọc Rung nhĩ (AFib Screener): Phân tích rối loạn nhịp điệu kéo dài qua Shannon Entropy của sai phân dRR, hệ số biến thiên CV_RR và pNN50; kích hoạt cảnh báo khi vượt ngưỡng 0.62.</w:t>
+        <w:t>- 🟢 Xanh (Bình thường) -&gt; 🟡 Vàng (Chú ý: PAC, nhịp chậm) -&gt; 🔴 Đỏ (Nguy cấp: PVC đa ổ, Rung nhĩ).</w:t>
+      </w:r>
+    </w:p>
+    <w:p>
+      <w:pPr>
+        <w:pStyle w:val="ListBullet"/>
+        <w:spacing w:line="288" w:lineRule="auto" w:before="0" w:after="40"/>
+        <w:jc w:val="both"/>
+      </w:pPr>
+      <w:r>
+        <w:rPr>
+          <w:rFonts w:ascii="Times New Roman" w:hAnsi="Times New Roman"/>
+          <w:color w:val="334155"/>
+          <w:sz w:val="20"/>
+        </w:rPr>
+        <w:t>- Tích hợp chuông báo âm thanh, đèn chớp và tính năng 'Tắt chuông tạm thời 2 phút' (Alarm Mute) tự bật lại theo chuẩn IEC 60601-1-8.</w:t>
+      </w:r>
+    </w:p>
+    <w:p>
+      <w:pPr>
+        <w:pStyle w:val="ListBullet"/>
+        <w:spacing w:line="288" w:lineRule="auto" w:before="0" w:after="40"/>
+        <w:jc w:val="both"/>
+      </w:pPr>
+      <w:r>
+        <w:rPr>
+          <w:rFonts w:ascii="Times New Roman" w:hAnsi="Times New Roman"/>
+          <w:color w:val="334155"/>
+          <w:sz w:val="20"/>
+        </w:rPr>
+        <w:t>Chẩn đoán ngoại tuyến &amp; Xuất báo cáo: Upload tệp CSV/DAT; tạo tệp PDF bệnh án và bảng tính CSV lưu trữ hồ sơ bệnh nhân.</w:t>
       </w:r>
     </w:p>
     <w:p>
@@ -1582,7 +3487,7 @@
           <w:color w:val="1E293B"/>
           <w:sz w:val="21"/>
         </w:rPr>
-        <w:t xml:space="preserve">🎨 Hình vẽ / Sơ đồ / Chèn ảnh: </w:t>
+        <w:t xml:space="preserve">🎨 Hình vẽ / Biểu đồ chèn: </w:t>
       </w:r>
       <w:r>
         <w:rPr>
@@ -1590,7 +3495,7 @@
           <w:color w:val="334155"/>
           <w:sz w:val="21"/>
         </w:rPr>
-        <w:t>Chèn ảnh figures/10_onnx_quantization_comparison.png (Biểu đồ so sánh dung lượng, độ trễ và độ chính xác ONNX).</w:t>
+        <w:t>Ảnh chụp màn hình popup duyệt nhãn của bác sĩ kèm bảng Audit Trail và nút 'Tắt chuông 2 phút chuẩn IEC 60601-1-8'.</w:t>
       </w:r>
     </w:p>
     <w:p>
@@ -1613,7 +3518,7 @@
           <w:color w:val="334155"/>
           <w:sz w:val="21"/>
         </w:rPr>
-        <w:t>"Với kích thước chỉ 697 KB, mô hình hoàn toàn sẵn sàng để nhúng vào bộ nhớ vi điều khiển của các thiết bị đeo Holter thông minh mà không cần phụ thuộc vào server đám mây..."</w:t>
+        <w:t>"Trong y tế, tính năng Audit Trail và việc tuân thủ chuẩn an toàn báo động IEC 60601-1-8 là bắt buộc. Hệ thống của chúng em được thiết kế chuẩn mực theo tư duy của một thiết bị y tế thực thụ..."</w:t>
       </w:r>
     </w:p>
     <w:p>
@@ -1641,7 +3546,7 @@
           <w:color w:val="2563EB"/>
           <w:sz w:val="24"/>
         </w:rPr>
-        <w:t>SLIDE 9: KIẾN TRÚC HỆ THỐNG TỔNG THỂ &amp; LUỒNG DỮ LIỆU THỜI GIAN THỰC</w:t>
+        <w:t>SLIDE 13: 3.4. TESTING, QUALITY ASSURANCE &amp; DEVOPS (KIỂM THỬ TỰ ĐỘNG &amp; ĐÓNG GÓI TRIỂN KHAI)</w:t>
       </w:r>
     </w:p>
     <w:p>
@@ -1656,7 +3561,7 @@
           <w:color w:val="1E293B"/>
           <w:sz w:val="21"/>
         </w:rPr>
-        <w:t xml:space="preserve">🎯 Mục tiêu cần làm: </w:t>
+        <w:t xml:space="preserve">🏷️ Khung Template SIC: </w:t>
       </w:r>
       <w:r>
         <w:rPr>
@@ -1664,7 +3569,30 @@
           <w:color w:val="334155"/>
           <w:sz w:val="21"/>
         </w:rPr>
-        <w:t>Trình bày kiến trúc phần mềm chuẩn kỹ sư, phân tầng xử lý mượt mà.</w:t>
+        <w:t>Template Unit 3.5: Testing and Improvements</w:t>
+      </w:r>
+    </w:p>
+    <w:p>
+      <w:pPr>
+        <w:spacing w:line="300" w:lineRule="auto" w:before="0" w:after="60"/>
+        <w:jc w:val="both"/>
+      </w:pPr>
+      <w:r>
+        <w:rPr>
+          <w:rFonts w:ascii="Times New Roman" w:hAnsi="Times New Roman"/>
+          <w:b/>
+          <w:color w:val="1E293B"/>
+          <w:sz w:val="21"/>
+        </w:rPr>
+        <w:t xml:space="preserve">🎯 Mục tiêu đánh giá: </w:t>
+      </w:r>
+      <w:r>
+        <w:rPr>
+          <w:rFonts w:ascii="Times New Roman" w:hAnsi="Times New Roman"/>
+          <w:color w:val="334155"/>
+          <w:sz w:val="21"/>
+        </w:rPr>
+        <w:t>Chứng minh chất lượng mã nguồn đạt chuẩn sản xuất với 100% test tự động pass và luồng CI/CD.</w:t>
       </w:r>
     </w:p>
     <w:p>
@@ -1693,7 +3621,7 @@
           <w:color w:val="334155"/>
           <w:sz w:val="20"/>
         </w:rPr>
-        <w:t>Mô hình Client-Server hướng dịch vụ vi mô (Micro-modular Architecture):</w:t>
+        <w:t>Bộ kiểm thử tự động Backend (Pytest):</w:t>
       </w:r>
     </w:p>
     <w:p>
@@ -1708,7 +3636,7 @@
           <w:color w:val="334155"/>
           <w:sz w:val="20"/>
         </w:rPr>
-        <w:t>- Ingestion (360Hz): Đóng gói 36 gói tin/giây (10 mẫu/gói) truyền qua giao thức WebSocket hai chiều.</w:t>
+        <w:t>- Đạt 42/42 bài kiểm thử tự động (100% PASS), bao phủ từ Xác thực Auth JWT, REST API, WebSocket streaming, DSP, đến phân quyền RBAC và Human-in-the-loop.</w:t>
       </w:r>
     </w:p>
     <w:p>
@@ -1723,7 +3651,7 @@
           <w:color w:val="334155"/>
           <w:sz w:val="20"/>
         </w:rPr>
-        <w:t>- DSP Pipeline: Lọc thông dải 0.5-45Hz, Notch 50Hz, Pan-Tompkins R-peak detector.</w:t>
+        <w:t>Kiểm tra chất lượng mã nguồn (Linting):</w:t>
       </w:r>
     </w:p>
     <w:p>
@@ -1738,7 +3666,7 @@
           <w:color w:val="334155"/>
           <w:sz w:val="20"/>
         </w:rPr>
-        <w:t>- Inference Singleton: Nạp mô hình PyTorch/ONNX duy nhất một lần vào RAM, độ trễ suy luận &lt; 1ms.</w:t>
+        <w:t>- Backend: Ruff check sạch hoàn toàn cú pháp và cảnh báo bảo mật.</w:t>
       </w:r>
     </w:p>
     <w:p>
@@ -1753,7 +3681,7 @@
           <w:color w:val="334155"/>
           <w:sz w:val="20"/>
         </w:rPr>
-        <w:t>- Alert Dispatcher: Phân tầng báo động Xanh (Bình thường) -&gt; Vàng (Chú ý) -&gt; Đỏ (Nguy cấp).</w:t>
+        <w:t>- Frontend: Oxlint check sạch toàn bộ mã nguồn React 19.</w:t>
       </w:r>
     </w:p>
     <w:p>
@@ -1768,7 +3696,37 @@
           <w:color w:val="334155"/>
           <w:sz w:val="20"/>
         </w:rPr>
-        <w:t>- Frontend React 19: Kết xuất dạng sóng 60 FPS, kích hoạt chuông cảnh báo và đưa vào hàng đợi chuyên gia duyệt.</w:t>
+        <w:t>Container hóa &amp; DevOps:</w:t>
+      </w:r>
+    </w:p>
+    <w:p>
+      <w:pPr>
+        <w:pStyle w:val="ListBullet"/>
+        <w:spacing w:line="288" w:lineRule="auto" w:before="0" w:after="40"/>
+        <w:jc w:val="both"/>
+      </w:pPr>
+      <w:r>
+        <w:rPr>
+          <w:rFonts w:ascii="Times New Roman" w:hAnsi="Times New Roman"/>
+          <w:color w:val="334155"/>
+          <w:sz w:val="20"/>
+        </w:rPr>
+        <w:t>- Đóng gói Docker Compose 2 dịch vụ độc lập: backend FastAPI (Uvicorn) và frontend React (Nginx reverse proxy).</w:t>
+      </w:r>
+    </w:p>
+    <w:p>
+      <w:pPr>
+        <w:pStyle w:val="ListBullet"/>
+        <w:spacing w:line="288" w:lineRule="auto" w:before="0" w:after="40"/>
+        <w:jc w:val="both"/>
+      </w:pPr>
+      <w:r>
+        <w:rPr>
+          <w:rFonts w:ascii="Times New Roman" w:hAnsi="Times New Roman"/>
+          <w:color w:val="334155"/>
+          <w:sz w:val="20"/>
+        </w:rPr>
+        <w:t>- Tích hợp quy trình CI/CD tự động hóa trên GitHub Actions cho mọi lần kiểm thử và build Docker.</w:t>
       </w:r>
     </w:p>
     <w:p>
@@ -1783,7 +3741,7 @@
           <w:color w:val="1E293B"/>
           <w:sz w:val="21"/>
         </w:rPr>
-        <w:t xml:space="preserve">🎨 Hình vẽ / Sơ đồ / Chèn ảnh: </w:t>
+        <w:t xml:space="preserve">🎨 Hình vẽ / Biểu đồ chèn: </w:t>
       </w:r>
       <w:r>
         <w:rPr>
@@ -1791,7 +3749,7 @@
           <w:color w:val="334155"/>
           <w:sz w:val="21"/>
         </w:rPr>
-        <w:t>Sơ đồ khối luồng dữ liệu 5 tầng từ Thiết bị đo/Giả lập -&gt; FastAPI Backend -&gt; React 19 Frontend -&gt; SQLite Database.</w:t>
+        <w:t>Ảnh chụp màn hình terminal lệnh pytest 42/42 xanh lá cây kèm logo Docker Compose và GitHub Actions CI/CD pipeline.</w:t>
       </w:r>
     </w:p>
     <w:p>
@@ -1814,7 +3772,7 @@
           <w:color w:val="334155"/>
           <w:sz w:val="21"/>
         </w:rPr>
-        <w:t>"Hệ thống được thiết kế theo thời gian thực chuẩn y tế, toàn bộ thời gian từ lúc mẫu tín hiệu phát ra đến khi AI phân loại và hiển thị lên màn hình bác sĩ chỉ mất dưới 5 mili-giây..."</w:t>
+        <w:t>"Chất lượng mã nguồn được bảo đảm bằng 42 bài kiểm thử tự động và quy trình CI/CD hoàn thiện, sẵn sàng triển khai trên bất kỳ hạ tầng bệnh viện nào..."</w:t>
       </w:r>
     </w:p>
     <w:p>
@@ -1842,7 +3800,7 @@
           <w:color w:val="2563EB"/>
           <w:sz w:val="24"/>
         </w:rPr>
-        <w:t>SLIDE 10: HẠ TẦNG BACKEND FASTAPI &amp; WEBSOCKET STREAMING 2 CHUYỂN ĐẠO</w:t>
+        <w:t>SLIDE 14: 3.5. LIVE DEMONSTRATION SESSION (KỊCH BẢN TRÌNH DIỄN HỆ THỐNG TRỰC TIẾP)</w:t>
       </w:r>
     </w:p>
     <w:p>
@@ -1857,7 +3815,7 @@
           <w:color w:val="1E293B"/>
           <w:sz w:val="21"/>
         </w:rPr>
-        <w:t xml:space="preserve">🎯 Mục tiêu cần làm: </w:t>
+        <w:t xml:space="preserve">🏷️ Khung Template SIC: </w:t>
       </w:r>
       <w:r>
         <w:rPr>
@@ -1865,7 +3823,30 @@
           <w:color w:val="334155"/>
           <w:sz w:val="21"/>
         </w:rPr>
-        <w:t>Nêu bật các kỹ thuật tối ưu backend hiệu năng cao và đồng bộ đa kênh.</w:t>
+        <w:t>Template Unit 3: Live Demo Session</w:t>
+      </w:r>
+    </w:p>
+    <w:p>
+      <w:pPr>
+        <w:spacing w:line="300" w:lineRule="auto" w:before="0" w:after="60"/>
+        <w:jc w:val="both"/>
+      </w:pPr>
+      <w:r>
+        <w:rPr>
+          <w:rFonts w:ascii="Times New Roman" w:hAnsi="Times New Roman"/>
+          <w:b/>
+          <w:color w:val="1E293B"/>
+          <w:sz w:val="21"/>
+        </w:rPr>
+        <w:t xml:space="preserve">🎯 Mục tiêu đánh giá: </w:t>
+      </w:r>
+      <w:r>
+        <w:rPr>
+          <w:rFonts w:ascii="Times New Roman" w:hAnsi="Times New Roman"/>
+          <w:color w:val="334155"/>
+          <w:sz w:val="21"/>
+        </w:rPr>
+        <w:t>Thực hiện Live Demo 5 pha dứt khoát trên màn hình trình duyệt (Chinh phục 30% điểm Hoàn chỉnh sản phẩm).</w:t>
       </w:r>
     </w:p>
     <w:p>
@@ -1894,7 +3875,7 @@
           <w:color w:val="334155"/>
           <w:sz w:val="20"/>
         </w:rPr>
-        <w:t>WebSocket Streaming 360Hz 2 kênh đồng thời: Truyền song song kênh chẩn đoán chính (MLII) và kênh tham chiếu phụ (V1/V2).</w:t>
+        <w:t>Kịch bản trình diễn 5 pha liên hoàn trên hệ thống thực tế (http://localhost:5173):</w:t>
       </w:r>
     </w:p>
     <w:p>
@@ -1909,7 +3890,7 @@
           <w:color w:val="334155"/>
           <w:sz w:val="20"/>
         </w:rPr>
-        <w:t>Mẫu thiết kế Inference Singleton: Khởi tạo mô hình một lần duy nhất lúc máy chủ khởi động, loại bỏ hoàn toàn chi phí nạp lại mô hình.</w:t>
+        <w:t>- Pha 1 (Streaming 360Hz): Phát Record 100 (Bình thường), đồ thị 2 kênh mượt 60 FPS. Chuyển sang Record 200 (Bệnh nhân có nhiều PVC), AI lập tức bắt nhịp và dán nhãn màu đỏ 'Ventricular Ectopic' với độ tin cậy &gt; 95%.</w:t>
       </w:r>
     </w:p>
     <w:p>
@@ -1924,7 +3905,7 @@
           <w:color w:val="334155"/>
           <w:sz w:val="20"/>
         </w:rPr>
-        <w:t>Đo lường huyết động học thời gian thực: Tính toán đồng bộ nhịp tim trung bình (BPM) và độ biến thiên nhịp tim HRV (RMSSD, SDNN) trên cửa sổ trượt 30 giây.</w:t>
+        <w:t>- Pha 2 (Báo động IEC 60601-1-8): Kích hoạt chuông cảnh báo âm thanh; bấm nút 'Tắt chuông 2 phút'.</w:t>
       </w:r>
     </w:p>
     <w:p>
@@ -1939,7 +3920,52 @@
           <w:color w:val="334155"/>
           <w:sz w:val="20"/>
         </w:rPr>
-        <w:t>Khả năng chịu tải: Thử nghiệm ổn định 10 kết nối streaming đồng thời trên 1 node backend thông thường.</w:t>
+        <w:t>- Pha 3 (Explainable AI 1D Grad-CAM): Nhấp vào nhịp PVC, quan sát bản đồ nhiệt Grad-CAM đỏ rực tại phức bộ QRS giãn rộng.</w:t>
+      </w:r>
+    </w:p>
+    <w:p>
+      <w:pPr>
+        <w:pStyle w:val="ListBullet"/>
+        <w:spacing w:line="288" w:lineRule="auto" w:before="0" w:after="40"/>
+        <w:jc w:val="both"/>
+      </w:pPr>
+      <w:r>
+        <w:rPr>
+          <w:rFonts w:ascii="Times New Roman" w:hAnsi="Times New Roman"/>
+          <w:color w:val="334155"/>
+          <w:sz w:val="20"/>
+        </w:rPr>
+        <w:t>- Pha 4 (Human-in-the-loop &amp; Xuất PDF): Đăng nhập tài khoản Bác sĩ, duyệt/sửa nhãn, kiểm tra Audit Trail và bấm Xuất Báo cáo Bệnh án PDF.</w:t>
+      </w:r>
+    </w:p>
+    <w:p>
+      <w:pPr>
+        <w:pStyle w:val="ListBullet"/>
+        <w:spacing w:line="288" w:lineRule="auto" w:before="0" w:after="40"/>
+        <w:jc w:val="both"/>
+      </w:pPr>
+      <w:r>
+        <w:rPr>
+          <w:rFonts w:ascii="Times New Roman" w:hAnsi="Times New Roman"/>
+          <w:color w:val="334155"/>
+          <w:sz w:val="20"/>
+        </w:rPr>
+        <w:t>- Pha 5 (Chẩn đoán Offline &amp; Edge AI): Upload file CSV phân tích trong vài giây; kiểm tra mô hình ONNX INT8 697.3 KB.</w:t>
+      </w:r>
+    </w:p>
+    <w:p>
+      <w:pPr>
+        <w:pStyle w:val="ListBullet"/>
+        <w:spacing w:line="288" w:lineRule="auto" w:before="0" w:after="40"/>
+        <w:jc w:val="both"/>
+      </w:pPr>
+      <w:r>
+        <w:rPr>
+          <w:rFonts w:ascii="Times New Roman" w:hAnsi="Times New Roman"/>
+          <w:color w:val="334155"/>
+          <w:sz w:val="20"/>
+        </w:rPr>
+        <w:t>Kế hoạch dự phòng: Đã đóng gói sẵn Docker Compose và video 4K backup nếu gặp sự cố kết nối.</w:t>
       </w:r>
     </w:p>
     <w:p>
@@ -1954,7 +3980,7 @@
           <w:color w:val="1E293B"/>
           <w:sz w:val="21"/>
         </w:rPr>
-        <w:t xml:space="preserve">🎨 Hình vẽ / Sơ đồ / Chèn ảnh: </w:t>
+        <w:t xml:space="preserve">🎨 Hình vẽ / Biểu đồ chèn: </w:t>
       </w:r>
       <w:r>
         <w:rPr>
@@ -1962,7 +3988,7 @@
           <w:color w:val="334155"/>
           <w:sz w:val="21"/>
         </w:rPr>
-        <w:t>Sơ đồ luồng WebSocket Payload: JSON message chứa cấu trúc đa trường [timestamp, lead_primary, lead_secondary, beat_window, prediction, confidence, gradcam_heatmap].</w:t>
+        <w:t>Hình mockup màn hình Dashboard lớn kèm thông điệp: 'Kính mời Hội đồng cùng theo dõi thao tác trực tiếp trên màn hình'.</w:t>
       </w:r>
     </w:p>
     <w:p>
@@ -1985,7 +4011,7 @@
           <w:color w:val="334155"/>
           <w:sz w:val="21"/>
         </w:rPr>
-        <w:t>"Việc stream đồng thời cả 2 chuyển đạo MLII và V1 giúp bác sĩ có cái nhìn đa chiều về trục điện tim, tương tự như màn hình monitor chuyên dụng trong phòng mổ..."</w:t>
+        <w:t>"Sau đây nhóm em xin phép được trình diễn trực tiếp hệ thống qua 5 pha kịch bản liên hoàn trên trình duyệt web..."</w:t>
       </w:r>
     </w:p>
     <w:p>
@@ -1999,6 +4025,21 @@
           <w:sz w:val="18"/>
         </w:rPr>
         <w:t>―――――――――――――――――――――――――――――――――――――――――――――――――――――――</w:t>
+      </w:r>
+    </w:p>
+    <w:p>
+      <w:pPr>
+        <w:keepNext/>
+        <w:spacing w:before="320" w:after="120"/>
+      </w:pPr>
+      <w:r>
+        <w:rPr>
+          <w:rFonts w:ascii="Times New Roman" w:hAnsi="Times New Roman"/>
+          <w:b/>
+          <w:color w:val="1E3A8A"/>
+          <w:sz w:val="28"/>
+        </w:rPr>
+        <w:t>UNIT 4. PROJECTED IMPACT &amp; LIMITATIONS (Tác Động Dự Án &amp; Đánh Giá Giới Hạn Trung Thực)</w:t>
       </w:r>
     </w:p>
     <w:p>
@@ -2013,7 +4054,7 @@
           <w:color w:val="2563EB"/>
           <w:sz w:val="24"/>
         </w:rPr>
-        <w:t>SLIDE 11: BẢO MẬT RBAC, CƠ CHẾ HUMAN-IN-THE-LOOP &amp; AUDIT TRAIL Y TẾ</w:t>
+        <w:t>SLIDE 15: 4.1. ACCOMPLISHMENTS AND PROJECTED IMPACT (THÀNH TỰU &amp; TÁC ĐỘNG THỰC TIỄN)</w:t>
       </w:r>
     </w:p>
     <w:p>
@@ -2028,7 +4069,7 @@
           <w:color w:val="1E293B"/>
           <w:sz w:val="21"/>
         </w:rPr>
-        <w:t xml:space="preserve">🎯 Mục tiêu cần làm: </w:t>
+        <w:t xml:space="preserve">🏷️ Khung Template SIC: </w:t>
       </w:r>
       <w:r>
         <w:rPr>
@@ -2036,7 +4077,30 @@
           <w:color w:val="334155"/>
           <w:sz w:val="21"/>
         </w:rPr>
-        <w:t>Khẳng định tính nhân văn, an toàn pháp lý y tế và triết lý 'AI hỗ trợ — Bác sĩ quyết định'.</w:t>
+        <w:t>Template Unit 4.1: Accomplishments and Benefits</w:t>
+      </w:r>
+    </w:p>
+    <w:p>
+      <w:pPr>
+        <w:spacing w:line="300" w:lineRule="auto" w:before="0" w:after="60"/>
+        <w:jc w:val="both"/>
+      </w:pPr>
+      <w:r>
+        <w:rPr>
+          <w:rFonts w:ascii="Times New Roman" w:hAnsi="Times New Roman"/>
+          <w:b/>
+          <w:color w:val="1E293B"/>
+          <w:sz w:val="21"/>
+        </w:rPr>
+        <w:t xml:space="preserve">🎯 Mục tiêu đánh giá: </w:t>
+      </w:r>
+      <w:r>
+        <w:rPr>
+          <w:rFonts w:ascii="Times New Roman" w:hAnsi="Times New Roman"/>
+          <w:color w:val="334155"/>
+          <w:sz w:val="21"/>
+        </w:rPr>
+        <w:t>Tổng kết giá trị thực tế của đề tài đối với nền y tế và công nghệ thiết bị đeo (Khẳng định tính thực tiễn 25%).</w:t>
       </w:r>
     </w:p>
     <w:p>
@@ -2065,7 +4129,7 @@
           <w:color w:val="334155"/>
           <w:sz w:val="20"/>
         </w:rPr>
-        <w:t>Phân quyền 3 vai trò (RBAC):</w:t>
+        <w:t>Những thành tựu cốt lõi đã đạt được 100%:</w:t>
       </w:r>
     </w:p>
     <w:p>
@@ -2080,7 +4144,7 @@
           <w:color w:val="334155"/>
           <w:sz w:val="20"/>
         </w:rPr>
-        <w:t>- Admin: Toàn quyền cấu hình hệ thống, hiệu chỉnh ngưỡng nhạy cảnh báo.</w:t>
+        <w:t>- Xây dựng thành công chuỗi công nghệ khép kín từ DSP -&gt; AI -&gt; XAI -&gt; Edge ONNX -&gt; Full-Stack Web y tế.</w:t>
       </w:r>
     </w:p>
     <w:p>
@@ -2095,7 +4159,7 @@
           <w:color w:val="334155"/>
           <w:sz w:val="20"/>
         </w:rPr>
-        <w:t>- Doctor: Xem giám sát, chẩn đoán XAI chuyên sâu, duyệt hoặc sửa nhãn của AI, ký xuất báo cáo bệnh án.</w:t>
+        <w:t>- Độ chính xác 98.57%, độ trễ 0.13ms, dung lượng nhúng 697 KB đáp ứng hoàn hảo tiêu chuẩn thời gian thực.</w:t>
       </w:r>
     </w:p>
     <w:p>
@@ -2110,7 +4174,7 @@
           <w:color w:val="334155"/>
           <w:sz w:val="20"/>
         </w:rPr>
-        <w:t>- Nurse: Giám sát bệnh nhân, tiếp nhận hồ sơ; không có quyền sửa đổi nhãn chẩn đoán của AI.</w:t>
+        <w:t>Tác động thực tiễn &amp; Lợi ích xã hội:</w:t>
       </w:r>
     </w:p>
     <w:p>
@@ -2125,7 +4189,7 @@
           <w:color w:val="334155"/>
           <w:sz w:val="20"/>
         </w:rPr>
-        <w:t>Bảo mật: Xác thực JWT lưu trong HttpOnly Secure Cookie (triệt tiêu nguy cơ tấn công XSS).</w:t>
+        <w:t>- Đối với Bệnh viện / Phòng Cấp cứu: Giảm tải áp lực cho bác sĩ trực, phát hiện tức thì các nhịp nguy hiểm đe dọa tính mạng, minh bạch hóa nguyên nhân qua bản đồ nhiệt XAI.</w:t>
       </w:r>
     </w:p>
     <w:p>
@@ -2140,7 +4204,22 @@
           <w:color w:val="334155"/>
           <w:sz w:val="20"/>
         </w:rPr>
-        <w:t>Human-in-the-Loop &amp; Audit Trail: Endpoint POST /api/anomalies/{id}/verify cho phép bác sĩ duyệt hoặc ghi đè (Override) nhãn AI. Bảng audit_trails lưu vết bất biến: Dấu thời gian, ID bác sĩ, nhãn cũ/mới, lý do y khoa.</w:t>
+        <w:t>- Đối với Chăm sóc sức khỏe từ xa (Telehealth): Mở đường cho các thiết bị Holter đeo người thông minh giá thành thấp tự phân loại nhịp tim tại chỗ mà không cần internet.</w:t>
+      </w:r>
+    </w:p>
+    <w:p>
+      <w:pPr>
+        <w:pStyle w:val="ListBullet"/>
+        <w:spacing w:line="288" w:lineRule="auto" w:before="0" w:after="40"/>
+        <w:jc w:val="both"/>
+      </w:pPr>
+      <w:r>
+        <w:rPr>
+          <w:rFonts w:ascii="Times New Roman" w:hAnsi="Times New Roman"/>
+          <w:color w:val="334155"/>
+          <w:sz w:val="20"/>
+        </w:rPr>
+        <w:t>- Giá trị học thuật: Tạo lập bộ khung benchmark 5 kiến trúc và phương pháp 1D Grad-CAM chuẩn mực cho dữ liệu chuỗi thời gian y sinh.</w:t>
       </w:r>
     </w:p>
     <w:p>
@@ -2155,7 +4234,7 @@
           <w:color w:val="1E293B"/>
           <w:sz w:val="21"/>
         </w:rPr>
-        <w:t xml:space="preserve">🎨 Hình vẽ / Sơ đồ / Chèn ảnh: </w:t>
+        <w:t xml:space="preserve">🎨 Hình vẽ / Biểu đồ chèn: </w:t>
       </w:r>
       <w:r>
         <w:rPr>
@@ -2163,7 +4242,7 @@
           <w:color w:val="334155"/>
           <w:sz w:val="21"/>
         </w:rPr>
-        <w:t>Bảng phân quyền 3 cột (Admin, Doctor, Nurse) kèm biểu tượng ổ khóa bảo mật và sơ đồ mũi tên quy trình: 'AI cảnh báo -&gt; Bác sĩ thẩm định/sửa nhãn -&gt; Tự động ghi vào Audit Trail'.</w:t>
+        <w:t>Sơ đồ tác động 3 trụ cột: [Phòng Cấp cứu Bệnh viện] - [Thiết bị Đeo Holter Di động] - [Nghiên cứu Học thuật Y sinh].</w:t>
       </w:r>
     </w:p>
     <w:p>
@@ -2186,7 +4265,7 @@
           <w:color w:val="334155"/>
           <w:sz w:val="21"/>
         </w:rPr>
-        <w:t>"Trong y tế, trách nhiệm pháp lý là tối thượng. Tính năng Audit Trail đảm bảo mọi can thiệp sửa nhãn của bác sĩ đều được lưu vết minh bạch, sẵn sàng phục vụ công tác thanh tra y khoa..."</w:t>
+        <w:t>"Dự án mang lại tác động kép: vừa giúp giảm tải cho bác sĩ tại phòng hồi sức cấp cứu, vừa mở ra tiềm năng tích hợp vào các thiết bị đeo Holter thông minh theo dõi bệnh nhân từ xa..."</w:t>
       </w:r>
     </w:p>
     <w:p>
@@ -2214,7 +4293,7 @@
           <w:color w:val="2563EB"/>
           <w:sz w:val="24"/>
         </w:rPr>
-        <w:t>SLIDE 12: GIAO DIỆN WEB FRONTEND REACT 19 &amp; CHUẨN AN TOÀN BÁO ĐỘNG IEC 60601-1-8</w:t>
+        <w:t>SLIDE 16: 4.2. TECHNICAL LIMITATIONS AND FUTURE IMPROVEMENTS (HẠN CHẾ &amp; ĐÁNH GIÁ TRUNG THỰC)</w:t>
       </w:r>
     </w:p>
     <w:p>
@@ -2229,7 +4308,7 @@
           <w:color w:val="1E293B"/>
           <w:sz w:val="21"/>
         </w:rPr>
-        <w:t xml:space="preserve">🎯 Mục tiêu cần làm: </w:t>
+        <w:t xml:space="preserve">🏷️ Khung Template SIC: </w:t>
       </w:r>
       <w:r>
         <w:rPr>
@@ -2237,7 +4316,30 @@
           <w:color w:val="334155"/>
           <w:sz w:val="21"/>
         </w:rPr>
-        <w:t>Giới thiệu các tính năng giao diện chuẩn y khoa và trải nghiệm người dùng tối ưu.</w:t>
+        <w:t>Template Unit 4.2: Future Improvements &amp; Known Limitations</w:t>
+      </w:r>
+    </w:p>
+    <w:p>
+      <w:pPr>
+        <w:spacing w:line="300" w:lineRule="auto" w:before="0" w:after="60"/>
+        <w:jc w:val="both"/>
+      </w:pPr>
+      <w:r>
+        <w:rPr>
+          <w:rFonts w:ascii="Times New Roman" w:hAnsi="Times New Roman"/>
+          <w:b/>
+          <w:color w:val="1E293B"/>
+          <w:sz w:val="21"/>
+        </w:rPr>
+        <w:t xml:space="preserve">🎯 Mục tiêu đánh giá: </w:t>
+      </w:r>
+      <w:r>
+        <w:rPr>
+          <w:rFonts w:ascii="Times New Roman" w:hAnsi="Times New Roman"/>
+          <w:color w:val="334155"/>
+          <w:sz w:val="21"/>
+        </w:rPr>
+        <w:t>Thể hiện tư duy khoa học trung thực, chỉ rõ 4 hạn chế kỹ thuật và giải pháp (Điểm mấu chốt gây ấn tượng mạnh với Hội đồng).</w:t>
       </w:r>
     </w:p>
     <w:p>
@@ -2266,7 +4368,7 @@
           <w:color w:val="334155"/>
           <w:sz w:val="20"/>
         </w:rPr>
-        <w:t>Dashboard Real-time: Đồ thị sóng 2 kênh mượt mà 60 FPS bằng Plotly.js, tự động co giãn biên độ riêng từng kênh (Auto-scaling Y-axis).</w:t>
+        <w:t>1. Độ nhạy trên các lớp hiếm (S/F) khi gặp dữ liệu ngoại vi (Domain Shift):</w:t>
       </w:r>
     </w:p>
     <w:p>
@@ -2281,7 +4383,7 @@
           <w:color w:val="334155"/>
           <w:sz w:val="20"/>
         </w:rPr>
-        <w:t>Hệ thống cảnh báo 3 cấp độ chuẩn IEC 60601-1-8: 🟢 Xanh (Bình thường) -&gt; 🟡 Vàng (Chú ý) -&gt; 🔴 Đỏ (Nguy cấp).</w:t>
+        <w:t>- Kiểm nghiệm trên INCART, SVDB, EDB: Lớp N và V duy trì độ chính xác cao (78%-94%), nhưng lớp S và F bị sụt giảm Recall (SVDB Recall_S = 0.4%, EDB = 3.6%).</w:t>
       </w:r>
     </w:p>
     <w:p>
@@ -2296,7 +4398,7 @@
           <w:color w:val="334155"/>
           <w:sz w:val="20"/>
         </w:rPr>
-        <w:t>Tính năng Tắt chuông tạm thời 2 phút (Alarm Mute): Tự động bật lại chuông sau 2 phút nếu nguy cơ bệnh lý chưa giải quyết, đúng chuẩn an toàn thiết bị y tế quốc tế IEC 60601-1-8.</w:t>
+        <w:t>- Nguyên nhân: Do sự sai khác về vị trí đạo trình đo giữa các máy và số lượng mẫu gốc quá ít trong tập train (2.5% và 0.7%).</w:t>
       </w:r>
     </w:p>
     <w:p>
@@ -2311,7 +4413,52 @@
           <w:color w:val="334155"/>
           <w:sz w:val="20"/>
         </w:rPr>
-        <w:t>Chẩn đoán ngoại tuyến &amp; Xuất báo cáo: Hỗ trợ upload tệp CSV/DAT; tạo tệp báo cáo PDF và bảng tính CSV đầy đủ thông tin hành chính và đồ thị sóng.</w:t>
+        <w:t>- Đã thử nghiệm Fine-tune trên INCART nâng Accuracy lên 93.18%. Giải pháp căn cơ là cần huấn luyện đa nguồn (Multi-database).</w:t>
+      </w:r>
+    </w:p>
+    <w:p>
+      <w:pPr>
+        <w:pStyle w:val="ListBullet"/>
+        <w:spacing w:line="288" w:lineRule="auto" w:before="0" w:after="40"/>
+        <w:jc w:val="both"/>
+      </w:pPr>
+      <w:r>
+        <w:rPr>
+          <w:rFonts w:ascii="Times New Roman" w:hAnsi="Times New Roman"/>
+          <w:color w:val="334155"/>
+          <w:sz w:val="20"/>
+        </w:rPr>
+        <w:t>2. Ngưỡng quy tắc Rung nhĩ (AFib = 0.62): Chọn theo thực nghiệm trên MIT-BIH, cần tiếp tục kiểm định mù trên toàn bộ tập PhysioNet AFDB.</w:t>
+      </w:r>
+    </w:p>
+    <w:p>
+      <w:pPr>
+        <w:pStyle w:val="ListBullet"/>
+        <w:spacing w:line="288" w:lineRule="auto" w:before="0" w:after="40"/>
+        <w:jc w:val="both"/>
+      </w:pPr>
+      <w:r>
+        <w:rPr>
+          <w:rFonts w:ascii="Times New Roman" w:hAnsi="Times New Roman"/>
+          <w:color w:val="334155"/>
+          <w:sz w:val="20"/>
+        </w:rPr>
+        <w:t>3. Cảm biến phần cứng IoT: Hệ thống hiện chạy qua WebSocket simulator chuẩn 360Hz; chưa hàn nối trực tiếp module cảm biến AD8232/MAX30003 + ESP32.</w:t>
+      </w:r>
+    </w:p>
+    <w:p>
+      <w:pPr>
+        <w:pStyle w:val="ListBullet"/>
+        <w:spacing w:line="288" w:lineRule="auto" w:before="0" w:after="40"/>
+        <w:jc w:val="both"/>
+      </w:pPr>
+      <w:r>
+        <w:rPr>
+          <w:rFonts w:ascii="Times New Roman" w:hAnsi="Times New Roman"/>
+          <w:color w:val="334155"/>
+          <w:sz w:val="20"/>
+        </w:rPr>
+        <w:t>4. Thử nghiệm lâm sàng: Toàn bộ kết quả đo trên tập chuẩn quốc tế; chưa thử nghiệm mù đôi trực tiếp tại bệnh viện.</w:t>
       </w:r>
     </w:p>
     <w:p>
@@ -2326,7 +4473,7 @@
           <w:color w:val="1E293B"/>
           <w:sz w:val="21"/>
         </w:rPr>
-        <w:t xml:space="preserve">🎨 Hình vẽ / Sơ đồ / Chèn ảnh: </w:t>
+        <w:t xml:space="preserve">🎨 Hình vẽ / Biểu đồ chèn: </w:t>
       </w:r>
       <w:r>
         <w:rPr>
@@ -2334,7 +4481,7 @@
           <w:color w:val="334155"/>
           <w:sz w:val="21"/>
         </w:rPr>
-        <w:t>Ảnh chụp màn hình thực tế giao diện Dashboard đang chạy đồ thị ECG 2 kênh (chụp từ web app http://localhost:5173).</w:t>
+        <w:t>Chèn ảnh figures/09_cross_database_generalization.png (Biểu đồ kiểm nghiệm tổng quát hóa trên 3 tập ngoại vi).</w:t>
       </w:r>
     </w:p>
     <w:p>
@@ -2357,7 +4504,7 @@
           <w:color w:val="334155"/>
           <w:sz w:val="21"/>
         </w:rPr>
-        <w:t>"Giao diện không dùng các màu sắc sặc sỡ mà tuân thủ chuẩn công thái học y tế. Tính năng tắt chuông 2 phút tự bật lại được cài đặt đúng theo tiêu chuẩn an toàn thiết bị y tế IEC 60601-1-8..."</w:t>
+        <w:t>"Chúng em nhìn nhận trung thực rằng mô hình có hiện tượng sụt giảm độ nhạy ở lớp hiếm S và F khi gặp dữ liệu ngoài do khác biệt đạo trình đo. Nhóm đã thử nghiệm fine-tune thành công lên 93.18% và xác định giải pháp triệt để là train đa nguồn..."</w:t>
       </w:r>
     </w:p>
     <w:p>
@@ -2371,6 +4518,21 @@
           <w:sz w:val="18"/>
         </w:rPr>
         <w:t>―――――――――――――――――――――――――――――――――――――――――――――――――――――――</w:t>
+      </w:r>
+    </w:p>
+    <w:p>
+      <w:pPr>
+        <w:keepNext/>
+        <w:spacing w:before="320" w:after="120"/>
+      </w:pPr>
+      <w:r>
+        <w:rPr>
+          <w:rFonts w:ascii="Times New Roman" w:hAnsi="Times New Roman"/>
+          <w:b/>
+          <w:color w:val="1E3A8A"/>
+          <w:sz w:val="28"/>
+        </w:rPr>
+        <w:t>UNIT 5. TEAM REVIEW, CONCLUSION &amp; Q&amp;A (Tự Đánh Giá Nhóm, Kết Luận &amp; Bảo Vệ)</w:t>
       </w:r>
     </w:p>
     <w:p>
@@ -2385,7 +4547,7 @@
           <w:color w:val="2563EB"/>
           <w:sz w:val="24"/>
         </w:rPr>
-        <w:t>SLIDE 13: NHỮNG KẾT QUẢ ĐÃ HOÀN THÀNH 100% THEO ĐỀ CƯƠNG</w:t>
+        <w:t>SLIDE 17: 5.1. TEAM REVIEW, LESSONS LEARNED &amp; ROADMAP (TỰ ĐÁNH GIÁ NHÓM &amp; LỘ TRÌNH)</w:t>
       </w:r>
     </w:p>
     <w:p>
@@ -2400,7 +4562,7 @@
           <w:color w:val="1E293B"/>
           <w:sz w:val="21"/>
         </w:rPr>
-        <w:t xml:space="preserve">🎯 Mục tiêu cần làm: </w:t>
+        <w:t xml:space="preserve">🏷️ Khung Template SIC: </w:t>
       </w:r>
       <w:r>
         <w:rPr>
@@ -2408,7 +4570,30 @@
           <w:color w:val="334155"/>
           <w:sz w:val="21"/>
         </w:rPr>
-        <w:t>Tổng kết tự tin, rõ ràng các chỉ tiêu đã nghiệm thu vượt mức cam kết ban đầu.</w:t>
+        <w:t>Template Unit 5: Team Member Review and Comment</w:t>
+      </w:r>
+    </w:p>
+    <w:p>
+      <w:pPr>
+        <w:spacing w:line="300" w:lineRule="auto" w:before="0" w:after="60"/>
+        <w:jc w:val="both"/>
+      </w:pPr>
+      <w:r>
+        <w:rPr>
+          <w:rFonts w:ascii="Times New Roman" w:hAnsi="Times New Roman"/>
+          <w:b/>
+          <w:color w:val="1E293B"/>
+          <w:sz w:val="21"/>
+        </w:rPr>
+        <w:t xml:space="preserve">🎯 Mục tiêu đánh giá: </w:t>
+      </w:r>
+      <w:r>
+        <w:rPr>
+          <w:rFonts w:ascii="Times New Roman" w:hAnsi="Times New Roman"/>
+          <w:color w:val="334155"/>
+          <w:sz w:val="21"/>
+        </w:rPr>
+        <w:t>Đáp ứng đúng mục Team Review của Samsung SIC template, thể hiện sự trưởng thành và tinh thần đồng đội.</w:t>
       </w:r>
     </w:p>
     <w:p>
@@ -2437,7 +4622,7 @@
           <w:color w:val="334155"/>
           <w:sz w:val="20"/>
         </w:rPr>
-        <w:t>Hoàn thành trọn vẹn cả 6 Checkpoint (CP1 đến CP6) và 4 hạng mục mở rộng:</w:t>
+        <w:t>Tự đánh giá thành viên (Member Review &amp; Comment):</w:t>
       </w:r>
     </w:p>
     <w:p>
@@ -2452,7 +4637,7 @@
           <w:color w:val="334155"/>
           <w:sz w:val="20"/>
         </w:rPr>
-        <w:t>1. Nhận diện rối loạn nhịp tim: Accuracy 98.57% (chỉ tiêu &gt; 95%), Macro-F1 91.70% (chỉ tiêu &gt; 85%), Latency 0.13ms.</w:t>
+        <w:t>- Nguyễn Đào Nam Hải: 'Dự án giúp em làm chủ toàn diện từ mô hình Deep Learning 1D, kỹ thuật XAI Grad-CAM đến hạ tầng WebSocket độ trễ thấp và kiến trúc y tế chuẩn mực.'</w:t>
       </w:r>
     </w:p>
     <w:p>
@@ -2467,7 +4652,7 @@
           <w:color w:val="334155"/>
           <w:sz w:val="20"/>
         </w:rPr>
-        <w:t>2. Explainable AI: 1D Grad-CAM trích xuất bản đồ nhiệt giải thích trực quan từng nhịp tim cả trên stream và offline.</w:t>
+        <w:t>- Phan Thị Hải Yến: 'Quá trình tiền xử lý dữ liệu và phát hiện đỉnh R giúp em hiểu sâu sắc về tín hiệu số y sinh và bài học khắc phục rò rỉ dữ liệu trong Machine Learning.'</w:t>
       </w:r>
     </w:p>
     <w:p>
@@ -2482,7 +4667,7 @@
           <w:color w:val="334155"/>
           <w:sz w:val="20"/>
         </w:rPr>
-        <w:t>3. Tiền xử lý DSP: Bộ lọc dải thông và thuật toán Pan-Tompkins đạt F1 = 97.14% trên 20,546 nhịp tim thô.</w:t>
+        <w:t>Lộ trình phát triển tương lai (3 Giai đoạn):</w:t>
       </w:r>
     </w:p>
     <w:p>
@@ -2497,7 +4682,7 @@
           <w:color w:val="334155"/>
           <w:sz w:val="20"/>
         </w:rPr>
-        <w:t>4. Edge AI: ONNX INT8 dung lượng 697.3 KB (chỉ tiêu &lt; 700 KB). ONNX FP32 đạt độ trễ 0.29 ms.</w:t>
+        <w:t>- Giai đoạn 1 (Hiện tại): Hoàn thiện 100% hệ thống phần mềm Full-Stack, AI, XAI và Edge ONNX.</w:t>
       </w:r>
     </w:p>
     <w:p>
@@ -2512,7 +4697,7 @@
           <w:color w:val="334155"/>
           <w:sz w:val="20"/>
         </w:rPr>
-        <w:t>5. Phần mềm Full-Stack: WebSocket 360Hz 2 kênh, quản lý bệnh nhân, RBAC 3 vai trò, Human-in-the-loop, xuất báo cáo PDF.</w:t>
+        <w:t>- Giai đoạn 2 (Tiếp theo): Hàn nối mạch phần cứng cảm biến AD8232/MAX30003 kết nối ESP32 gửi dữ liệu qua WiFi/MQTT và kiểm định ngưỡng AFDB.</w:t>
       </w:r>
     </w:p>
     <w:p>
@@ -2527,7 +4712,7 @@
           <w:color w:val="334155"/>
           <w:sz w:val="20"/>
         </w:rPr>
-        <w:t>6. Chất lượng kiểm thử: 42/42 bài test pytest pass 100%, Lint sạch lỗi, Docker Compose và CI/CD GitHub Actions sẵn sàng.</w:t>
+        <w:t>- Giai đoạn 3 (Ứng dụng): Thử nghiệm lâm sàng tại các khoa Tim mạch bệnh viện.</w:t>
       </w:r>
     </w:p>
     <w:p>
@@ -2542,7 +4727,7 @@
           <w:color w:val="1E293B"/>
           <w:sz w:val="21"/>
         </w:rPr>
-        <w:t xml:space="preserve">🎨 Hình vẽ / Sơ đồ / Chèn ảnh: </w:t>
+        <w:t xml:space="preserve">🎨 Hình vẽ / Biểu đồ chèn: </w:t>
       </w:r>
       <w:r>
         <w:rPr>
@@ -2550,7 +4735,7 @@
           <w:color w:val="334155"/>
           <w:sz w:val="21"/>
         </w:rPr>
-        <w:t>Bảng checklist đối chiếu tiến độ 6 Checkpoint màu xanh lá cây với các icon tích xanh ✅ cho toàn bộ các hạng mục.</w:t>
+        <w:t>Bảng tự nhận xét 2 thành viên kèm sơ đồ Roadmap 3 giai đoạn hướng tới thương mại hóa thiết bị y tế.</w:t>
       </w:r>
     </w:p>
     <w:p>
@@ -2573,7 +4758,7 @@
           <w:color w:val="334155"/>
           <w:sz w:val="21"/>
         </w:rPr>
-        <w:t>"Nhìn lại toàn bộ quá trình, nhóm đã hoàn thành đầy đủ 100% tất cả các cam kết trong đề cương, mọi con số đo lường đều có bằng chứng kiểm thử tự động..."</w:t>
+        <w:t>"Qua dự án Capstone SIC, cả hai thành viên trong nhóm đều đã trưởng thành vượt bậc về cả kỹ năng công nghệ thực chiến lẫn năng lực giải quyết vấn đề thực tế..."</w:t>
       </w:r>
     </w:p>
     <w:p>
@@ -2601,7 +4786,7 @@
           <w:color w:val="2563EB"/>
           <w:sz w:val="24"/>
         </w:rPr>
-        <w:t>SLIDE 14: ĐÁNH GIÁ TRUNG THỰC: HẠN CHẾ KỸ THUẬT &amp; NGUYÊN NHÂN KHOA HỌC</w:t>
+        <w:t>SLIDE 18: 5.2. CONCLUSION, ACKNOWLEDGMENTS &amp; Q&amp;A (KẾT LUẬN, LỜI CẢM ƠN &amp; PHẢN BIỆN)</w:t>
       </w:r>
     </w:p>
     <w:p>
@@ -2616,7 +4801,7 @@
           <w:color w:val="1E293B"/>
           <w:sz w:val="21"/>
         </w:rPr>
-        <w:t xml:space="preserve">🎯 Mục tiêu cần làm: </w:t>
+        <w:t xml:space="preserve">🏷️ Khung Template SIC: </w:t>
       </w:r>
       <w:r>
         <w:rPr>
@@ -2624,7 +4809,30 @@
           <w:color w:val="334155"/>
           <w:sz w:val="21"/>
         </w:rPr>
-        <w:t>Thể hiện tư duy khoa học trung thực, chỉ rõ nguyên nhân và giải pháp (điểm gây ấn tượng mạnh nhất).</w:t>
+        <w:t>Template Unit 6: Instructor Review &amp; Q&amp;A Session</w:t>
+      </w:r>
+    </w:p>
+    <w:p>
+      <w:pPr>
+        <w:spacing w:line="300" w:lineRule="auto" w:before="0" w:after="60"/>
+        <w:jc w:val="both"/>
+      </w:pPr>
+      <w:r>
+        <w:rPr>
+          <w:rFonts w:ascii="Times New Roman" w:hAnsi="Times New Roman"/>
+          <w:b/>
+          <w:color w:val="1E293B"/>
+          <w:sz w:val="21"/>
+        </w:rPr>
+        <w:t xml:space="preserve">🎯 Mục tiêu đánh giá: </w:t>
+      </w:r>
+      <w:r>
+        <w:rPr>
+          <w:rFonts w:ascii="Times New Roman" w:hAnsi="Times New Roman"/>
+          <w:color w:val="334155"/>
+          <w:sz w:val="21"/>
+        </w:rPr>
+        <w:t>Kết thúc bài thuyết trình trang trọng, lắng đọng và tự tin bước vào phiên hỏi đáp phản biện (Ăn trọn 10% điểm Phản biện).</w:t>
       </w:r>
     </w:p>
     <w:p>
@@ -2653,7 +4861,7 @@
           <w:color w:val="334155"/>
           <w:sz w:val="20"/>
         </w:rPr>
-        <w:t>1. Khả năng tổng quát hóa lớp hiếm (S/F) khi gặp dữ liệu ngoài (Domain Shift):</w:t>
+        <w:t>Kết luận: NEURO-ECG đã hoàn thành xuất sắc toàn bộ mục tiêu đề cương Capstone Project SIC 2026: Chính xác (98.57%), Nhanh (0.13ms), Minh bạch (1D Grad-CAM), Nhẹ cho Edge (ONNX 697KB), và An toàn pháp lý (Human-in-the-loop Audit Trail).</w:t>
       </w:r>
     </w:p>
     <w:p>
@@ -2668,7 +4876,7 @@
           <w:color w:val="334155"/>
           <w:sz w:val="20"/>
         </w:rPr>
-        <w:t>- Kiểm nghiệm trên INCART, SVDB, EDB: Lớp N và V duy trì độ chính xác cao (78%-94%), nhưng lớp S và F bị sụt giảm Recall (SVDB Recall_S = 0.4%, EDB = 3.6%).</w:t>
+        <w:t>Lời cảm ơn chân thành:</w:t>
       </w:r>
     </w:p>
     <w:p>
@@ -2683,7 +4891,7 @@
           <w:color w:val="334155"/>
           <w:sz w:val="20"/>
         </w:rPr>
-        <w:t>- Nguyên nhân: Do sự sai khác về vị trí đạo trình đo giữa các máy và số lượng mẫu gốc quá ít trong tập train (chỉ chiếm 2.5% và 0.7%).</w:t>
+        <w:t>- Kính gửi lời cảm ơn sâu sắc đến Ban Giảng viên Chương trình Samsung Innovation Campus (SIC) 2026.</w:t>
       </w:r>
     </w:p>
     <w:p>
@@ -2698,7 +4906,7 @@
           <w:color w:val="334155"/>
           <w:sz w:val="20"/>
         </w:rPr>
-        <w:t>- Giải pháp: Nhóm đã thử nghiệm Fine-tune trên INCART nâng Accuracy lên 93.18%. Về lâu dài cần huấn luyện đa nguồn (Multi-database).</w:t>
+        <w:t>- Chân thành cảm ơn các Thầy Cô giáo Viện CNTT&amp;TT — Đại học Bách Khoa Hà Nội.</w:t>
       </w:r>
     </w:p>
     <w:p>
@@ -2713,7 +4921,7 @@
           <w:color w:val="334155"/>
           <w:sz w:val="20"/>
         </w:rPr>
-        <w:t>2. Ngưỡng quy tắc Rung nhĩ (AFib = 0.62): Chọn theo thực nghiệm trên MIT-BIH, chưa qua kiểm định mù trên toàn bộ tập PhysioNet AFDB.</w:t>
+        <w:t>- Cảm ơn Tập đoàn Điện tử Samsung (Samsung Electronics Vietnam) đã tài trợ và đồng hành.</w:t>
       </w:r>
     </w:p>
     <w:p>
@@ -2728,22 +4936,7 @@
           <w:color w:val="334155"/>
           <w:sz w:val="20"/>
         </w:rPr>
-        <w:t>3. Cảm biến phần cứng IoT: Hệ thống hiện chạy qua WebSocket simulator chuẩn 360Hz; chưa hàn nối trực tiếp module cảm biến AD8232/MAX30003 + ESP32.</w:t>
-      </w:r>
-    </w:p>
-    <w:p>
-      <w:pPr>
-        <w:pStyle w:val="ListBullet"/>
-        <w:spacing w:line="288" w:lineRule="auto" w:before="0" w:after="40"/>
-        <w:jc w:val="both"/>
-      </w:pPr>
-      <w:r>
-        <w:rPr>
-          <w:rFonts w:ascii="Times New Roman" w:hAnsi="Times New Roman"/>
-          <w:color w:val="334155"/>
-          <w:sz w:val="20"/>
-        </w:rPr>
-        <w:t>4. Thử nghiệm lâm sàng: Chưa có điều kiện thử nghiệm mù đôi trực tiếp tại bệnh viện.</w:t>
+        <w:t>Q &amp; A: Nhóm kính mời Hội đồng Giảng viên đặt câu hỏi và đóng góp ý kiến!</w:t>
       </w:r>
     </w:p>
     <w:p>
@@ -2758,7 +4951,7 @@
           <w:color w:val="1E293B"/>
           <w:sz w:val="21"/>
         </w:rPr>
-        <w:t xml:space="preserve">🎨 Hình vẽ / Sơ đồ / Chèn ảnh: </w:t>
+        <w:t xml:space="preserve">🎨 Hình vẽ / Biểu đồ chèn: </w:t>
       </w:r>
       <w:r>
         <w:rPr>
@@ -2766,7 +4959,7 @@
           <w:color w:val="334155"/>
           <w:sz w:val="21"/>
         </w:rPr>
-        <w:t>Chèn ảnh figures/09_cross_database_generalization.png (Biểu đồ kiểm nghiệm tổng quát hóa trên 3 tập ngoại vi).</w:t>
+        <w:t>Dòng chữ lớn trang trọng: 'XIN CHÂN THÀNH CẢM ƠN HỘI ĐỒNG GIẢNG VIÊN!' kèm khung chữ 'PHIÊN HỎI ĐÁP PHẢN BIỆN — Q &amp; A'.</w:t>
       </w:r>
     </w:p>
     <w:p>
@@ -2789,7 +4982,7 @@
           <w:color w:val="334155"/>
           <w:sz w:val="21"/>
         </w:rPr>
-        <w:t>"Chúng em không giấu giếm khuyết điểm: khi thử nghiệm trên các tập dữ liệu bên ngoài, lớp hiếm S và F bị tụt độ nhạy do khác biệt vị trí đặt điện cực. Nhóm đã thử nghiệm fine-tune thành công lên 93.18% và xác định giải pháp triệt để là train đa nguồn..."</w:t>
+        <w:t>"Trên đây là toàn bộ báo cáo đồ án tốt nghiệp Capstone Project của nhóm chúng em. Chúng em xin chân thành cảm ơn các Thầy và rất mong nhận được những câu hỏi phản biện từ Hội đồng!"</w:t>
       </w:r>
     </w:p>
     <w:p>
@@ -2808,16 +5001,16 @@
     <w:p>
       <w:pPr>
         <w:keepNext/>
-        <w:spacing w:before="240" w:after="80"/>
+        <w:spacing w:before="320" w:after="120"/>
       </w:pPr>
       <w:r>
         <w:rPr>
           <w:rFonts w:ascii="Times New Roman" w:hAnsi="Times New Roman"/>
           <w:b/>
-          <w:color w:val="2563EB"/>
-          <w:sz w:val="24"/>
-        </w:rPr>
-        <w:t>SLIDE 15: ĐỀ XUẤT ĐỊNH HƯỚNG &amp; XIN Ý KIẾN BAN GIẢNG VIÊN</w:t>
+          <w:color w:val="1E3A8A"/>
+          <w:sz w:val="28"/>
+        </w:rPr>
+        <w:t>III. BỘ CÂU HỎI PHẢN BIỆN DỰ KIẾN TỪ HỘI ĐỒNG VÀ GỢI Ý TRẢ LỜI</w:t>
       </w:r>
     </w:p>
     <w:p>
@@ -2832,7 +5025,7 @@
           <w:color w:val="1E293B"/>
           <w:sz w:val="21"/>
         </w:rPr>
-        <w:t xml:space="preserve">🎯 Mục tiêu cần làm: </w:t>
+        <w:t xml:space="preserve">❓ </w:t>
       </w:r>
       <w:r>
         <w:rPr>
@@ -2840,96 +5033,7 @@
           <w:color w:val="334155"/>
           <w:sz w:val="21"/>
         </w:rPr>
-        <w:t>Mở rộng tầm nhìn phát triển và cầu thị xin ý kiến định hướng từ Hội đồng.</w:t>
-      </w:r>
-    </w:p>
-    <w:p>
-      <w:pPr>
-        <w:spacing w:line="300" w:lineRule="auto" w:before="0" w:after="60"/>
-        <w:jc w:val="both"/>
-      </w:pPr>
-      <w:r>
-        <w:rPr>
-          <w:rFonts w:ascii="Times New Roman" w:hAnsi="Times New Roman"/>
-          <w:color w:val="334155"/>
-          <w:sz w:val="21"/>
-        </w:rPr>
-        <w:t>Nội dung hiển thị trên slide:</w:t>
-      </w:r>
-    </w:p>
-    <w:p>
-      <w:pPr>
-        <w:pStyle w:val="ListBullet"/>
-        <w:spacing w:line="288" w:lineRule="auto" w:before="0" w:after="40"/>
-        <w:jc w:val="both"/>
-      </w:pPr>
-      <w:r>
-        <w:rPr>
-          <w:rFonts w:ascii="Times New Roman" w:hAnsi="Times New Roman"/>
-          <w:color w:val="334155"/>
-          <w:sz w:val="20"/>
-        </w:rPr>
-        <w:t>Nhóm kính mong nhận được ý kiến đóng góp từ các Thầy:</w:t>
-      </w:r>
-    </w:p>
-    <w:p>
-      <w:pPr>
-        <w:pStyle w:val="ListBullet"/>
-        <w:spacing w:line="288" w:lineRule="auto" w:before="0" w:after="40"/>
-        <w:jc w:val="both"/>
-      </w:pPr>
-      <w:r>
-        <w:rPr>
-          <w:rFonts w:ascii="Times New Roman" w:hAnsi="Times New Roman"/>
-          <w:color w:val="334155"/>
-          <w:sz w:val="20"/>
-        </w:rPr>
-        <w:t>1. Về giải thuật AI: Định hướng áp dụng kỹ thuật Loss Re-weighting hoặc Contrastive Learning để nâng cao năng lực biểu diễn cho lớp hiếm S và F khi huấn luyện đa nguồn.</w:t>
-      </w:r>
-    </w:p>
-    <w:p>
-      <w:pPr>
-        <w:pStyle w:val="ListBullet"/>
-        <w:spacing w:line="288" w:lineRule="auto" w:before="0" w:after="40"/>
-        <w:jc w:val="both"/>
-      </w:pPr>
-      <w:r>
-        <w:rPr>
-          <w:rFonts w:ascii="Times New Roman" w:hAnsi="Times New Roman"/>
-          <w:color w:val="334155"/>
-          <w:sz w:val="20"/>
-        </w:rPr>
-        <w:t>2. Về kiểm định Rung nhĩ: Thiết lập giao thức tối ưu hóa ngưỡng cảnh báo trên tập dữ liệu chuyên biệt PhysioNet AFDB.</w:t>
-      </w:r>
-    </w:p>
-    <w:p>
-      <w:pPr>
-        <w:pStyle w:val="ListBullet"/>
-        <w:spacing w:line="288" w:lineRule="auto" w:before="0" w:after="40"/>
-        <w:jc w:val="both"/>
-      </w:pPr>
-      <w:r>
-        <w:rPr>
-          <w:rFonts w:ascii="Times New Roman" w:hAnsi="Times New Roman"/>
-          <w:color w:val="334155"/>
-          <w:sz w:val="20"/>
-        </w:rPr>
-        <w:t>3. Về chuẩn hóa y tế: Góp ý về quy trình Human-in-the-loop và cấu trúc báo cáo bệnh án để tiếp cận sát nhất với tiêu chuẩn phần mềm thiết bị y tế (SaMD).</w:t>
-      </w:r>
-    </w:p>
-    <w:p>
-      <w:pPr>
-        <w:pStyle w:val="ListBullet"/>
-        <w:spacing w:line="288" w:lineRule="auto" w:before="0" w:after="40"/>
-        <w:jc w:val="both"/>
-      </w:pPr>
-      <w:r>
-        <w:rPr>
-          <w:rFonts w:ascii="Times New Roman" w:hAnsi="Times New Roman"/>
-          <w:color w:val="334155"/>
-          <w:sz w:val="20"/>
-        </w:rPr>
-        <w:t>Lộ trình tương lai: Tích hợp vi điều khiển ESP32 và module cảm biến ECG AD8232/MAX30003 truyền dữ liệu thời gian thực qua giao thức WiFi/MQTT.</w:t>
+        <w:t>Câu hỏi 1 (Về tính hoàn chỉnh): Tại sao nhóm chọn kiến trúc 1D CNN mà không dùng 2D CNN chuyển ảnh phổ (Spectrogram)?</w:t>
       </w:r>
     </w:p>
     <w:p>
@@ -2944,7 +5048,7 @@
           <w:color w:val="1E293B"/>
           <w:sz w:val="21"/>
         </w:rPr>
-        <w:t xml:space="preserve">🎨 Hình vẽ / Sơ đồ / Chèn ảnh: </w:t>
+        <w:t xml:space="preserve">💡 </w:t>
       </w:r>
       <w:r>
         <w:rPr>
@@ -2952,8 +5056,13 @@
           <w:color w:val="334155"/>
           <w:sz w:val="21"/>
         </w:rPr>
-        <w:t>Sơ đồ Roadmap 3 giai đoạn: [Giai đoạn 1: Hoàn thiện AI &amp; Web (Hiện tại)] -&gt; [Giai đoạn 2: Tích hợp phần cứng IoT ESP32 &amp; AFDB] -&gt; [Giai đoạn 3: Thử nghiệm lâm sàng tại bệnh viện].</w:t>
-      </w:r>
+        <w:t>Gợi ý trả lời: Mô hình 1D xử lý trực tiếp trên chuỗi tín hiệu thời gian nên có 3 ưu điểm vượt trội cho bài toán thời gian thực: (1) Tiết kiệm tài nguyên tính toán vì không mất công biến đổi Fourier liên tục (STFT/CWT) sang ảnh phổ; (2) Độ trễ suy luận siêu thấp (chỉ 0.13ms so với hàng chục ms của 2D CNN), cho phép truyền phát mượt mà 36 gói/giây; (3) Dung lượng mô hình 1D rất nhẹ (chỉ 692k tham số), dễ dàng lượng tử hóa xuống 697 KB để nhúng vào thiết bị đeo IoT.</w:t>
+      </w:r>
+    </w:p>
+    <w:p>
+      <w:pPr>
+        <w:spacing w:before="40" w:after="80"/>
+      </w:pPr>
     </w:p>
     <w:p>
       <w:pPr>
@@ -2967,7 +5076,7 @@
           <w:color w:val="1E293B"/>
           <w:sz w:val="21"/>
         </w:rPr>
-        <w:t xml:space="preserve">🎙️ Lời thoại gợi ý (Speaker Notes): </w:t>
+        <w:t xml:space="preserve">❓ </w:t>
       </w:r>
       <w:r>
         <w:rPr>
@@ -2975,35 +5084,7 @@
           <w:color w:val="334155"/>
           <w:sz w:val="21"/>
         </w:rPr>
-        <w:t>"Chúng em rất mong nhận được sự định hướng của các Thầy về mặt thuật toán và chuẩn y tế để nhóm có thể tiếp tục phát triển đề tài thành một sản phẩm thiết bị y tế hoàn chỉnh..."</w:t>
-      </w:r>
-    </w:p>
-    <w:p>
-      <w:pPr>
-        <w:spacing w:before="80" w:after="160"/>
-      </w:pPr>
-      <w:r>
-        <w:rPr>
-          <w:rFonts w:ascii="Times New Roman" w:hAnsi="Times New Roman"/>
-          <w:color w:val="E2E8F0"/>
-          <w:sz w:val="18"/>
-        </w:rPr>
-        <w:t>―――――――――――――――――――――――――――――――――――――――――――――――――――――――</w:t>
-      </w:r>
-    </w:p>
-    <w:p>
-      <w:pPr>
-        <w:keepNext/>
-        <w:spacing w:before="240" w:after="80"/>
-      </w:pPr>
-      <w:r>
-        <w:rPr>
-          <w:rFonts w:ascii="Times New Roman" w:hAnsi="Times New Roman"/>
-          <w:b/>
-          <w:color w:val="2563EB"/>
-          <w:sz w:val="24"/>
-        </w:rPr>
-        <w:t>SLIDE 16: KỊCH BẢN LIVE DEMO 5 PHA TRỰC TIẾP</w:t>
+        <w:t>Câu hỏi 2 (Về hạn chế khoa học): Tại sao độ chính xác trên tập ngoài (INCART, SVDB, EDB) của lớp S và F lại bị giảm nhiều như vậy?</w:t>
       </w:r>
     </w:p>
     <w:p>
@@ -3018,7 +5099,7 @@
           <w:color w:val="1E293B"/>
           <w:sz w:val="21"/>
         </w:rPr>
-        <w:t xml:space="preserve">🎯 Mục tiêu cần làm: </w:t>
+        <w:t xml:space="preserve">💡 </w:t>
       </w:r>
       <w:r>
         <w:rPr>
@@ -3026,112 +5107,13 @@
           <w:color w:val="334155"/>
           <w:sz w:val="21"/>
         </w:rPr>
-        <w:t>Giới thiệu kịch bản rõ ràng trước khi chuyển màn hình sang chạy demo trực tiếp.</w:t>
+        <w:t>Gợi ý trả lời: Thưa các Thầy, đây là hiện tượng Domain Shift kinh điển trong y sinh do 2 nguyên nhân cốt lõi: Thứ nhất, sự sai khác về vị trí đạo trình đo giữa các thiết bị ghi (ví dụ INCART dùng 12 chuyển đạo tiêu chuẩn, trong khi MIT-BIH dùng chuyển đạo sửa đổi MLII), khiến hình thái sóng P của lớp S bị biến dạng. Thứ hai, số lượng mẫu lớp S và F trong tự nhiên quá ít (chỉ 2.5% và 0.7%), khiến mặt quyết định bị chèn ép. Nhóm đã thử nghiệm Fine-tune trên INCART nâng được độ chính xác lên 93.18%, và xác định giải pháp căn cơ là cần huấn luyện đa nguồn (Multi-database training) trong tương lai.</w:t>
       </w:r>
     </w:p>
     <w:p>
       <w:pPr>
-        <w:spacing w:line="300" w:lineRule="auto" w:before="0" w:after="60"/>
-        <w:jc w:val="both"/>
-      </w:pPr>
-      <w:r>
-        <w:rPr>
-          <w:rFonts w:ascii="Times New Roman" w:hAnsi="Times New Roman"/>
-          <w:color w:val="334155"/>
-          <w:sz w:val="21"/>
-        </w:rPr>
-        <w:t>Nội dung hiển thị trên slide:</w:t>
-      </w:r>
-    </w:p>
-    <w:p>
-      <w:pPr>
-        <w:pStyle w:val="ListBullet"/>
-        <w:spacing w:line="288" w:lineRule="auto" w:before="0" w:after="40"/>
-        <w:jc w:val="both"/>
-      </w:pPr>
-      <w:r>
-        <w:rPr>
-          <w:rFonts w:ascii="Times New Roman" w:hAnsi="Times New Roman"/>
-          <w:color w:val="334155"/>
-          <w:sz w:val="20"/>
-        </w:rPr>
-        <w:t>Kịch bản trình diễn 5 pha liên hoàn:</w:t>
-      </w:r>
-    </w:p>
-    <w:p>
-      <w:pPr>
-        <w:pStyle w:val="ListBullet"/>
-        <w:spacing w:line="288" w:lineRule="auto" w:before="0" w:after="40"/>
-        <w:jc w:val="both"/>
-      </w:pPr>
-      <w:r>
-        <w:rPr>
-          <w:rFonts w:ascii="Times New Roman" w:hAnsi="Times New Roman"/>
-          <w:color w:val="334155"/>
-          <w:sz w:val="20"/>
-        </w:rPr>
-        <w:t>- Pha 1 (Streaming 360Hz): Phát Record 100 (Bình thường), đồ thị 2 kênh mượt mà 60 FPS, nhịp tim ~75 BPM. Chuyển sang Record 200 (Bệnh nhân có nhiều PVC), AI lập tức bắt nhịp và dán nhãn màu đỏ 'Ventricular Ectopic' với độ tin cậy &gt; 95%.</w:t>
-      </w:r>
-    </w:p>
-    <w:p>
-      <w:pPr>
-        <w:pStyle w:val="ListBullet"/>
-        <w:spacing w:line="288" w:lineRule="auto" w:before="0" w:after="40"/>
-        <w:jc w:val="both"/>
-      </w:pPr>
-      <w:r>
-        <w:rPr>
-          <w:rFonts w:ascii="Times New Roman" w:hAnsi="Times New Roman"/>
-          <w:color w:val="334155"/>
-          <w:sz w:val="20"/>
-        </w:rPr>
-        <w:t>- Pha 2 (Báo động chuẩn IEC 60601-1-8): Kích hoạt chuông âm thanh và đèn chớp đỏ; bấm nút 'Tắt tiếng tạm thời 2 phút'.</w:t>
-      </w:r>
-    </w:p>
-    <w:p>
-      <w:pPr>
-        <w:pStyle w:val="ListBullet"/>
-        <w:spacing w:line="288" w:lineRule="auto" w:before="0" w:after="40"/>
-        <w:jc w:val="both"/>
-      </w:pPr>
-      <w:r>
-        <w:rPr>
-          <w:rFonts w:ascii="Times New Roman" w:hAnsi="Times New Roman"/>
-          <w:color w:val="334155"/>
-          <w:sz w:val="20"/>
-        </w:rPr>
-        <w:t>- Pha 3 (Explainable AI 1D Grad-CAM): Nhấp vào nhịp PVC trên đồ thị, bản đồ nhiệt Grad-CAM hiển thị đỏ rực tại phức bộ QRS giãn rộng.</w:t>
-      </w:r>
-    </w:p>
-    <w:p>
-      <w:pPr>
-        <w:pStyle w:val="ListBullet"/>
-        <w:spacing w:line="288" w:lineRule="auto" w:before="0" w:after="40"/>
-        <w:jc w:val="both"/>
-      </w:pPr>
-      <w:r>
-        <w:rPr>
-          <w:rFonts w:ascii="Times New Roman" w:hAnsi="Times New Roman"/>
-          <w:color w:val="334155"/>
-          <w:sz w:val="20"/>
-        </w:rPr>
-        <w:t>- Pha 4 (Human-in-the-loop &amp; Xuất PDF): Đăng nhập tài khoản Bác sĩ, duyệt/sửa nhãn, kiểm tra Audit Trail và nhấn nút xuất báo cáo bệnh án PDF.</w:t>
-      </w:r>
-    </w:p>
-    <w:p>
-      <w:pPr>
-        <w:pStyle w:val="ListBullet"/>
-        <w:spacing w:line="288" w:lineRule="auto" w:before="0" w:after="40"/>
-        <w:jc w:val="both"/>
-      </w:pPr>
-      <w:r>
-        <w:rPr>
-          <w:rFonts w:ascii="Times New Roman" w:hAnsi="Times New Roman"/>
-          <w:color w:val="334155"/>
-          <w:sz w:val="20"/>
-        </w:rPr>
-        <w:t>- Pha 5 (Chẩn đoán ngoại tuyến &amp; Edge AI): Tải file CSV ngoài phân tích trong vài giây; kiểm tra mô hình ONNX INT8 697.3 KB.</w:t>
-      </w:r>
+        <w:spacing w:before="40" w:after="80"/>
+      </w:pPr>
     </w:p>
     <w:p>
       <w:pPr>
@@ -3145,7 +5127,7 @@
           <w:color w:val="1E293B"/>
           <w:sz w:val="21"/>
         </w:rPr>
-        <w:t xml:space="preserve">🎨 Hình vẽ / Sơ đồ / Chèn ảnh: </w:t>
+        <w:t xml:space="preserve">❓ </w:t>
       </w:r>
       <w:r>
         <w:rPr>
@@ -3153,7 +5135,7 @@
           <w:color w:val="334155"/>
           <w:sz w:val="21"/>
         </w:rPr>
-        <w:t>Sơ đồ Timeline 5 bước đánh số 1 -&gt; 5 với các biểu tượng trực quan (Sóng ECG, Chuông báo động, Não bộ XAI, Bác sĩ duyệt nhãn, Tệp báo cáo PDF).</w:t>
+        <w:t>Câu hỏi 3 (Về tính sáng tạo &amp; y đức): Nếu AI đưa ra chẩn đoán sai thì hệ thống xử lý trách nhiệm y tế như thế nào?</w:t>
       </w:r>
     </w:p>
     <w:p>
@@ -3168,7 +5150,7 @@
           <w:color w:val="1E293B"/>
           <w:sz w:val="21"/>
         </w:rPr>
-        <w:t xml:space="preserve">🎙️ Lời thoại gợi ý (Speaker Notes): </w:t>
+        <w:t xml:space="preserve">💡 </w:t>
       </w:r>
       <w:r>
         <w:rPr>
@@ -3176,36 +5158,13 @@
           <w:color w:val="334155"/>
           <w:sz w:val="21"/>
         </w:rPr>
-        <w:t>"Sau đây nhóm xin phép trình diễn trực tiếp 5 pha kịch bản trên máy chủ thực tế để Hội đồng kiểm chứng các tính năng của hệ thống..."</w:t>
+        <w:t>Gợi ý trả lời: Hệ thống của nhóm kiên định triết lý 'AI chỉ là trợ lý sàng lọc, Bác sĩ mới là người quyết định cuối cùng'. Khi AI phát hiện bất thường, nó chỉ gắn cờ cảnh báo kèm độ tin cậy và bản đồ nhiệt XAI. Bác sĩ chuyên khoa sẽ vào thẩm định, nếu AI sai bác sĩ có quyền bấm sửa nhãn. Mọi thao tác đều được hệ thống ghi tự động vào bảng Audit Trail với dấu thời gian chính xác, ID bác sĩ và lý do sửa nhãn để đảm bảo truy vết trách nhiệm pháp lý tuyệt đối.</w:t>
       </w:r>
     </w:p>
     <w:p>
       <w:pPr>
-        <w:spacing w:before="80" w:after="160"/>
-      </w:pPr>
-      <w:r>
-        <w:rPr>
-          <w:rFonts w:ascii="Times New Roman" w:hAnsi="Times New Roman"/>
-          <w:color w:val="E2E8F0"/>
-          <w:sz w:val="18"/>
-        </w:rPr>
-        <w:t>―――――――――――――――――――――――――――――――――――――――――――――――――――――――</w:t>
-      </w:r>
-    </w:p>
-    <w:p>
-      <w:pPr>
-        <w:keepNext/>
-        <w:spacing w:before="240" w:after="80"/>
-      </w:pPr>
-      <w:r>
-        <w:rPr>
-          <w:rFonts w:ascii="Times New Roman" w:hAnsi="Times New Roman"/>
-          <w:b/>
-          <w:color w:val="2563EB"/>
-          <w:sz w:val="24"/>
-        </w:rPr>
-        <w:t>SLIDE 17: TRÌNH DIỄN HỆ THỐNG TRỰC TIẾP (LIVE DEMO SESSION)</w:t>
-      </w:r>
+        <w:spacing w:before="40" w:after="80"/>
+      </w:pPr>
     </w:p>
     <w:p>
       <w:pPr>
@@ -3219,7 +5178,7 @@
           <w:color w:val="1E293B"/>
           <w:sz w:val="21"/>
         </w:rPr>
-        <w:t xml:space="preserve">🎯 Mục tiêu cần làm: </w:t>
+        <w:t xml:space="preserve">❓ </w:t>
       </w:r>
       <w:r>
         <w:rPr>
@@ -3227,487 +5186,7 @@
           <w:color w:val="334155"/>
           <w:sz w:val="21"/>
         </w:rPr>
-        <w:t>Giữ slide này trên màn hình máy chiếu trong lúc chuyển sang trình duyệt web thao tác demo.</w:t>
-      </w:r>
-    </w:p>
-    <w:p>
-      <w:pPr>
-        <w:spacing w:line="300" w:lineRule="auto" w:before="0" w:after="60"/>
-        <w:jc w:val="both"/>
-      </w:pPr>
-      <w:r>
-        <w:rPr>
-          <w:rFonts w:ascii="Times New Roman" w:hAnsi="Times New Roman"/>
-          <w:color w:val="334155"/>
-          <w:sz w:val="21"/>
-        </w:rPr>
-        <w:t>Nội dung hiển thị trên slide:</w:t>
-      </w:r>
-    </w:p>
-    <w:p>
-      <w:pPr>
-        <w:pStyle w:val="ListBullet"/>
-        <w:spacing w:line="288" w:lineRule="auto" w:before="0" w:after="40"/>
-        <w:jc w:val="both"/>
-      </w:pPr>
-      <w:r>
-        <w:rPr>
-          <w:rFonts w:ascii="Times New Roman" w:hAnsi="Times New Roman"/>
-          <w:color w:val="334155"/>
-          <w:sz w:val="20"/>
-        </w:rPr>
-        <w:t>TRÌNH DIỄN HỆ THỐNG TRỰC TIẾP TRÊN TRÌNH DUYỆT (LIVE DEMO)</w:t>
-      </w:r>
-    </w:p>
-    <w:p>
-      <w:pPr>
-        <w:pStyle w:val="ListBullet"/>
-        <w:spacing w:line="288" w:lineRule="auto" w:before="0" w:after="40"/>
-        <w:jc w:val="both"/>
-      </w:pPr>
-      <w:r>
-        <w:rPr>
-          <w:rFonts w:ascii="Times New Roman" w:hAnsi="Times New Roman"/>
-          <w:color w:val="334155"/>
-          <w:sz w:val="20"/>
-        </w:rPr>
-        <w:t>- Địa chỉ truy cập hệ thống: http://localhost:5173</w:t>
-      </w:r>
-    </w:p>
-    <w:p>
-      <w:pPr>
-        <w:pStyle w:val="ListBullet"/>
-        <w:spacing w:line="288" w:lineRule="auto" w:before="0" w:after="40"/>
-        <w:jc w:val="both"/>
-      </w:pPr>
-      <w:r>
-        <w:rPr>
-          <w:rFonts w:ascii="Times New Roman" w:hAnsi="Times New Roman"/>
-          <w:color w:val="334155"/>
-          <w:sz w:val="20"/>
-        </w:rPr>
-        <w:t>- Tần số phát luồng: 360 Hz (36 gói/giây) qua giao thức WebSocket hai chiều</w:t>
-      </w:r>
-    </w:p>
-    <w:p>
-      <w:pPr>
-        <w:pStyle w:val="ListBullet"/>
-        <w:spacing w:line="288" w:lineRule="auto" w:before="0" w:after="40"/>
-        <w:jc w:val="both"/>
-      </w:pPr>
-      <w:r>
-        <w:rPr>
-          <w:rFonts w:ascii="Times New Roman" w:hAnsi="Times New Roman"/>
-          <w:color w:val="334155"/>
-          <w:sz w:val="20"/>
-        </w:rPr>
-        <w:t>- Kế hoạch dự phòng: Đã đóng gói sẵn Docker Compose và video 4K backup.</w:t>
-      </w:r>
-    </w:p>
-    <w:p>
-      <w:pPr>
-        <w:spacing w:line="300" w:lineRule="auto" w:before="0" w:after="60"/>
-        <w:jc w:val="both"/>
-      </w:pPr>
-      <w:r>
-        <w:rPr>
-          <w:rFonts w:ascii="Times New Roman" w:hAnsi="Times New Roman"/>
-          <w:b/>
-          <w:color w:val="1E293B"/>
-          <w:sz w:val="21"/>
-        </w:rPr>
-        <w:t xml:space="preserve">🎨 Hình vẽ / Sơ đồ / Chèn ảnh: </w:t>
-      </w:r>
-      <w:r>
-        <w:rPr>
-          <w:rFonts w:ascii="Times New Roman" w:hAnsi="Times New Roman"/>
-          <w:color w:val="334155"/>
-          <w:sz w:val="21"/>
-        </w:rPr>
-        <w:t>Hình mockup màn hình Dashboard lớn kèm thông điệp: 'Kính mời Hội đồng cùng theo dõi thao tác trực tiếp trên màn hình'.</w:t>
-      </w:r>
-    </w:p>
-    <w:p>
-      <w:pPr>
-        <w:spacing w:line="300" w:lineRule="auto" w:before="0" w:after="60"/>
-        <w:jc w:val="both"/>
-      </w:pPr>
-      <w:r>
-        <w:rPr>
-          <w:rFonts w:ascii="Times New Roman" w:hAnsi="Times New Roman"/>
-          <w:b/>
-          <w:color w:val="1E293B"/>
-          <w:sz w:val="21"/>
-        </w:rPr>
-        <w:t xml:space="preserve">🎙️ Lời thoại gợi ý (Speaker Notes): </w:t>
-      </w:r>
-      <w:r>
-        <w:rPr>
-          <w:rFonts w:ascii="Times New Roman" w:hAnsi="Times New Roman"/>
-          <w:color w:val="334155"/>
-          <w:sz w:val="21"/>
-        </w:rPr>
-        <w:t>"(Chuyển sang màn hình trình duyệt web và thực hiện dứt khoát 5 bước demo trong khoảng 3 phút)."</w:t>
-      </w:r>
-    </w:p>
-    <w:p>
-      <w:pPr>
-        <w:spacing w:before="80" w:after="160"/>
-      </w:pPr>
-      <w:r>
-        <w:rPr>
-          <w:rFonts w:ascii="Times New Roman" w:hAnsi="Times New Roman"/>
-          <w:color w:val="E2E8F0"/>
-          <w:sz w:val="18"/>
-        </w:rPr>
-        <w:t>―――――――――――――――――――――――――――――――――――――――――――――――――――――――</w:t>
-      </w:r>
-    </w:p>
-    <w:p>
-      <w:pPr>
-        <w:keepNext/>
-        <w:spacing w:before="240" w:after="80"/>
-      </w:pPr>
-      <w:r>
-        <w:rPr>
-          <w:rFonts w:ascii="Times New Roman" w:hAnsi="Times New Roman"/>
-          <w:b/>
-          <w:color w:val="2563EB"/>
-          <w:sz w:val="24"/>
-        </w:rPr>
-        <w:t>SLIDE 18: KẾT LUẬN, LỜI CẢM ƠN &amp; Q&amp;A</w:t>
-      </w:r>
-    </w:p>
-    <w:p>
-      <w:pPr>
-        <w:spacing w:line="300" w:lineRule="auto" w:before="0" w:after="60"/>
-        <w:jc w:val="both"/>
-      </w:pPr>
-      <w:r>
-        <w:rPr>
-          <w:rFonts w:ascii="Times New Roman" w:hAnsi="Times New Roman"/>
-          <w:b/>
-          <w:color w:val="1E293B"/>
-          <w:sz w:val="21"/>
-        </w:rPr>
-        <w:t xml:space="preserve">🎯 Mục tiêu cần làm: </w:t>
-      </w:r>
-      <w:r>
-        <w:rPr>
-          <w:rFonts w:ascii="Times New Roman" w:hAnsi="Times New Roman"/>
-          <w:color w:val="334155"/>
-          <w:sz w:val="21"/>
-        </w:rPr>
-        <w:t>Tổng kết ngắn gọn, bày tỏ lòng biết ơn và mở đầu tự tin cho phiên hỏi đáp phản biện.</w:t>
-      </w:r>
-    </w:p>
-    <w:p>
-      <w:pPr>
-        <w:spacing w:line="300" w:lineRule="auto" w:before="0" w:after="60"/>
-        <w:jc w:val="both"/>
-      </w:pPr>
-      <w:r>
-        <w:rPr>
-          <w:rFonts w:ascii="Times New Roman" w:hAnsi="Times New Roman"/>
-          <w:color w:val="334155"/>
-          <w:sz w:val="21"/>
-        </w:rPr>
-        <w:t>Nội dung hiển thị trên slide:</w:t>
-      </w:r>
-    </w:p>
-    <w:p>
-      <w:pPr>
-        <w:pStyle w:val="ListBullet"/>
-        <w:spacing w:line="288" w:lineRule="auto" w:before="0" w:after="40"/>
-        <w:jc w:val="both"/>
-      </w:pPr>
-      <w:r>
-        <w:rPr>
-          <w:rFonts w:ascii="Times New Roman" w:hAnsi="Times New Roman"/>
-          <w:color w:val="334155"/>
-          <w:sz w:val="20"/>
-        </w:rPr>
-        <w:t>Kết luận: NEURO-ECG đã hiện thực hóa thành công một hệ thống giám sát rối loạn nhịp tim toàn diện: Độ chính xác cao (98.57%), Độ trễ thấp (0.13ms), Minh bạch nhờ Explainable AI (1D Grad-CAM), Nhẹ cho Edge AI (ONNX 697KB), và An toàn pháp lý nhờ Human-in-the-loop.</w:t>
-      </w:r>
-    </w:p>
-    <w:p>
-      <w:pPr>
-        <w:pStyle w:val="ListBullet"/>
-        <w:spacing w:line="288" w:lineRule="auto" w:before="0" w:after="40"/>
-        <w:jc w:val="both"/>
-      </w:pPr>
-      <w:r>
-        <w:rPr>
-          <w:rFonts w:ascii="Times New Roman" w:hAnsi="Times New Roman"/>
-          <w:color w:val="334155"/>
-          <w:sz w:val="20"/>
-        </w:rPr>
-        <w:t>Lời cảm ơn: Chân thành cảm ơn Ban Giảng viên Samsung Innovation Campus (SIC) 2026, các Thầy Cô giáo Viện CNTT&amp;TT — Đại học Bách Khoa Hà Nội và Tập đoàn Điện tử Samsung đã tạo điều kiện và tận tình hướng dẫn nhóm.</w:t>
-      </w:r>
-    </w:p>
-    <w:p>
-      <w:pPr>
-        <w:pStyle w:val="ListBullet"/>
-        <w:spacing w:line="288" w:lineRule="auto" w:before="0" w:after="40"/>
-        <w:jc w:val="both"/>
-      </w:pPr>
-      <w:r>
-        <w:rPr>
-          <w:rFonts w:ascii="Times New Roman" w:hAnsi="Times New Roman"/>
-          <w:color w:val="334155"/>
-          <w:sz w:val="20"/>
-        </w:rPr>
-        <w:t>Q &amp; A: Nhóm kính mời các Thầy trong Hội đồng đặt câu hỏi và đóng góp ý kiến!</w:t>
-      </w:r>
-    </w:p>
-    <w:p>
-      <w:pPr>
-        <w:spacing w:line="300" w:lineRule="auto" w:before="0" w:after="60"/>
-        <w:jc w:val="both"/>
-      </w:pPr>
-      <w:r>
-        <w:rPr>
-          <w:rFonts w:ascii="Times New Roman" w:hAnsi="Times New Roman"/>
-          <w:b/>
-          <w:color w:val="1E293B"/>
-          <w:sz w:val="21"/>
-        </w:rPr>
-        <w:t xml:space="preserve">🎨 Hình vẽ / Sơ đồ / Chèn ảnh: </w:t>
-      </w:r>
-      <w:r>
-        <w:rPr>
-          <w:rFonts w:ascii="Times New Roman" w:hAnsi="Times New Roman"/>
-          <w:color w:val="334155"/>
-          <w:sz w:val="21"/>
-        </w:rPr>
-        <w:t>Dòng chữ lớn trang trọng: 'XIN CHÂN THÀNH CẢM ƠN HỘI ĐỒNG GIẢNG VIÊN!' kèm khung chữ 'PHIÊN HỎI ĐÁP — Q &amp; A'.</w:t>
-      </w:r>
-    </w:p>
-    <w:p>
-      <w:pPr>
-        <w:spacing w:line="300" w:lineRule="auto" w:before="0" w:after="60"/>
-        <w:jc w:val="both"/>
-      </w:pPr>
-      <w:r>
-        <w:rPr>
-          <w:rFonts w:ascii="Times New Roman" w:hAnsi="Times New Roman"/>
-          <w:b/>
-          <w:color w:val="1E293B"/>
-          <w:sz w:val="21"/>
-        </w:rPr>
-        <w:t xml:space="preserve">🎙️ Lời thoại gợi ý (Speaker Notes): </w:t>
-      </w:r>
-      <w:r>
-        <w:rPr>
-          <w:rFonts w:ascii="Times New Roman" w:hAnsi="Times New Roman"/>
-          <w:color w:val="334155"/>
-          <w:sz w:val="21"/>
-        </w:rPr>
-        <w:t>"Trên đây là toàn bộ báo cáo đồ án tốt nghiệp của nhóm chúng em. Chúng em xin chân thành cảm ơn các Thầy và rất mong nhận được những câu hỏi phản biện từ Hội đồng!"</w:t>
-      </w:r>
-    </w:p>
-    <w:p>
-      <w:pPr>
-        <w:spacing w:before="80" w:after="160"/>
-      </w:pPr>
-      <w:r>
-        <w:rPr>
-          <w:rFonts w:ascii="Times New Roman" w:hAnsi="Times New Roman"/>
-          <w:color w:val="E2E8F0"/>
-          <w:sz w:val="18"/>
-        </w:rPr>
-        <w:t>―――――――――――――――――――――――――――――――――――――――――――――――――――――――</w:t>
-      </w:r>
-    </w:p>
-    <w:p>
-      <w:pPr>
-        <w:keepNext/>
-        <w:spacing w:before="320" w:after="120"/>
-      </w:pPr>
-      <w:r>
-        <w:rPr>
-          <w:rFonts w:ascii="Times New Roman" w:hAnsi="Times New Roman"/>
-          <w:b/>
-          <w:color w:val="1E3A8A"/>
-          <w:sz w:val="28"/>
-        </w:rPr>
-        <w:t>III. BỘ CÂU HỎI PHẢN BIỆN DỰ KIẾN TỪ HỘI ĐỒNG VÀ GỢI Ý TRẢ LỜI</w:t>
-      </w:r>
-    </w:p>
-    <w:p>
-      <w:pPr>
-        <w:spacing w:line="300" w:lineRule="auto" w:before="0" w:after="60"/>
-        <w:jc w:val="both"/>
-      </w:pPr>
-      <w:r>
-        <w:rPr>
-          <w:rFonts w:ascii="Times New Roman" w:hAnsi="Times New Roman"/>
-          <w:b/>
-          <w:color w:val="1E293B"/>
-          <w:sz w:val="21"/>
-        </w:rPr>
-        <w:t xml:space="preserve">❓ </w:t>
-      </w:r>
-      <w:r>
-        <w:rPr>
-          <w:rFonts w:ascii="Times New Roman" w:hAnsi="Times New Roman"/>
-          <w:color w:val="334155"/>
-          <w:sz w:val="21"/>
-        </w:rPr>
-        <w:t>Câu hỏi 1: Tại sao nhóm không dùng các mô hình 2D CNN chuyển ảnh spectrogram mà lại dùng mô hình 1D (ResNet-1D)?</w:t>
-      </w:r>
-    </w:p>
-    <w:p>
-      <w:pPr>
-        <w:spacing w:line="300" w:lineRule="auto" w:before="0" w:after="60"/>
-        <w:jc w:val="both"/>
-      </w:pPr>
-      <w:r>
-        <w:rPr>
-          <w:rFonts w:ascii="Times New Roman" w:hAnsi="Times New Roman"/>
-          <w:b/>
-          <w:color w:val="1E293B"/>
-          <w:sz w:val="21"/>
-        </w:rPr>
-        <w:t xml:space="preserve">💡 </w:t>
-      </w:r>
-      <w:r>
-        <w:rPr>
-          <w:rFonts w:ascii="Times New Roman" w:hAnsi="Times New Roman"/>
-          <w:color w:val="334155"/>
-          <w:sz w:val="21"/>
-        </w:rPr>
-        <w:t>Gợi ý trả lời: Mô hình 1D xử lý trực tiếp trên chuỗi tín hiệu thời gian nên có 3 ưu điểm vượt trội cho bài toán thời gian thực: (1) Tiết kiệm tài nguyên tính toán vì không mất công biến đổi Fourier liên tục (STFT/CWT) sang ảnh phổ; (2) Độ trễ suy luận siêu thấp (chỉ 0.13ms so với hàng chục ms của 2D CNN), cho phép truyền phát mượt mà 36 gói/giây; (3) Dung lượng mô hình 1D rất nhẹ (chỉ 692k tham số), dễ dàng lượng tử hóa xuống 697 KB để nhúng vào thiết bị đeo IoT.</w:t>
-      </w:r>
-    </w:p>
-    <w:p>
-      <w:pPr>
-        <w:spacing w:before="40" w:after="80"/>
-      </w:pPr>
-    </w:p>
-    <w:p>
-      <w:pPr>
-        <w:spacing w:line="300" w:lineRule="auto" w:before="0" w:after="60"/>
-        <w:jc w:val="both"/>
-      </w:pPr>
-      <w:r>
-        <w:rPr>
-          <w:rFonts w:ascii="Times New Roman" w:hAnsi="Times New Roman"/>
-          <w:b/>
-          <w:color w:val="1E293B"/>
-          <w:sz w:val="21"/>
-        </w:rPr>
-        <w:t xml:space="preserve">❓ </w:t>
-      </w:r>
-      <w:r>
-        <w:rPr>
-          <w:rFonts w:ascii="Times New Roman" w:hAnsi="Times New Roman"/>
-          <w:color w:val="334155"/>
-          <w:sz w:val="21"/>
-        </w:rPr>
-        <w:t>Câu hỏi 2: Tại sao độ chính xác trên tập ngoài (INCART, SVDB, EDB) của lớp S và F lại bị giảm nhiều như vậy?</w:t>
-      </w:r>
-    </w:p>
-    <w:p>
-      <w:pPr>
-        <w:spacing w:line="300" w:lineRule="auto" w:before="0" w:after="60"/>
-        <w:jc w:val="both"/>
-      </w:pPr>
-      <w:r>
-        <w:rPr>
-          <w:rFonts w:ascii="Times New Roman" w:hAnsi="Times New Roman"/>
-          <w:b/>
-          <w:color w:val="1E293B"/>
-          <w:sz w:val="21"/>
-        </w:rPr>
-        <w:t xml:space="preserve">💡 </w:t>
-      </w:r>
-      <w:r>
-        <w:rPr>
-          <w:rFonts w:ascii="Times New Roman" w:hAnsi="Times New Roman"/>
-          <w:color w:val="334155"/>
-          <w:sz w:val="21"/>
-        </w:rPr>
-        <w:t>Gợi ý trả lời: Thưa các Thầy, đây là hiện tượng Domain Shift kinh điển trong y sinh do 2 nguyên nhân cốt lõi: Thứ nhất, sự sai khác về vị trí đạo trình đo giữa các thiết bị ghi (ví dụ INCART dùng 12 chuyển đạo tiêu chuẩn, trong khi MIT-BIH dùng chuyển đạo sửa đổi MLII), khiến hình thái sóng P của lớp S bị biến dạng. Thứ hai, số lượng mẫu lớp S và F trong tự nhiên quá ít (chỉ 2.5% và 0.7%), khiến mặt quyết định bị chèn ép. Nhóm đã thử nghiệm Fine-tune trên INCART nâng được độ chính xác lên 93.18%, và xác định giải pháp căn cơ là cần huấn luyện đa nguồn (Multi-database training) trong tương lai.</w:t>
-      </w:r>
-    </w:p>
-    <w:p>
-      <w:pPr>
-        <w:spacing w:before="40" w:after="80"/>
-      </w:pPr>
-    </w:p>
-    <w:p>
-      <w:pPr>
-        <w:spacing w:line="300" w:lineRule="auto" w:before="0" w:after="60"/>
-        <w:jc w:val="both"/>
-      </w:pPr>
-      <w:r>
-        <w:rPr>
-          <w:rFonts w:ascii="Times New Roman" w:hAnsi="Times New Roman"/>
-          <w:b/>
-          <w:color w:val="1E293B"/>
-          <w:sz w:val="21"/>
-        </w:rPr>
-        <w:t xml:space="preserve">❓ </w:t>
-      </w:r>
-      <w:r>
-        <w:rPr>
-          <w:rFonts w:ascii="Times New Roman" w:hAnsi="Times New Roman"/>
-          <w:color w:val="334155"/>
-          <w:sz w:val="21"/>
-        </w:rPr>
-        <w:t>Câu hỏi 3: Nếu AI đưa ra chẩn đoán sai thì hệ thống xử lý trách nhiệm như thế nào?</w:t>
-      </w:r>
-    </w:p>
-    <w:p>
-      <w:pPr>
-        <w:spacing w:line="300" w:lineRule="auto" w:before="0" w:after="60"/>
-        <w:jc w:val="both"/>
-      </w:pPr>
-      <w:r>
-        <w:rPr>
-          <w:rFonts w:ascii="Times New Roman" w:hAnsi="Times New Roman"/>
-          <w:b/>
-          <w:color w:val="1E293B"/>
-          <w:sz w:val="21"/>
-        </w:rPr>
-        <w:t xml:space="preserve">💡 </w:t>
-      </w:r>
-      <w:r>
-        <w:rPr>
-          <w:rFonts w:ascii="Times New Roman" w:hAnsi="Times New Roman"/>
-          <w:color w:val="334155"/>
-          <w:sz w:val="21"/>
-        </w:rPr>
-        <w:t>Gợi ý trả lời: Hệ thống của nhóm kiên định triết lý 'AI chỉ là trợ lý sàng lọc, Bác sĩ mới là người quyết định cuối cùng'. Khi AI phát hiện bất thường, nó chỉ gắn cờ cảnh báo kèm độ tin cậy và bản đồ nhiệt XAI. Bác sĩ chuyên khoa sẽ vào thẩm định, nếu AI sai bác sĩ có quyền bấm sửa nhãn. Mọi thao tác đều được hệ thống ghi tự động vào bảng Audit Trail với dấu thời gian chính xác, ID bác sĩ và lý do sửa nhãn để đảm bảo truy vết trách nhiệm pháp lý tuyệt đối.</w:t>
-      </w:r>
-    </w:p>
-    <w:p>
-      <w:pPr>
-        <w:spacing w:before="40" w:after="80"/>
-      </w:pPr>
-    </w:p>
-    <w:p>
-      <w:pPr>
-        <w:spacing w:line="300" w:lineRule="auto" w:before="0" w:after="60"/>
-        <w:jc w:val="both"/>
-      </w:pPr>
-      <w:r>
-        <w:rPr>
-          <w:rFonts w:ascii="Times New Roman" w:hAnsi="Times New Roman"/>
-          <w:b/>
-          <w:color w:val="1E293B"/>
-          <w:sz w:val="21"/>
-        </w:rPr>
-        <w:t xml:space="preserve">❓ </w:t>
-      </w:r>
-      <w:r>
-        <w:rPr>
-          <w:rFonts w:ascii="Times New Roman" w:hAnsi="Times New Roman"/>
-          <w:color w:val="334155"/>
-          <w:sz w:val="21"/>
-        </w:rPr>
-        <w:t>Câu hỏi 4: Tại sao bản lượng tử hóa ONNX INT8 không thấy nhanh hơn bản FP32 trên máy tính của nhóm?</w:t>
+        <w:t>Câu hỏi 4 (Về kỹ thuật Edge AI): Tại sao bản lượng tử hóa ONNX INT8 không thấy nhanh hơn bản FP32 trên máy tính của nhóm?</w:t>
       </w:r>
     </w:p>
     <w:p>
@@ -3764,7 +5243,7 @@
         <w:color w:val="94A3B8"/>
         <w:sz w:val="17"/>
       </w:rPr>
-      <w:t>Tài liệu Chuẩn bị Bảo vệ Đồ án Capstone Project - AI Track | ĐH Bách Khoa Hà Nội</w:t>
+      <w:t>Hướng dẫn Dàn ý Slide Thuyết trình Capstone Project - AI Track (Chuẩn Rubric 100 điểm)</w:t>
     </w:r>
   </w:p>
 </w:ftr>
@@ -3784,7 +5263,7 @@
         <w:color w:val="94A3B8"/>
         <w:sz w:val="17"/>
       </w:rPr>
-      <w:t>Samsung Innovation Campus (SIC) - HUST 2026 | Hướng dẫn &amp; Dàn ý Slide Thuyết trình</w:t>
+      <w:t>Samsung Innovation Campus (SIC) - HUST | Chuẩn khung Slide Template SIC 2024-2025</w:t>
     </w:r>
   </w:p>
 </w:hdr>

</xml_diff>